<commit_message>
Design doc: stronger type scale in hierarchy figure
</commit_message>
<xml_diff>
--- a/DesignDocument_SmartLibrary.docx
+++ b/DesignDocument_SmartLibrary.docx
@@ -340,6 +340,7 @@
           <w:szCs w:val="44"/>
           <w:cs/>
         </w:rPr>
+        <w:lastRenderedPageBreak/>
         <w:t>สารบัญ</w:t>
       </w:r>
     </w:p>
@@ -378,7 +379,7 @@
         </w:rPr>
         <w:fldChar w:fldCharType="separate"/>
       </w:r>
-      <w:hyperlink w:anchor="_Toc244042341" w:history="1">
+      <w:hyperlink w:anchor="_Toc244042465" w:history="1">
         <w:r>
           <w:rPr>
             <w:rStyle w:val="Hyperlink"/>
@@ -414,7 +415,7 @@
             <w:webHidden/>
             <w:szCs w:val="32"/>
           </w:rPr>
-          <w:instrText xml:space="preserve"> PAGEREF _Toc244042341 \h </w:instrText>
+          <w:instrText xml:space="preserve"> PAGEREF _Toc244042465 \h </w:instrText>
         </w:r>
         <w:r>
           <w:rPr>
@@ -467,7 +468,7 @@
           <w14:ligatures w14:val="standardContextual"/>
         </w:rPr>
       </w:pPr>
-      <w:hyperlink w:anchor="_Toc244042342" w:history="1">
+      <w:hyperlink w:anchor="_Toc244042466" w:history="1">
         <w:r>
           <w:rPr>
             <w:rStyle w:val="Hyperlink"/>
@@ -503,7 +504,7 @@
             <w:webHidden/>
             <w:szCs w:val="32"/>
           </w:rPr>
-          <w:instrText xml:space="preserve"> PAGEREF _Toc244042342 \h </w:instrText>
+          <w:instrText xml:space="preserve"> PAGEREF _Toc244042466 \h </w:instrText>
         </w:r>
         <w:r>
           <w:rPr>
@@ -556,7 +557,7 @@
           <w14:ligatures w14:val="standardContextual"/>
         </w:rPr>
       </w:pPr>
-      <w:hyperlink w:anchor="_Toc244042343" w:history="1">
+      <w:hyperlink w:anchor="_Toc244042467" w:history="1">
         <w:r>
           <w:rPr>
             <w:rStyle w:val="Hyperlink"/>
@@ -592,7 +593,7 @@
             <w:webHidden/>
             <w:szCs w:val="32"/>
           </w:rPr>
-          <w:instrText xml:space="preserve"> PAGEREF _Toc244042343 \h </w:instrText>
+          <w:instrText xml:space="preserve"> PAGEREF _Toc244042467 \h </w:instrText>
         </w:r>
         <w:r>
           <w:rPr>
@@ -645,7 +646,7 @@
           <w14:ligatures w14:val="standardContextual"/>
         </w:rPr>
       </w:pPr>
-      <w:hyperlink w:anchor="_Toc244042344" w:history="1">
+      <w:hyperlink w:anchor="_Toc244042468" w:history="1">
         <w:r>
           <w:rPr>
             <w:rStyle w:val="Hyperlink"/>
@@ -681,7 +682,7 @@
             <w:webHidden/>
             <w:szCs w:val="32"/>
           </w:rPr>
-          <w:instrText xml:space="preserve"> PAGEREF _Toc244042344 \h </w:instrText>
+          <w:instrText xml:space="preserve"> PAGEREF _Toc244042468 \h </w:instrText>
         </w:r>
         <w:r>
           <w:rPr>
@@ -734,7 +735,7 @@
           <w14:ligatures w14:val="standardContextual"/>
         </w:rPr>
       </w:pPr>
-      <w:hyperlink w:anchor="_Toc244042345" w:history="1">
+      <w:hyperlink w:anchor="_Toc244042469" w:history="1">
         <w:r>
           <w:rPr>
             <w:rStyle w:val="Hyperlink"/>
@@ -770,7 +771,7 @@
             <w:webHidden/>
             <w:szCs w:val="32"/>
           </w:rPr>
-          <w:instrText xml:space="preserve"> PAGEREF _Toc244042345 \h </w:instrText>
+          <w:instrText xml:space="preserve"> PAGEREF _Toc244042469 \h </w:instrText>
         </w:r>
         <w:r>
           <w:rPr>
@@ -823,7 +824,7 @@
           <w14:ligatures w14:val="standardContextual"/>
         </w:rPr>
       </w:pPr>
-      <w:hyperlink w:anchor="_Toc244042346" w:history="1">
+      <w:hyperlink w:anchor="_Toc244042470" w:history="1">
         <w:r>
           <w:rPr>
             <w:rStyle w:val="Hyperlink"/>
@@ -859,7 +860,7 @@
             <w:webHidden/>
             <w:szCs w:val="32"/>
           </w:rPr>
-          <w:instrText xml:space="preserve"> PAGEREF _Toc244042346 \h </w:instrText>
+          <w:instrText xml:space="preserve"> PAGEREF _Toc244042470 \h </w:instrText>
         </w:r>
         <w:r>
           <w:rPr>
@@ -912,7 +913,7 @@
           <w14:ligatures w14:val="standardContextual"/>
         </w:rPr>
       </w:pPr>
-      <w:hyperlink w:anchor="_Toc244042347" w:history="1">
+      <w:hyperlink w:anchor="_Toc244042471" w:history="1">
         <w:r>
           <w:rPr>
             <w:rStyle w:val="Hyperlink"/>
@@ -948,7 +949,7 @@
             <w:webHidden/>
             <w:szCs w:val="32"/>
           </w:rPr>
-          <w:instrText xml:space="preserve"> PAGEREF _Toc244042347 \h </w:instrText>
+          <w:instrText xml:space="preserve"> PAGEREF _Toc244042471 \h </w:instrText>
         </w:r>
         <w:r>
           <w:rPr>
@@ -1001,7 +1002,7 @@
           <w14:ligatures w14:val="standardContextual"/>
         </w:rPr>
       </w:pPr>
-      <w:hyperlink w:anchor="_Toc244042348" w:history="1">
+      <w:hyperlink w:anchor="_Toc244042472" w:history="1">
         <w:r>
           <w:rPr>
             <w:rStyle w:val="Hyperlink"/>
@@ -1037,7 +1038,7 @@
             <w:webHidden/>
             <w:szCs w:val="32"/>
           </w:rPr>
-          <w:instrText xml:space="preserve"> PAGEREF _Toc244042348 \h </w:instrText>
+          <w:instrText xml:space="preserve"> PAGEREF _Toc244042472 \h </w:instrText>
         </w:r>
         <w:r>
           <w:rPr>
@@ -1090,7 +1091,7 @@
           <w14:ligatures w14:val="standardContextual"/>
         </w:rPr>
       </w:pPr>
-      <w:hyperlink w:anchor="_Toc244042349" w:history="1">
+      <w:hyperlink w:anchor="_Toc244042473" w:history="1">
         <w:r>
           <w:rPr>
             <w:rStyle w:val="Hyperlink"/>
@@ -1126,7 +1127,7 @@
             <w:webHidden/>
             <w:szCs w:val="32"/>
           </w:rPr>
-          <w:instrText xml:space="preserve"> PAGEREF _Toc244042349 \h </w:instrText>
+          <w:instrText xml:space="preserve"> PAGEREF _Toc244042473 \h </w:instrText>
         </w:r>
         <w:r>
           <w:rPr>
@@ -1179,7 +1180,7 @@
           <w14:ligatures w14:val="standardContextual"/>
         </w:rPr>
       </w:pPr>
-      <w:hyperlink w:anchor="_Toc244042350" w:history="1">
+      <w:hyperlink w:anchor="_Toc244042474" w:history="1">
         <w:r>
           <w:rPr>
             <w:rStyle w:val="Hyperlink"/>
@@ -1224,7 +1225,7 @@
             <w:webHidden/>
             <w:szCs w:val="32"/>
           </w:rPr>
-          <w:instrText xml:space="preserve"> PAGEREF _Toc244042350 \h </w:instrText>
+          <w:instrText xml:space="preserve"> PAGEREF _Toc244042474 \h </w:instrText>
         </w:r>
         <w:r>
           <w:rPr>
@@ -1277,7 +1278,7 @@
           <w14:ligatures w14:val="standardContextual"/>
         </w:rPr>
       </w:pPr>
-      <w:hyperlink w:anchor="_Toc244042351" w:history="1">
+      <w:hyperlink w:anchor="_Toc244042475" w:history="1">
         <w:r>
           <w:rPr>
             <w:rStyle w:val="Hyperlink"/>
@@ -1322,7 +1323,7 @@
             <w:webHidden/>
             <w:szCs w:val="32"/>
           </w:rPr>
-          <w:instrText xml:space="preserve"> PAGEREF _Toc244042351 \h </w:instrText>
+          <w:instrText xml:space="preserve"> PAGEREF _Toc244042475 \h </w:instrText>
         </w:r>
         <w:r>
           <w:rPr>
@@ -1375,7 +1376,7 @@
           <w14:ligatures w14:val="standardContextual"/>
         </w:rPr>
       </w:pPr>
-      <w:hyperlink w:anchor="_Toc244042352" w:history="1">
+      <w:hyperlink w:anchor="_Toc244042476" w:history="1">
         <w:r>
           <w:rPr>
             <w:rStyle w:val="Hyperlink"/>
@@ -1420,7 +1421,7 @@
             <w:webHidden/>
             <w:szCs w:val="32"/>
           </w:rPr>
-          <w:instrText xml:space="preserve"> PAGEREF _Toc244042352 \h </w:instrText>
+          <w:instrText xml:space="preserve"> PAGEREF _Toc244042476 \h </w:instrText>
         </w:r>
         <w:r>
           <w:rPr>
@@ -1473,7 +1474,7 @@
           <w14:ligatures w14:val="standardContextual"/>
         </w:rPr>
       </w:pPr>
-      <w:hyperlink w:anchor="_Toc244042353" w:history="1">
+      <w:hyperlink w:anchor="_Toc244042477" w:history="1">
         <w:r>
           <w:rPr>
             <w:rStyle w:val="Hyperlink"/>
@@ -1518,7 +1519,7 @@
             <w:webHidden/>
             <w:szCs w:val="32"/>
           </w:rPr>
-          <w:instrText xml:space="preserve"> PAGEREF _Toc244042353 \h </w:instrText>
+          <w:instrText xml:space="preserve"> PAGEREF _Toc244042477 \h </w:instrText>
         </w:r>
         <w:r>
           <w:rPr>
@@ -1571,7 +1572,7 @@
           <w14:ligatures w14:val="standardContextual"/>
         </w:rPr>
       </w:pPr>
-      <w:hyperlink w:anchor="_Toc244042354" w:history="1">
+      <w:hyperlink w:anchor="_Toc244042478" w:history="1">
         <w:r>
           <w:rPr>
             <w:rStyle w:val="Hyperlink"/>
@@ -1616,7 +1617,7 @@
             <w:webHidden/>
             <w:szCs w:val="32"/>
           </w:rPr>
-          <w:instrText xml:space="preserve"> PAGEREF _Toc244042354 \h </w:instrText>
+          <w:instrText xml:space="preserve"> PAGEREF _Toc244042478 \h </w:instrText>
         </w:r>
         <w:r>
           <w:rPr>
@@ -1669,7 +1670,7 @@
           <w14:ligatures w14:val="standardContextual"/>
         </w:rPr>
       </w:pPr>
-      <w:hyperlink w:anchor="_Toc244042355" w:history="1">
+      <w:hyperlink w:anchor="_Toc244042479" w:history="1">
         <w:r>
           <w:rPr>
             <w:rStyle w:val="Hyperlink"/>
@@ -1714,7 +1715,7 @@
             <w:webHidden/>
             <w:szCs w:val="32"/>
           </w:rPr>
-          <w:instrText xml:space="preserve"> PAGEREF _Toc244042355 \h </w:instrText>
+          <w:instrText xml:space="preserve"> PAGEREF _Toc244042479 \h </w:instrText>
         </w:r>
         <w:r>
           <w:rPr>
@@ -1767,7 +1768,7 @@
           <w14:ligatures w14:val="standardContextual"/>
         </w:rPr>
       </w:pPr>
-      <w:hyperlink w:anchor="_Toc244042356" w:history="1">
+      <w:hyperlink w:anchor="_Toc244042480" w:history="1">
         <w:r>
           <w:rPr>
             <w:rStyle w:val="Hyperlink"/>
@@ -1803,7 +1804,7 @@
             <w:webHidden/>
             <w:szCs w:val="32"/>
           </w:rPr>
-          <w:instrText xml:space="preserve"> PAGEREF _Toc244042356 \h </w:instrText>
+          <w:instrText xml:space="preserve"> PAGEREF _Toc244042480 \h </w:instrText>
         </w:r>
         <w:r>
           <w:rPr>
@@ -1856,7 +1857,7 @@
           <w14:ligatures w14:val="standardContextual"/>
         </w:rPr>
       </w:pPr>
-      <w:hyperlink w:anchor="_Toc244042357" w:history="1">
+      <w:hyperlink w:anchor="_Toc244042481" w:history="1">
         <w:r>
           <w:rPr>
             <w:rStyle w:val="Hyperlink"/>
@@ -1911,7 +1912,7 @@
             <w:webHidden/>
             <w:szCs w:val="32"/>
           </w:rPr>
-          <w:instrText xml:space="preserve"> PAGEREF _Toc244042357 \h </w:instrText>
+          <w:instrText xml:space="preserve"> PAGEREF _Toc244042481 \h </w:instrText>
         </w:r>
         <w:r>
           <w:rPr>
@@ -1964,7 +1965,7 @@
           <w14:ligatures w14:val="standardContextual"/>
         </w:rPr>
       </w:pPr>
-      <w:hyperlink w:anchor="_Toc244042358" w:history="1">
+      <w:hyperlink w:anchor="_Toc244042482" w:history="1">
         <w:r>
           <w:rPr>
             <w:rStyle w:val="Hyperlink"/>
@@ -2000,7 +2001,7 @@
             <w:webHidden/>
             <w:szCs w:val="32"/>
           </w:rPr>
-          <w:instrText xml:space="preserve"> PAGEREF _Toc244042358 \h </w:instrText>
+          <w:instrText xml:space="preserve"> PAGEREF _Toc244042482 \h </w:instrText>
         </w:r>
         <w:r>
           <w:rPr>
@@ -2053,7 +2054,7 @@
           <w14:ligatures w14:val="standardContextual"/>
         </w:rPr>
       </w:pPr>
-      <w:hyperlink w:anchor="_Toc244042359" w:history="1">
+      <w:hyperlink w:anchor="_Toc244042483" w:history="1">
         <w:r>
           <w:rPr>
             <w:rStyle w:val="Hyperlink"/>
@@ -2089,7 +2090,7 @@
             <w:webHidden/>
             <w:szCs w:val="32"/>
           </w:rPr>
-          <w:instrText xml:space="preserve"> PAGEREF _Toc244042359 \h </w:instrText>
+          <w:instrText xml:space="preserve"> PAGEREF _Toc244042483 \h </w:instrText>
         </w:r>
         <w:r>
           <w:rPr>
@@ -2142,7 +2143,7 @@
           <w14:ligatures w14:val="standardContextual"/>
         </w:rPr>
       </w:pPr>
-      <w:hyperlink w:anchor="_Toc244042360" w:history="1">
+      <w:hyperlink w:anchor="_Toc244042484" w:history="1">
         <w:r>
           <w:rPr>
             <w:rStyle w:val="Hyperlink"/>
@@ -2178,7 +2179,7 @@
             <w:webHidden/>
             <w:szCs w:val="32"/>
           </w:rPr>
-          <w:instrText xml:space="preserve"> PAGEREF _Toc244042360 \h </w:instrText>
+          <w:instrText xml:space="preserve"> PAGEREF _Toc244042484 \h </w:instrText>
         </w:r>
         <w:r>
           <w:rPr>
@@ -2231,7 +2232,7 @@
           <w14:ligatures w14:val="standardContextual"/>
         </w:rPr>
       </w:pPr>
-      <w:hyperlink w:anchor="_Toc244042361" w:history="1">
+      <w:hyperlink w:anchor="_Toc244042485" w:history="1">
         <w:r>
           <w:rPr>
             <w:rStyle w:val="Hyperlink"/>
@@ -2267,7 +2268,7 @@
             <w:webHidden/>
             <w:szCs w:val="32"/>
           </w:rPr>
-          <w:instrText xml:space="preserve"> PAGEREF _Toc244042361 \h </w:instrText>
+          <w:instrText xml:space="preserve"> PAGEREF _Toc244042485 \h </w:instrText>
         </w:r>
         <w:r>
           <w:rPr>
@@ -2320,7 +2321,7 @@
           <w14:ligatures w14:val="standardContextual"/>
         </w:rPr>
       </w:pPr>
-      <w:hyperlink w:anchor="_Toc244042362" w:history="1">
+      <w:hyperlink w:anchor="_Toc244042486" w:history="1">
         <w:r>
           <w:rPr>
             <w:rStyle w:val="Hyperlink"/>
@@ -2375,7 +2376,7 @@
             <w:webHidden/>
             <w:szCs w:val="32"/>
           </w:rPr>
-          <w:instrText xml:space="preserve"> PAGEREF _Toc244042362 \h </w:instrText>
+          <w:instrText xml:space="preserve"> PAGEREF _Toc244042486 \h </w:instrText>
         </w:r>
         <w:r>
           <w:rPr>
@@ -2428,7 +2429,7 @@
           <w14:ligatures w14:val="standardContextual"/>
         </w:rPr>
       </w:pPr>
-      <w:hyperlink w:anchor="_Toc244042363" w:history="1">
+      <w:hyperlink w:anchor="_Toc244042487" w:history="1">
         <w:r>
           <w:rPr>
             <w:rStyle w:val="Hyperlink"/>
@@ -2464,7 +2465,7 @@
             <w:webHidden/>
             <w:szCs w:val="32"/>
           </w:rPr>
-          <w:instrText xml:space="preserve"> PAGEREF _Toc244042363 \h </w:instrText>
+          <w:instrText xml:space="preserve"> PAGEREF _Toc244042487 \h </w:instrText>
         </w:r>
         <w:r>
           <w:rPr>
@@ -2517,7 +2518,7 @@
           <w14:ligatures w14:val="standardContextual"/>
         </w:rPr>
       </w:pPr>
-      <w:hyperlink w:anchor="_Toc244042364" w:history="1">
+      <w:hyperlink w:anchor="_Toc244042488" w:history="1">
         <w:r>
           <w:rPr>
             <w:rStyle w:val="Hyperlink"/>
@@ -2562,7 +2563,7 @@
             <w:webHidden/>
             <w:szCs w:val="32"/>
           </w:rPr>
-          <w:instrText xml:space="preserve"> PAGEREF _Toc244042364 \h </w:instrText>
+          <w:instrText xml:space="preserve"> PAGEREF _Toc244042488 \h </w:instrText>
         </w:r>
         <w:r>
           <w:rPr>
@@ -2615,7 +2616,7 @@
           <w14:ligatures w14:val="standardContextual"/>
         </w:rPr>
       </w:pPr>
-      <w:hyperlink w:anchor="_Toc244042365" w:history="1">
+      <w:hyperlink w:anchor="_Toc244042489" w:history="1">
         <w:r>
           <w:rPr>
             <w:rStyle w:val="Hyperlink"/>
@@ -2651,7 +2652,7 @@
             <w:webHidden/>
             <w:szCs w:val="32"/>
           </w:rPr>
-          <w:instrText xml:space="preserve"> PAGEREF _Toc244042365 \h </w:instrText>
+          <w:instrText xml:space="preserve"> PAGEREF _Toc244042489 \h </w:instrText>
         </w:r>
         <w:r>
           <w:rPr>
@@ -2704,7 +2705,7 @@
           <w14:ligatures w14:val="standardContextual"/>
         </w:rPr>
       </w:pPr>
-      <w:hyperlink w:anchor="_Toc244042366" w:history="1">
+      <w:hyperlink w:anchor="_Toc244042490" w:history="1">
         <w:r>
           <w:rPr>
             <w:rStyle w:val="Hyperlink"/>
@@ -2740,7 +2741,7 @@
             <w:webHidden/>
             <w:szCs w:val="32"/>
           </w:rPr>
-          <w:instrText xml:space="preserve"> PAGEREF _Toc244042366 \h </w:instrText>
+          <w:instrText xml:space="preserve"> PAGEREF _Toc244042490 \h </w:instrText>
         </w:r>
         <w:r>
           <w:rPr>
@@ -2793,7 +2794,7 @@
           <w14:ligatures w14:val="standardContextual"/>
         </w:rPr>
       </w:pPr>
-      <w:hyperlink w:anchor="_Toc244042367" w:history="1">
+      <w:hyperlink w:anchor="_Toc244042491" w:history="1">
         <w:r>
           <w:rPr>
             <w:rStyle w:val="Hyperlink"/>
@@ -2829,7 +2830,7 @@
             <w:webHidden/>
             <w:szCs w:val="32"/>
           </w:rPr>
-          <w:instrText xml:space="preserve"> PAGEREF _Toc244042367 \h </w:instrText>
+          <w:instrText xml:space="preserve"> PAGEREF _Toc244042491 \h </w:instrText>
         </w:r>
         <w:r>
           <w:rPr>
@@ -2882,7 +2883,7 @@
           <w14:ligatures w14:val="standardContextual"/>
         </w:rPr>
       </w:pPr>
-      <w:hyperlink w:anchor="_Toc244042368" w:history="1">
+      <w:hyperlink w:anchor="_Toc244042492" w:history="1">
         <w:r>
           <w:rPr>
             <w:rStyle w:val="Hyperlink"/>
@@ -2918,7 +2919,7 @@
             <w:webHidden/>
             <w:szCs w:val="32"/>
           </w:rPr>
-          <w:instrText xml:space="preserve"> PAGEREF _Toc244042368 \h </w:instrText>
+          <w:instrText xml:space="preserve"> PAGEREF _Toc244042492 \h </w:instrText>
         </w:r>
         <w:r>
           <w:rPr>
@@ -2971,7 +2972,7 @@
           <w14:ligatures w14:val="standardContextual"/>
         </w:rPr>
       </w:pPr>
-      <w:hyperlink w:anchor="_Toc244042369" w:history="1">
+      <w:hyperlink w:anchor="_Toc244042493" w:history="1">
         <w:r>
           <w:rPr>
             <w:rStyle w:val="Hyperlink"/>
@@ -3007,7 +3008,7 @@
             <w:webHidden/>
             <w:szCs w:val="32"/>
           </w:rPr>
-          <w:instrText xml:space="preserve"> PAGEREF _Toc244042369 \h </w:instrText>
+          <w:instrText xml:space="preserve"> PAGEREF _Toc244042493 \h </w:instrText>
         </w:r>
         <w:r>
           <w:rPr>
@@ -3060,7 +3061,7 @@
           <w14:ligatures w14:val="standardContextual"/>
         </w:rPr>
       </w:pPr>
-      <w:hyperlink w:anchor="_Toc244042370" w:history="1">
+      <w:hyperlink w:anchor="_Toc244042494" w:history="1">
         <w:r>
           <w:rPr>
             <w:rStyle w:val="Hyperlink"/>
@@ -3096,7 +3097,7 @@
             <w:webHidden/>
             <w:szCs w:val="32"/>
           </w:rPr>
-          <w:instrText xml:space="preserve"> PAGEREF _Toc244042370 \h </w:instrText>
+          <w:instrText xml:space="preserve"> PAGEREF _Toc244042494 \h </w:instrText>
         </w:r>
         <w:r>
           <w:rPr>
@@ -3149,7 +3150,7 @@
           <w14:ligatures w14:val="standardContextual"/>
         </w:rPr>
       </w:pPr>
-      <w:hyperlink w:anchor="_Toc244042371" w:history="1">
+      <w:hyperlink w:anchor="_Toc244042495" w:history="1">
         <w:r>
           <w:rPr>
             <w:rStyle w:val="Hyperlink"/>
@@ -3185,7 +3186,7 @@
             <w:webHidden/>
             <w:szCs w:val="32"/>
           </w:rPr>
-          <w:instrText xml:space="preserve"> PAGEREF _Toc244042371 \h </w:instrText>
+          <w:instrText xml:space="preserve"> PAGEREF _Toc244042495 \h </w:instrText>
         </w:r>
         <w:r>
           <w:rPr>
@@ -3238,7 +3239,7 @@
           <w14:ligatures w14:val="standardContextual"/>
         </w:rPr>
       </w:pPr>
-      <w:hyperlink w:anchor="_Toc244042372" w:history="1">
+      <w:hyperlink w:anchor="_Toc244042496" w:history="1">
         <w:r>
           <w:rPr>
             <w:rStyle w:val="Hyperlink"/>
@@ -3274,7 +3275,7 @@
             <w:webHidden/>
             <w:szCs w:val="32"/>
           </w:rPr>
-          <w:instrText xml:space="preserve"> PAGEREF _Toc244042372 \h </w:instrText>
+          <w:instrText xml:space="preserve"> PAGEREF _Toc244042496 \h </w:instrText>
         </w:r>
         <w:r>
           <w:rPr>
@@ -3327,7 +3328,7 @@
           <w14:ligatures w14:val="standardContextual"/>
         </w:rPr>
       </w:pPr>
-      <w:hyperlink w:anchor="_Toc244042373" w:history="1">
+      <w:hyperlink w:anchor="_Toc244042497" w:history="1">
         <w:r>
           <w:rPr>
             <w:rStyle w:val="Hyperlink"/>
@@ -3363,7 +3364,7 @@
             <w:webHidden/>
             <w:szCs w:val="32"/>
           </w:rPr>
-          <w:instrText xml:space="preserve"> PAGEREF _Toc244042373 \h </w:instrText>
+          <w:instrText xml:space="preserve"> PAGEREF _Toc244042497 \h </w:instrText>
         </w:r>
         <w:r>
           <w:rPr>
@@ -3416,7 +3417,7 @@
           <w14:ligatures w14:val="standardContextual"/>
         </w:rPr>
       </w:pPr>
-      <w:hyperlink w:anchor="_Toc244042374" w:history="1">
+      <w:hyperlink w:anchor="_Toc244042498" w:history="1">
         <w:r>
           <w:rPr>
             <w:rStyle w:val="Hyperlink"/>
@@ -3452,7 +3453,7 @@
             <w:webHidden/>
             <w:szCs w:val="32"/>
           </w:rPr>
-          <w:instrText xml:space="preserve"> PAGEREF _Toc244042374 \h </w:instrText>
+          <w:instrText xml:space="preserve"> PAGEREF _Toc244042498 \h </w:instrText>
         </w:r>
         <w:r>
           <w:rPr>
@@ -3505,7 +3506,7 @@
           <w14:ligatures w14:val="standardContextual"/>
         </w:rPr>
       </w:pPr>
-      <w:hyperlink w:anchor="_Toc244042375" w:history="1">
+      <w:hyperlink w:anchor="_Toc244042499" w:history="1">
         <w:r>
           <w:rPr>
             <w:rStyle w:val="Hyperlink"/>
@@ -3541,7 +3542,7 @@
             <w:webHidden/>
             <w:szCs w:val="32"/>
           </w:rPr>
-          <w:instrText xml:space="preserve"> PAGEREF _Toc244042375 \h </w:instrText>
+          <w:instrText xml:space="preserve"> PAGEREF _Toc244042499 \h </w:instrText>
         </w:r>
         <w:r>
           <w:rPr>
@@ -3594,7 +3595,7 @@
           <w14:ligatures w14:val="standardContextual"/>
         </w:rPr>
       </w:pPr>
-      <w:hyperlink w:anchor="_Toc244042376" w:history="1">
+      <w:hyperlink w:anchor="_Toc244042500" w:history="1">
         <w:r>
           <w:rPr>
             <w:rStyle w:val="Hyperlink"/>
@@ -3630,7 +3631,7 @@
             <w:webHidden/>
             <w:szCs w:val="32"/>
           </w:rPr>
-          <w:instrText xml:space="preserve"> PAGEREF _Toc244042376 \h </w:instrText>
+          <w:instrText xml:space="preserve"> PAGEREF _Toc244042500 \h </w:instrText>
         </w:r>
         <w:r>
           <w:rPr>
@@ -3683,11 +3684,12 @@
       <w:pPr>
         <w:pStyle w:val="Heading1"/>
       </w:pPr>
-      <w:bookmarkStart w:id="0" w:name="_Toc244042341"/>
-      <w:r>
-        <w:rPr>
-          <w:cs/>
-        </w:rPr>
+      <w:bookmarkStart w:id="0" w:name="_Toc244042465"/>
+      <w:r>
+        <w:rPr>
+          <w:cs/>
+        </w:rPr>
+        <w:lastRenderedPageBreak/>
         <w:t>1. ภาพรวมชิ้นงาน</w:t>
       </w:r>
       <w:bookmarkEnd w:id="0"/>
@@ -3696,7 +3698,7 @@
       <w:pPr>
         <w:pStyle w:val="Heading2"/>
       </w:pPr>
-      <w:bookmarkStart w:id="1" w:name="_Toc244042342"/>
+      <w:bookmarkStart w:id="1" w:name="_Toc244042466"/>
       <w:r>
         <w:rPr>
           <w:cs/>
@@ -3783,7 +3785,7 @@
       <w:pPr>
         <w:pStyle w:val="Heading2"/>
       </w:pPr>
-      <w:bookmarkStart w:id="2" w:name="_Toc244042343"/>
+      <w:bookmarkStart w:id="2" w:name="_Toc244042467"/>
       <w:r>
         <w:rPr>
           <w:cs/>
@@ -4481,7 +4483,7 @@
       <w:pPr>
         <w:pStyle w:val="Heading2"/>
       </w:pPr>
-      <w:bookmarkStart w:id="3" w:name="_Toc244042344"/>
+      <w:bookmarkStart w:id="3" w:name="_Toc244042468"/>
       <w:r>
         <w:rPr>
           <w:cs/>
@@ -4532,11 +4534,12 @@
       <w:pPr>
         <w:pStyle w:val="Heading2"/>
       </w:pPr>
-      <w:bookmarkStart w:id="4" w:name="_Toc244042345"/>
-      <w:r>
-        <w:rPr>
-          <w:cs/>
-        </w:rPr>
+      <w:bookmarkStart w:id="4" w:name="_Toc244042469"/>
+      <w:r>
+        <w:rPr>
+          <w:cs/>
+        </w:rPr>
+        <w:lastRenderedPageBreak/>
         <w:t>1.4 ข้อกำหนดของงานและการออกแบบให้สอดคล้อง</w:t>
       </w:r>
       <w:bookmarkEnd w:id="4"/>
@@ -4951,7 +4954,7 @@
       <w:pPr>
         <w:pStyle w:val="Heading1"/>
       </w:pPr>
-      <w:bookmarkStart w:id="5" w:name="_Toc244042346"/>
+      <w:bookmarkStart w:id="5" w:name="_Toc244042470"/>
       <w:r>
         <w:rPr>
           <w:cs/>
@@ -4986,11 +4989,12 @@
       <w:pPr>
         <w:pStyle w:val="Heading2"/>
       </w:pPr>
-      <w:bookmarkStart w:id="6" w:name="_Toc244042347"/>
-      <w:r>
-        <w:rPr>
-          <w:cs/>
-        </w:rPr>
+      <w:bookmarkStart w:id="6" w:name="_Toc244042471"/>
+      <w:r>
+        <w:rPr>
+          <w:cs/>
+        </w:rPr>
+        <w:lastRenderedPageBreak/>
         <w:t>2.1 แหล่งข้อมูลที่ใช้</w:t>
       </w:r>
       <w:bookmarkEnd w:id="6"/>
@@ -5945,7 +5949,7 @@
       <w:pPr>
         <w:pStyle w:val="Heading2"/>
       </w:pPr>
-      <w:bookmarkStart w:id="7" w:name="_Toc244042348"/>
+      <w:bookmarkStart w:id="7" w:name="_Toc244042472"/>
       <w:r>
         <w:rPr>
           <w:cs/>
@@ -5980,6 +5984,7 @@
           <w:szCs w:val="30"/>
           <w:cs/>
         </w:rPr>
+        <w:lastRenderedPageBreak/>
         <w:t xml:space="preserve">ตารางที่ 4 </w:t>
       </w:r>
       <w:r>
@@ -7176,7 +7181,7 @@
       <w:pPr>
         <w:pStyle w:val="Heading2"/>
       </w:pPr>
-      <w:bookmarkStart w:id="8" w:name="_Toc244042349"/>
+      <w:bookmarkStart w:id="8" w:name="_Toc244042473"/>
       <w:r>
         <w:rPr>
           <w:cs/>
@@ -7398,6 +7403,7 @@
         <w:ind w:left="1077" w:hanging="369"/>
       </w:pPr>
       <w:r>
+        <w:lastRenderedPageBreak/>
         <w:t>6.</w:t>
       </w:r>
       <w:r>
@@ -7453,7 +7459,7 @@
       <w:pPr>
         <w:pStyle w:val="Heading1"/>
       </w:pPr>
-      <w:bookmarkStart w:id="9" w:name="_Toc244042350"/>
+      <w:bookmarkStart w:id="9" w:name="_Toc244042474"/>
       <w:r>
         <w:rPr>
           <w:cs/>
@@ -7469,7 +7475,7 @@
       <w:pPr>
         <w:pStyle w:val="Heading2"/>
       </w:pPr>
-      <w:bookmarkStart w:id="10" w:name="_Toc244042351"/>
+      <w:bookmarkStart w:id="10" w:name="_Toc244042475"/>
       <w:r>
         <w:rPr>
           <w:cs/>
@@ -7968,8 +7974,9 @@
         <w:rPr>
           <w:noProof/>
         </w:rPr>
+        <w:lastRenderedPageBreak/>
         <w:drawing>
-          <wp:inline distT="0" distB="0" distL="0" distR="0" wp14:anchorId="5B9B96BE" wp14:editId="7AF2EE02">
+          <wp:inline distT="0" distB="0" distL="0" distR="0" wp14:anchorId="4D632948" wp14:editId="70339E46">
             <wp:extent cx="5760000" cy="3168000"/>
             <wp:effectExtent l="0" t="0" r="0" b="0"/>
             <wp:docPr id="1" name="Picture 1"/>
@@ -8055,7 +8062,7 @@
       <w:pPr>
         <w:pStyle w:val="Heading2"/>
       </w:pPr>
-      <w:bookmarkStart w:id="11" w:name="_Toc244042352"/>
+      <w:bookmarkStart w:id="11" w:name="_Toc244042476"/>
       <w:r>
         <w:t xml:space="preserve">3.2 Level 0: </w:t>
       </w:r>
@@ -8078,7 +8085,7 @@
           <w:noProof/>
         </w:rPr>
         <w:drawing>
-          <wp:inline distT="0" distB="0" distL="0" distR="0" wp14:anchorId="54A1ADA6" wp14:editId="598F9AEF">
+          <wp:inline distT="0" distB="0" distL="0" distR="0" wp14:anchorId="074BCB95" wp14:editId="01CDD931">
             <wp:extent cx="5760000" cy="2962286"/>
             <wp:effectExtent l="0" t="0" r="0" b="0"/>
             <wp:docPr id="2" name="Picture 2"/>
@@ -8232,6 +8239,7 @@
         <w:ind w:left="1077" w:hanging="369"/>
       </w:pPr>
       <w:r>
+        <w:lastRenderedPageBreak/>
         <w:t>•</w:t>
       </w:r>
       <w:r>
@@ -8377,7 +8385,7 @@
       <w:pPr>
         <w:pStyle w:val="Heading2"/>
       </w:pPr>
-      <w:bookmarkStart w:id="12" w:name="_Toc244042353"/>
+      <w:bookmarkStart w:id="12" w:name="_Toc244042477"/>
       <w:r>
         <w:t xml:space="preserve">3.3 Level 1: </w:t>
       </w:r>
@@ -8454,7 +8462,7 @@
           <w:noProof/>
         </w:rPr>
         <w:drawing>
-          <wp:inline distT="0" distB="0" distL="0" distR="0" wp14:anchorId="7537B6A9" wp14:editId="75676A8D">
+          <wp:inline distT="0" distB="0" distL="0" distR="0" wp14:anchorId="5111D9E8" wp14:editId="34E18076">
             <wp:extent cx="5760000" cy="3240000"/>
             <wp:effectExtent l="0" t="0" r="0" b="0"/>
             <wp:docPr id="3" name="Picture 3"/>
@@ -8585,8 +8593,9 @@
         <w:rPr>
           <w:noProof/>
         </w:rPr>
+        <w:lastRenderedPageBreak/>
         <w:drawing>
-          <wp:inline distT="0" distB="0" distL="0" distR="0" wp14:anchorId="1B6F987D" wp14:editId="2339B13A">
+          <wp:inline distT="0" distB="0" distL="0" distR="0" wp14:anchorId="4A09FDEB" wp14:editId="7C5EEC0C">
             <wp:extent cx="5760000" cy="2150400"/>
             <wp:effectExtent l="0" t="0" r="0" b="0"/>
             <wp:docPr id="4" name="Picture 4"/>
@@ -9567,7 +9576,7 @@
       <w:pPr>
         <w:pStyle w:val="Heading2"/>
       </w:pPr>
-      <w:bookmarkStart w:id="13" w:name="_Toc244042354"/>
+      <w:bookmarkStart w:id="13" w:name="_Toc244042478"/>
       <w:r>
         <w:t xml:space="preserve">3.4 Level 2–3: </w:t>
       </w:r>
@@ -12275,7 +12284,7 @@
       <w:pPr>
         <w:pStyle w:val="Heading2"/>
       </w:pPr>
-      <w:bookmarkStart w:id="14" w:name="_Toc244042355"/>
+      <w:bookmarkStart w:id="14" w:name="_Toc244042479"/>
       <w:r>
         <w:rPr>
           <w:cs/>
@@ -12298,7 +12307,7 @@
           <w:noProof/>
         </w:rPr>
         <w:drawing>
-          <wp:inline distT="0" distB="0" distL="0" distR="0" wp14:anchorId="7750D249" wp14:editId="72A04103">
+          <wp:inline distT="0" distB="0" distL="0" distR="0" wp14:anchorId="609273BB" wp14:editId="6D6EB202">
             <wp:extent cx="5760000" cy="3600000"/>
             <wp:effectExtent l="0" t="0" r="0" b="0"/>
             <wp:docPr id="5" name="Picture 5"/>
@@ -12377,7 +12386,7 @@
       <w:pPr>
         <w:pStyle w:val="Heading2"/>
       </w:pPr>
-      <w:bookmarkStart w:id="15" w:name="_Toc244042356"/>
+      <w:bookmarkStart w:id="15" w:name="_Toc244042480"/>
       <w:r>
         <w:rPr>
           <w:cs/>
@@ -13515,7 +13524,7 @@
       <w:pPr>
         <w:pStyle w:val="Heading2"/>
       </w:pPr>
-      <w:bookmarkStart w:id="16" w:name="_Toc244042357"/>
+      <w:bookmarkStart w:id="16" w:name="_Toc244042481"/>
       <w:r>
         <w:rPr>
           <w:cs/>
@@ -13755,7 +13764,7 @@
       <w:pPr>
         <w:pStyle w:val="Heading2"/>
       </w:pPr>
-      <w:bookmarkStart w:id="17" w:name="_Toc244042358"/>
+      <w:bookmarkStart w:id="17" w:name="_Toc244042482"/>
       <w:r>
         <w:rPr>
           <w:cs/>
@@ -14621,7 +14630,7 @@
       <w:pPr>
         <w:pStyle w:val="Heading1"/>
       </w:pPr>
-      <w:bookmarkStart w:id="18" w:name="_Toc244042359"/>
+      <w:bookmarkStart w:id="18" w:name="_Toc244042483"/>
       <w:r>
         <w:rPr>
           <w:cs/>
@@ -14634,7 +14643,7 @@
       <w:pPr>
         <w:pStyle w:val="Heading2"/>
       </w:pPr>
-      <w:bookmarkStart w:id="19" w:name="_Toc244042360"/>
+      <w:bookmarkStart w:id="19" w:name="_Toc244042484"/>
       <w:r>
         <w:rPr>
           <w:cs/>
@@ -15046,7 +15055,7 @@
       <w:pPr>
         <w:pStyle w:val="Heading2"/>
       </w:pPr>
-      <w:bookmarkStart w:id="20" w:name="_Toc244042361"/>
+      <w:bookmarkStart w:id="20" w:name="_Toc244042485"/>
       <w:r>
         <w:rPr>
           <w:cs/>
@@ -15315,7 +15324,7 @@
       <w:pPr>
         <w:pStyle w:val="Heading2"/>
       </w:pPr>
-      <w:bookmarkStart w:id="21" w:name="_Toc244042362"/>
+      <w:bookmarkStart w:id="21" w:name="_Toc244042486"/>
       <w:r>
         <w:rPr>
           <w:cs/>
@@ -15655,7 +15664,7 @@
       <w:pPr>
         <w:pStyle w:val="Heading2"/>
       </w:pPr>
-      <w:bookmarkStart w:id="22" w:name="_Toc244042363"/>
+      <w:bookmarkStart w:id="22" w:name="_Toc244042487"/>
       <w:r>
         <w:rPr>
           <w:cs/>
@@ -16576,7 +16585,7 @@
       <w:pPr>
         <w:pStyle w:val="Heading2"/>
       </w:pPr>
-      <w:bookmarkStart w:id="23" w:name="_Toc244042364"/>
+      <w:bookmarkStart w:id="23" w:name="_Toc244042488"/>
       <w:r>
         <w:rPr>
           <w:cs/>
@@ -17356,7 +17365,7 @@
       <w:pPr>
         <w:pStyle w:val="Heading1"/>
       </w:pPr>
-      <w:bookmarkStart w:id="24" w:name="_Toc244042365"/>
+      <w:bookmarkStart w:id="24" w:name="_Toc244042489"/>
       <w:r>
         <w:rPr>
           <w:cs/>
@@ -17369,7 +17378,7 @@
       <w:pPr>
         <w:pStyle w:val="Heading2"/>
       </w:pPr>
-      <w:bookmarkStart w:id="25" w:name="_Toc244042366"/>
+      <w:bookmarkStart w:id="25" w:name="_Toc244042490"/>
       <w:r>
         <w:rPr>
           <w:cs/>
@@ -17550,7 +17559,7 @@
       <w:pPr>
         <w:pStyle w:val="Heading2"/>
       </w:pPr>
-      <w:bookmarkStart w:id="26" w:name="_Toc244042367"/>
+      <w:bookmarkStart w:id="26" w:name="_Toc244042491"/>
       <w:r>
         <w:rPr>
           <w:cs/>
@@ -17994,7 +18003,7 @@
       <w:pPr>
         <w:pStyle w:val="Heading2"/>
       </w:pPr>
-      <w:bookmarkStart w:id="27" w:name="_Toc244042368"/>
+      <w:bookmarkStart w:id="27" w:name="_Toc244042492"/>
       <w:r>
         <w:rPr>
           <w:cs/>
@@ -18605,7 +18614,7 @@
       <w:pPr>
         <w:pStyle w:val="Heading2"/>
       </w:pPr>
-      <w:bookmarkStart w:id="28" w:name="_Toc244042369"/>
+      <w:bookmarkStart w:id="28" w:name="_Toc244042493"/>
       <w:r>
         <w:rPr>
           <w:cs/>
@@ -20176,7 +20185,7 @@
       <w:pPr>
         <w:pStyle w:val="Heading2"/>
       </w:pPr>
-      <w:bookmarkStart w:id="29" w:name="_Toc244042370"/>
+      <w:bookmarkStart w:id="29" w:name="_Toc244042494"/>
       <w:r>
         <w:rPr>
           <w:cs/>
@@ -20298,7 +20307,7 @@
       <w:pPr>
         <w:pStyle w:val="Heading1"/>
       </w:pPr>
-      <w:bookmarkStart w:id="30" w:name="_Toc244042371"/>
+      <w:bookmarkStart w:id="30" w:name="_Toc244042495"/>
       <w:r>
         <w:rPr>
           <w:cs/>
@@ -20311,7 +20320,7 @@
       <w:pPr>
         <w:pStyle w:val="Heading2"/>
       </w:pPr>
-      <w:bookmarkStart w:id="31" w:name="_Toc244042372"/>
+      <w:bookmarkStart w:id="31" w:name="_Toc244042496"/>
       <w:r>
         <w:rPr>
           <w:cs/>
@@ -20460,7 +20469,7 @@
       <w:pPr>
         <w:pStyle w:val="Heading2"/>
       </w:pPr>
-      <w:bookmarkStart w:id="32" w:name="_Toc244042373"/>
+      <w:bookmarkStart w:id="32" w:name="_Toc244042497"/>
       <w:r>
         <w:rPr>
           <w:cs/>
@@ -20576,7 +20585,7 @@
       <w:pPr>
         <w:pStyle w:val="Heading2"/>
       </w:pPr>
-      <w:bookmarkStart w:id="33" w:name="_Toc244042374"/>
+      <w:bookmarkStart w:id="33" w:name="_Toc244042498"/>
       <w:r>
         <w:rPr>
           <w:cs/>
@@ -20691,7 +20700,7 @@
       <w:pPr>
         <w:pStyle w:val="Heading1"/>
       </w:pPr>
-      <w:bookmarkStart w:id="34" w:name="_Toc244042375"/>
+      <w:bookmarkStart w:id="34" w:name="_Toc244042499"/>
       <w:r>
         <w:rPr>
           <w:cs/>
@@ -22755,7 +22764,7 @@
       <w:pPr>
         <w:pStyle w:val="Heading1"/>
       </w:pPr>
-      <w:bookmarkStart w:id="35" w:name="_Toc244042376"/>
+      <w:bookmarkStart w:id="35" w:name="_Toc244042500"/>
       <w:r>
         <w:rPr>
           <w:cs/>
@@ -24320,31 +24329,31 @@
       </w:rPr>
     </w:lvl>
   </w:abstractNum>
-  <w:num w:numId="1" w16cid:durableId="1440564760">
+  <w:num w:numId="1" w16cid:durableId="862978350">
     <w:abstractNumId w:val="8"/>
   </w:num>
-  <w:num w:numId="2" w16cid:durableId="1604799820">
+  <w:num w:numId="2" w16cid:durableId="125973612">
     <w:abstractNumId w:val="6"/>
   </w:num>
-  <w:num w:numId="3" w16cid:durableId="2126120364">
+  <w:num w:numId="3" w16cid:durableId="1653287585">
     <w:abstractNumId w:val="5"/>
   </w:num>
-  <w:num w:numId="4" w16cid:durableId="1052193140">
+  <w:num w:numId="4" w16cid:durableId="2062898741">
     <w:abstractNumId w:val="4"/>
   </w:num>
-  <w:num w:numId="5" w16cid:durableId="1512142675">
+  <w:num w:numId="5" w16cid:durableId="673411937">
     <w:abstractNumId w:val="7"/>
   </w:num>
-  <w:num w:numId="6" w16cid:durableId="1723751931">
+  <w:num w:numId="6" w16cid:durableId="1952857394">
     <w:abstractNumId w:val="3"/>
   </w:num>
-  <w:num w:numId="7" w16cid:durableId="196087145">
+  <w:num w:numId="7" w16cid:durableId="1303383581">
     <w:abstractNumId w:val="2"/>
   </w:num>
-  <w:num w:numId="8" w16cid:durableId="1492213122">
+  <w:num w:numId="8" w16cid:durableId="1702436989">
     <w:abstractNumId w:val="1"/>
   </w:num>
-  <w:num w:numId="9" w16cid:durableId="543099094">
+  <w:num w:numId="9" w16cid:durableId="477695648">
     <w:abstractNumId w:val="0"/>
   </w:num>
 </w:numbering>
@@ -35761,7 +35770,7 @@
     <w:autoRedefine/>
     <w:uiPriority w:val="39"/>
     <w:unhideWhenUsed/>
-    <w:rsid w:val="0054200A"/>
+    <w:rsid w:val="00866DB4"/>
     <w:pPr>
       <w:spacing w:after="100"/>
     </w:pPr>
@@ -35777,7 +35786,7 @@
     <w:autoRedefine/>
     <w:uiPriority w:val="39"/>
     <w:unhideWhenUsed/>
-    <w:rsid w:val="0054200A"/>
+    <w:rsid w:val="00866DB4"/>
     <w:pPr>
       <w:spacing w:after="100"/>
       <w:ind w:left="320"/>
@@ -35792,7 +35801,7 @@
     <w:basedOn w:val="DefaultParagraphFont"/>
     <w:uiPriority w:val="99"/>
     <w:unhideWhenUsed/>
-    <w:rsid w:val="0054200A"/>
+    <w:rsid w:val="00866DB4"/>
     <w:rPr>
       <w:color w:val="0000FF" w:themeColor="hyperlink"/>
       <w:u w:val="single"/>

</xml_diff>

<commit_message>
Design doc: fix heading layout and add PDF bookmarks
- Each chapter (Heading 1) starts on a new page
- Lead paragraphs and code blocks no longer strand at page bottoms
- Export PDF with heading bookmarks (48 entries)
</commit_message>
<xml_diff>
--- a/DesignDocument_SmartLibrary.docx
+++ b/DesignDocument_SmartLibrary.docx
@@ -340,7 +340,6 @@
           <w:szCs w:val="44"/>
           <w:cs/>
         </w:rPr>
-        <w:lastRenderedPageBreak/>
         <w:t>สารบัญ</w:t>
       </w:r>
     </w:p>
@@ -379,7 +378,7 @@
         </w:rPr>
         <w:fldChar w:fldCharType="separate"/>
       </w:r>
-      <w:hyperlink w:anchor="_Toc244042465" w:history="1">
+      <w:hyperlink w:anchor="_Toc244043531" w:history="1">
         <w:r>
           <w:rPr>
             <w:rStyle w:val="Hyperlink"/>
@@ -415,7 +414,7 @@
             <w:webHidden/>
             <w:szCs w:val="32"/>
           </w:rPr>
-          <w:instrText xml:space="preserve"> PAGEREF _Toc244042465 \h </w:instrText>
+          <w:instrText xml:space="preserve"> PAGEREF _Toc244043531 \h </w:instrText>
         </w:r>
         <w:r>
           <w:rPr>
@@ -468,7 +467,7 @@
           <w14:ligatures w14:val="standardContextual"/>
         </w:rPr>
       </w:pPr>
-      <w:hyperlink w:anchor="_Toc244042466" w:history="1">
+      <w:hyperlink w:anchor="_Toc244043532" w:history="1">
         <w:r>
           <w:rPr>
             <w:rStyle w:val="Hyperlink"/>
@@ -504,7 +503,7 @@
             <w:webHidden/>
             <w:szCs w:val="32"/>
           </w:rPr>
-          <w:instrText xml:space="preserve"> PAGEREF _Toc244042466 \h </w:instrText>
+          <w:instrText xml:space="preserve"> PAGEREF _Toc244043532 \h </w:instrText>
         </w:r>
         <w:r>
           <w:rPr>
@@ -557,7 +556,7 @@
           <w14:ligatures w14:val="standardContextual"/>
         </w:rPr>
       </w:pPr>
-      <w:hyperlink w:anchor="_Toc244042467" w:history="1">
+      <w:hyperlink w:anchor="_Toc244043533" w:history="1">
         <w:r>
           <w:rPr>
             <w:rStyle w:val="Hyperlink"/>
@@ -593,7 +592,7 @@
             <w:webHidden/>
             <w:szCs w:val="32"/>
           </w:rPr>
-          <w:instrText xml:space="preserve"> PAGEREF _Toc244042467 \h </w:instrText>
+          <w:instrText xml:space="preserve"> PAGEREF _Toc244043533 \h </w:instrText>
         </w:r>
         <w:r>
           <w:rPr>
@@ -646,7 +645,7 @@
           <w14:ligatures w14:val="standardContextual"/>
         </w:rPr>
       </w:pPr>
-      <w:hyperlink w:anchor="_Toc244042468" w:history="1">
+      <w:hyperlink w:anchor="_Toc244043534" w:history="1">
         <w:r>
           <w:rPr>
             <w:rStyle w:val="Hyperlink"/>
@@ -682,7 +681,7 @@
             <w:webHidden/>
             <w:szCs w:val="32"/>
           </w:rPr>
-          <w:instrText xml:space="preserve"> PAGEREF _Toc244042468 \h </w:instrText>
+          <w:instrText xml:space="preserve"> PAGEREF _Toc244043534 \h </w:instrText>
         </w:r>
         <w:r>
           <w:rPr>
@@ -735,7 +734,7 @@
           <w14:ligatures w14:val="standardContextual"/>
         </w:rPr>
       </w:pPr>
-      <w:hyperlink w:anchor="_Toc244042469" w:history="1">
+      <w:hyperlink w:anchor="_Toc244043535" w:history="1">
         <w:r>
           <w:rPr>
             <w:rStyle w:val="Hyperlink"/>
@@ -771,7 +770,7 @@
             <w:webHidden/>
             <w:szCs w:val="32"/>
           </w:rPr>
-          <w:instrText xml:space="preserve"> PAGEREF _Toc244042469 \h </w:instrText>
+          <w:instrText xml:space="preserve"> PAGEREF _Toc244043535 \h </w:instrText>
         </w:r>
         <w:r>
           <w:rPr>
@@ -824,7 +823,7 @@
           <w14:ligatures w14:val="standardContextual"/>
         </w:rPr>
       </w:pPr>
-      <w:hyperlink w:anchor="_Toc244042470" w:history="1">
+      <w:hyperlink w:anchor="_Toc244043536" w:history="1">
         <w:r>
           <w:rPr>
             <w:rStyle w:val="Hyperlink"/>
@@ -860,96 +859,7 @@
             <w:webHidden/>
             <w:szCs w:val="32"/>
           </w:rPr>
-          <w:instrText xml:space="preserve"> PAGEREF _Toc244042470 \h </w:instrText>
-        </w:r>
-        <w:r>
-          <w:rPr>
-            <w:rFonts w:cs="TH Sarabun New"/>
-            <w:noProof/>
-            <w:webHidden/>
-            <w:szCs w:val="32"/>
-          </w:rPr>
-        </w:r>
-        <w:r>
-          <w:rPr>
-            <w:rFonts w:cs="TH Sarabun New"/>
-            <w:noProof/>
-            <w:webHidden/>
-            <w:szCs w:val="32"/>
-          </w:rPr>
-          <w:fldChar w:fldCharType="separate"/>
-        </w:r>
-        <w:r>
-          <w:rPr>
-            <w:rFonts w:cs="TH Sarabun New"/>
-            <w:noProof/>
-            <w:webHidden/>
-            <w:szCs w:val="32"/>
-          </w:rPr>
-          <w:t>5</w:t>
-        </w:r>
-        <w:r>
-          <w:rPr>
-            <w:rFonts w:cs="TH Sarabun New"/>
-            <w:noProof/>
-            <w:webHidden/>
-            <w:szCs w:val="32"/>
-          </w:rPr>
-          <w:fldChar w:fldCharType="end"/>
-        </w:r>
-      </w:hyperlink>
-    </w:p>
-    <w:p>
-      <w:pPr>
-        <w:pStyle w:val="TOC2"/>
-        <w:tabs>
-          <w:tab w:val="right" w:leader="dot" w:pos="9016"/>
-        </w:tabs>
-        <w:rPr>
-          <w:rFonts w:eastAsiaTheme="minorEastAsia" w:cs="TH Sarabun New"/>
-          <w:noProof/>
-          <w:kern w:val="2"/>
-          <w:szCs w:val="32"/>
-          <w14:ligatures w14:val="standardContextual"/>
-        </w:rPr>
-      </w:pPr>
-      <w:hyperlink w:anchor="_Toc244042471" w:history="1">
-        <w:r>
-          <w:rPr>
-            <w:rStyle w:val="Hyperlink"/>
-            <w:rFonts w:cs="TH Sarabun New"/>
-            <w:noProof/>
-            <w:szCs w:val="32"/>
-            <w:cs/>
-          </w:rPr>
-          <w:t>2.1 แหล่งข้อมูลที่ใช้</w:t>
-        </w:r>
-        <w:r>
-          <w:rPr>
-            <w:rFonts w:cs="TH Sarabun New"/>
-            <w:noProof/>
-            <w:webHidden/>
-            <w:szCs w:val="32"/>
-          </w:rPr>
-          <w:tab/>
-        </w:r>
-        <w:r>
-          <w:rPr>
-            <w:rFonts w:cs="TH Sarabun New"/>
-            <w:noProof/>
-            <w:webHidden/>
-            <w:szCs w:val="32"/>
-          </w:rPr>
-          <w:fldChar w:fldCharType="begin"/>
-        </w:r>
-        <w:r>
-          <w:rPr>
-            <w:rFonts w:cs="TH Sarabun New"/>
-            <w:noProof/>
-            <w:webHidden/>
-            <w:szCs w:val="32"/>
-          </w:rPr>
-          <w:instrText xml:space="preserve"> PAGEREF _Toc244042471 \h </w:instrText>
+          <w:instrText xml:space="preserve"> PAGEREF _Toc244043536 \h </w:instrText>
         </w:r>
         <w:r>
           <w:rPr>
@@ -1002,7 +912,7 @@
           <w14:ligatures w14:val="standardContextual"/>
         </w:rPr>
       </w:pPr>
-      <w:hyperlink w:anchor="_Toc244042472" w:history="1">
+      <w:hyperlink w:anchor="_Toc244043537" w:history="1">
         <w:r>
           <w:rPr>
             <w:rStyle w:val="Hyperlink"/>
@@ -1011,7 +921,7 @@
             <w:szCs w:val="32"/>
             <w:cs/>
           </w:rPr>
-          <w:t>2.2 การทดลองยืนยันข้อมูลบนบอร์ด</w:t>
+          <w:t>2.1 แหล่งข้อมูลที่ใช้</w:t>
         </w:r>
         <w:r>
           <w:rPr>
@@ -1038,7 +948,7 @@
             <w:webHidden/>
             <w:szCs w:val="32"/>
           </w:rPr>
-          <w:instrText xml:space="preserve"> PAGEREF _Toc244042472 \h </w:instrText>
+          <w:instrText xml:space="preserve"> PAGEREF _Toc244043537 \h </w:instrText>
         </w:r>
         <w:r>
           <w:rPr>
@@ -1091,7 +1001,96 @@
           <w14:ligatures w14:val="standardContextual"/>
         </w:rPr>
       </w:pPr>
-      <w:hyperlink w:anchor="_Toc244042473" w:history="1">
+      <w:hyperlink w:anchor="_Toc244043538" w:history="1">
+        <w:r>
+          <w:rPr>
+            <w:rStyle w:val="Hyperlink"/>
+            <w:rFonts w:cs="TH Sarabun New"/>
+            <w:noProof/>
+            <w:szCs w:val="32"/>
+            <w:cs/>
+          </w:rPr>
+          <w:t>2.2 การทดลองยืนยันข้อมูลบนบอร์ด</w:t>
+        </w:r>
+        <w:r>
+          <w:rPr>
+            <w:rFonts w:cs="TH Sarabun New"/>
+            <w:noProof/>
+            <w:webHidden/>
+            <w:szCs w:val="32"/>
+          </w:rPr>
+          <w:tab/>
+        </w:r>
+        <w:r>
+          <w:rPr>
+            <w:rFonts w:cs="TH Sarabun New"/>
+            <w:noProof/>
+            <w:webHidden/>
+            <w:szCs w:val="32"/>
+          </w:rPr>
+          <w:fldChar w:fldCharType="begin"/>
+        </w:r>
+        <w:r>
+          <w:rPr>
+            <w:rFonts w:cs="TH Sarabun New"/>
+            <w:noProof/>
+            <w:webHidden/>
+            <w:szCs w:val="32"/>
+          </w:rPr>
+          <w:instrText xml:space="preserve"> PAGEREF _Toc244043538 \h </w:instrText>
+        </w:r>
+        <w:r>
+          <w:rPr>
+            <w:rFonts w:cs="TH Sarabun New"/>
+            <w:noProof/>
+            <w:webHidden/>
+            <w:szCs w:val="32"/>
+          </w:rPr>
+        </w:r>
+        <w:r>
+          <w:rPr>
+            <w:rFonts w:cs="TH Sarabun New"/>
+            <w:noProof/>
+            <w:webHidden/>
+            <w:szCs w:val="32"/>
+          </w:rPr>
+          <w:fldChar w:fldCharType="separate"/>
+        </w:r>
+        <w:r>
+          <w:rPr>
+            <w:rFonts w:cs="TH Sarabun New"/>
+            <w:noProof/>
+            <w:webHidden/>
+            <w:szCs w:val="32"/>
+          </w:rPr>
+          <w:t>7</w:t>
+        </w:r>
+        <w:r>
+          <w:rPr>
+            <w:rFonts w:cs="TH Sarabun New"/>
+            <w:noProof/>
+            <w:webHidden/>
+            <w:szCs w:val="32"/>
+          </w:rPr>
+          <w:fldChar w:fldCharType="end"/>
+        </w:r>
+      </w:hyperlink>
+    </w:p>
+    <w:p>
+      <w:pPr>
+        <w:pStyle w:val="TOC2"/>
+        <w:tabs>
+          <w:tab w:val="right" w:leader="dot" w:pos="9016"/>
+        </w:tabs>
+        <w:rPr>
+          <w:rFonts w:eastAsiaTheme="minorEastAsia" w:cs="TH Sarabun New"/>
+          <w:noProof/>
+          <w:kern w:val="2"/>
+          <w:szCs w:val="32"/>
+          <w14:ligatures w14:val="standardContextual"/>
+        </w:rPr>
+      </w:pPr>
+      <w:hyperlink w:anchor="_Toc244043539" w:history="1">
         <w:r>
           <w:rPr>
             <w:rStyle w:val="Hyperlink"/>
@@ -1127,7 +1126,7 @@
             <w:webHidden/>
             <w:szCs w:val="32"/>
           </w:rPr>
-          <w:instrText xml:space="preserve"> PAGEREF _Toc244042473 \h </w:instrText>
+          <w:instrText xml:space="preserve"> PAGEREF _Toc244043539 \h </w:instrText>
         </w:r>
         <w:r>
           <w:rPr>
@@ -1180,7 +1179,7 @@
           <w14:ligatures w14:val="standardContextual"/>
         </w:rPr>
       </w:pPr>
-      <w:hyperlink w:anchor="_Toc244042474" w:history="1">
+      <w:hyperlink w:anchor="_Toc244043540" w:history="1">
         <w:r>
           <w:rPr>
             <w:rStyle w:val="Hyperlink"/>
@@ -1225,7 +1224,7 @@
             <w:webHidden/>
             <w:szCs w:val="32"/>
           </w:rPr>
-          <w:instrText xml:space="preserve"> PAGEREF _Toc244042474 \h </w:instrText>
+          <w:instrText xml:space="preserve"> PAGEREF _Toc244043540 \h </w:instrText>
         </w:r>
         <w:r>
           <w:rPr>
@@ -1251,7 +1250,7 @@
             <w:webHidden/>
             <w:szCs w:val="32"/>
           </w:rPr>
-          <w:t>8</w:t>
+          <w:t>9</w:t>
         </w:r>
         <w:r>
           <w:rPr>
@@ -1278,7 +1277,7 @@
           <w14:ligatures w14:val="standardContextual"/>
         </w:rPr>
       </w:pPr>
-      <w:hyperlink w:anchor="_Toc244042475" w:history="1">
+      <w:hyperlink w:anchor="_Toc244043541" w:history="1">
         <w:r>
           <w:rPr>
             <w:rStyle w:val="Hyperlink"/>
@@ -1323,7 +1322,7 @@
             <w:webHidden/>
             <w:szCs w:val="32"/>
           </w:rPr>
-          <w:instrText xml:space="preserve"> PAGEREF _Toc244042475 \h </w:instrText>
+          <w:instrText xml:space="preserve"> PAGEREF _Toc244043541 \h </w:instrText>
         </w:r>
         <w:r>
           <w:rPr>
@@ -1349,7 +1348,7 @@
             <w:webHidden/>
             <w:szCs w:val="32"/>
           </w:rPr>
-          <w:t>8</w:t>
+          <w:t>9</w:t>
         </w:r>
         <w:r>
           <w:rPr>
@@ -1376,7 +1375,7 @@
           <w14:ligatures w14:val="standardContextual"/>
         </w:rPr>
       </w:pPr>
-      <w:hyperlink w:anchor="_Toc244042476" w:history="1">
+      <w:hyperlink w:anchor="_Toc244043542" w:history="1">
         <w:r>
           <w:rPr>
             <w:rStyle w:val="Hyperlink"/>
@@ -1421,7 +1420,7 @@
             <w:webHidden/>
             <w:szCs w:val="32"/>
           </w:rPr>
-          <w:instrText xml:space="preserve"> PAGEREF _Toc244042476 \h </w:instrText>
+          <w:instrText xml:space="preserve"> PAGEREF _Toc244043542 \h </w:instrText>
         </w:r>
         <w:r>
           <w:rPr>
@@ -1447,7 +1446,7 @@
             <w:webHidden/>
             <w:szCs w:val="32"/>
           </w:rPr>
-          <w:t>9</w:t>
+          <w:t>10</w:t>
         </w:r>
         <w:r>
           <w:rPr>
@@ -1474,7 +1473,7 @@
           <w14:ligatures w14:val="standardContextual"/>
         </w:rPr>
       </w:pPr>
-      <w:hyperlink w:anchor="_Toc244042477" w:history="1">
+      <w:hyperlink w:anchor="_Toc244043543" w:history="1">
         <w:r>
           <w:rPr>
             <w:rStyle w:val="Hyperlink"/>
@@ -1519,7 +1518,7 @@
             <w:webHidden/>
             <w:szCs w:val="32"/>
           </w:rPr>
-          <w:instrText xml:space="preserve"> PAGEREF _Toc244042477 \h </w:instrText>
+          <w:instrText xml:space="preserve"> PAGEREF _Toc244043543 \h </w:instrText>
         </w:r>
         <w:r>
           <w:rPr>
@@ -1572,7 +1571,7 @@
           <w14:ligatures w14:val="standardContextual"/>
         </w:rPr>
       </w:pPr>
-      <w:hyperlink w:anchor="_Toc244042478" w:history="1">
+      <w:hyperlink w:anchor="_Toc244043544" w:history="1">
         <w:r>
           <w:rPr>
             <w:rStyle w:val="Hyperlink"/>
@@ -1617,7 +1616,7 @@
             <w:webHidden/>
             <w:szCs w:val="32"/>
           </w:rPr>
-          <w:instrText xml:space="preserve"> PAGEREF _Toc244042478 \h </w:instrText>
+          <w:instrText xml:space="preserve"> PAGEREF _Toc244043544 \h </w:instrText>
         </w:r>
         <w:r>
           <w:rPr>
@@ -1643,7 +1642,7 @@
             <w:webHidden/>
             <w:szCs w:val="32"/>
           </w:rPr>
-          <w:t>11</w:t>
+          <w:t>12</w:t>
         </w:r>
         <w:r>
           <w:rPr>
@@ -1670,7 +1669,7 @@
           <w14:ligatures w14:val="standardContextual"/>
         </w:rPr>
       </w:pPr>
-      <w:hyperlink w:anchor="_Toc244042479" w:history="1">
+      <w:hyperlink w:anchor="_Toc244043545" w:history="1">
         <w:r>
           <w:rPr>
             <w:rStyle w:val="Hyperlink"/>
@@ -1715,7 +1714,7 @@
             <w:webHidden/>
             <w:szCs w:val="32"/>
           </w:rPr>
-          <w:instrText xml:space="preserve"> PAGEREF _Toc244042479 \h </w:instrText>
+          <w:instrText xml:space="preserve"> PAGEREF _Toc244043545 \h </w:instrText>
         </w:r>
         <w:r>
           <w:rPr>
@@ -1741,7 +1740,7 @@
             <w:webHidden/>
             <w:szCs w:val="32"/>
           </w:rPr>
-          <w:t>15</w:t>
+          <w:t>16</w:t>
         </w:r>
         <w:r>
           <w:rPr>
@@ -1768,7 +1767,7 @@
           <w14:ligatures w14:val="standardContextual"/>
         </w:rPr>
       </w:pPr>
-      <w:hyperlink w:anchor="_Toc244042480" w:history="1">
+      <w:hyperlink w:anchor="_Toc244043546" w:history="1">
         <w:r>
           <w:rPr>
             <w:rStyle w:val="Hyperlink"/>
@@ -1804,7 +1803,7 @@
             <w:webHidden/>
             <w:szCs w:val="32"/>
           </w:rPr>
-          <w:instrText xml:space="preserve"> PAGEREF _Toc244042480 \h </w:instrText>
+          <w:instrText xml:space="preserve"> PAGEREF _Toc244043546 \h </w:instrText>
         </w:r>
         <w:r>
           <w:rPr>
@@ -1830,7 +1829,7 @@
             <w:webHidden/>
             <w:szCs w:val="32"/>
           </w:rPr>
-          <w:t>15</w:t>
+          <w:t>16</w:t>
         </w:r>
         <w:r>
           <w:rPr>
@@ -1857,7 +1856,7 @@
           <w14:ligatures w14:val="standardContextual"/>
         </w:rPr>
       </w:pPr>
-      <w:hyperlink w:anchor="_Toc244042481" w:history="1">
+      <w:hyperlink w:anchor="_Toc244043547" w:history="1">
         <w:r>
           <w:rPr>
             <w:rStyle w:val="Hyperlink"/>
@@ -1912,185 +1911,7 @@
             <w:webHidden/>
             <w:szCs w:val="32"/>
           </w:rPr>
-          <w:instrText xml:space="preserve"> PAGEREF _Toc244042481 \h </w:instrText>
-        </w:r>
-        <w:r>
-          <w:rPr>
-            <w:rFonts w:cs="TH Sarabun New"/>
-            <w:noProof/>
-            <w:webHidden/>
-            <w:szCs w:val="32"/>
-          </w:rPr>
-        </w:r>
-        <w:r>
-          <w:rPr>
-            <w:rFonts w:cs="TH Sarabun New"/>
-            <w:noProof/>
-            <w:webHidden/>
-            <w:szCs w:val="32"/>
-          </w:rPr>
-          <w:fldChar w:fldCharType="separate"/>
-        </w:r>
-        <w:r>
-          <w:rPr>
-            <w:rFonts w:cs="TH Sarabun New"/>
-            <w:noProof/>
-            <w:webHidden/>
-            <w:szCs w:val="32"/>
-          </w:rPr>
-          <w:t>16</w:t>
-        </w:r>
-        <w:r>
-          <w:rPr>
-            <w:rFonts w:cs="TH Sarabun New"/>
-            <w:noProof/>
-            <w:webHidden/>
-            <w:szCs w:val="32"/>
-          </w:rPr>
-          <w:fldChar w:fldCharType="end"/>
-        </w:r>
-      </w:hyperlink>
-    </w:p>
-    <w:p>
-      <w:pPr>
-        <w:pStyle w:val="TOC2"/>
-        <w:tabs>
-          <w:tab w:val="right" w:leader="dot" w:pos="9016"/>
-        </w:tabs>
-        <w:rPr>
-          <w:rFonts w:eastAsiaTheme="minorEastAsia" w:cs="TH Sarabun New"/>
-          <w:noProof/>
-          <w:kern w:val="2"/>
-          <w:szCs w:val="32"/>
-          <w14:ligatures w14:val="standardContextual"/>
-        </w:rPr>
-      </w:pPr>
-      <w:hyperlink w:anchor="_Toc244042482" w:history="1">
-        <w:r>
-          <w:rPr>
-            <w:rStyle w:val="Hyperlink"/>
-            <w:rFonts w:cs="TH Sarabun New"/>
-            <w:noProof/>
-            <w:szCs w:val="32"/>
-            <w:cs/>
-          </w:rPr>
-          <w:t>3.8 การออกแบบวงจรภายนอก</w:t>
-        </w:r>
-        <w:r>
-          <w:rPr>
-            <w:rFonts w:cs="TH Sarabun New"/>
-            <w:noProof/>
-            <w:webHidden/>
-            <w:szCs w:val="32"/>
-          </w:rPr>
-          <w:tab/>
-        </w:r>
-        <w:r>
-          <w:rPr>
-            <w:rFonts w:cs="TH Sarabun New"/>
-            <w:noProof/>
-            <w:webHidden/>
-            <w:szCs w:val="32"/>
-          </w:rPr>
-          <w:fldChar w:fldCharType="begin"/>
-        </w:r>
-        <w:r>
-          <w:rPr>
-            <w:rFonts w:cs="TH Sarabun New"/>
-            <w:noProof/>
-            <w:webHidden/>
-            <w:szCs w:val="32"/>
-          </w:rPr>
-          <w:instrText xml:space="preserve"> PAGEREF _Toc244042482 \h </w:instrText>
-        </w:r>
-        <w:r>
-          <w:rPr>
-            <w:rFonts w:cs="TH Sarabun New"/>
-            <w:noProof/>
-            <w:webHidden/>
-            <w:szCs w:val="32"/>
-          </w:rPr>
-        </w:r>
-        <w:r>
-          <w:rPr>
-            <w:rFonts w:cs="TH Sarabun New"/>
-            <w:noProof/>
-            <w:webHidden/>
-            <w:szCs w:val="32"/>
-          </w:rPr>
-          <w:fldChar w:fldCharType="separate"/>
-        </w:r>
-        <w:r>
-          <w:rPr>
-            <w:rFonts w:cs="TH Sarabun New"/>
-            <w:noProof/>
-            <w:webHidden/>
-            <w:szCs w:val="32"/>
-          </w:rPr>
-          <w:t>17</w:t>
-        </w:r>
-        <w:r>
-          <w:rPr>
-            <w:rFonts w:cs="TH Sarabun New"/>
-            <w:noProof/>
-            <w:webHidden/>
-            <w:szCs w:val="32"/>
-          </w:rPr>
-          <w:fldChar w:fldCharType="end"/>
-        </w:r>
-      </w:hyperlink>
-    </w:p>
-    <w:p>
-      <w:pPr>
-        <w:pStyle w:val="TOC1"/>
-        <w:tabs>
-          <w:tab w:val="right" w:leader="dot" w:pos="9016"/>
-        </w:tabs>
-        <w:rPr>
-          <w:rFonts w:eastAsiaTheme="minorEastAsia" w:cs="TH Sarabun New"/>
-          <w:noProof/>
-          <w:kern w:val="2"/>
-          <w:szCs w:val="32"/>
-          <w14:ligatures w14:val="standardContextual"/>
-        </w:rPr>
-      </w:pPr>
-      <w:hyperlink w:anchor="_Toc244042483" w:history="1">
-        <w:r>
-          <w:rPr>
-            <w:rStyle w:val="Hyperlink"/>
-            <w:rFonts w:cs="TH Sarabun New"/>
-            <w:noProof/>
-            <w:szCs w:val="32"/>
-            <w:cs/>
-          </w:rPr>
-          <w:t>4. กระบวนการพัฒนา</w:t>
-        </w:r>
-        <w:r>
-          <w:rPr>
-            <w:rFonts w:cs="TH Sarabun New"/>
-            <w:noProof/>
-            <w:webHidden/>
-            <w:szCs w:val="32"/>
-          </w:rPr>
-          <w:tab/>
-        </w:r>
-        <w:r>
-          <w:rPr>
-            <w:rFonts w:cs="TH Sarabun New"/>
-            <w:noProof/>
-            <w:webHidden/>
-            <w:szCs w:val="32"/>
-          </w:rPr>
-          <w:fldChar w:fldCharType="begin"/>
-        </w:r>
-        <w:r>
-          <w:rPr>
-            <w:rFonts w:cs="TH Sarabun New"/>
-            <w:noProof/>
-            <w:webHidden/>
-            <w:szCs w:val="32"/>
-          </w:rPr>
-          <w:instrText xml:space="preserve"> PAGEREF _Toc244042483 \h </w:instrText>
+          <w:instrText xml:space="preserve"> PAGEREF _Toc244043547 \h </w:instrText>
         </w:r>
         <w:r>
           <w:rPr>
@@ -2143,7 +1964,185 @@
           <w14:ligatures w14:val="standardContextual"/>
         </w:rPr>
       </w:pPr>
-      <w:hyperlink w:anchor="_Toc244042484" w:history="1">
+      <w:hyperlink w:anchor="_Toc244043548" w:history="1">
+        <w:r>
+          <w:rPr>
+            <w:rStyle w:val="Hyperlink"/>
+            <w:rFonts w:cs="TH Sarabun New"/>
+            <w:noProof/>
+            <w:szCs w:val="32"/>
+            <w:cs/>
+          </w:rPr>
+          <w:t>3.8 การออกแบบวงจรภายนอก</w:t>
+        </w:r>
+        <w:r>
+          <w:rPr>
+            <w:rFonts w:cs="TH Sarabun New"/>
+            <w:noProof/>
+            <w:webHidden/>
+            <w:szCs w:val="32"/>
+          </w:rPr>
+          <w:tab/>
+        </w:r>
+        <w:r>
+          <w:rPr>
+            <w:rFonts w:cs="TH Sarabun New"/>
+            <w:noProof/>
+            <w:webHidden/>
+            <w:szCs w:val="32"/>
+          </w:rPr>
+          <w:fldChar w:fldCharType="begin"/>
+        </w:r>
+        <w:r>
+          <w:rPr>
+            <w:rFonts w:cs="TH Sarabun New"/>
+            <w:noProof/>
+            <w:webHidden/>
+            <w:szCs w:val="32"/>
+          </w:rPr>
+          <w:instrText xml:space="preserve"> PAGEREF _Toc244043548 \h </w:instrText>
+        </w:r>
+        <w:r>
+          <w:rPr>
+            <w:rFonts w:cs="TH Sarabun New"/>
+            <w:noProof/>
+            <w:webHidden/>
+            <w:szCs w:val="32"/>
+          </w:rPr>
+        </w:r>
+        <w:r>
+          <w:rPr>
+            <w:rFonts w:cs="TH Sarabun New"/>
+            <w:noProof/>
+            <w:webHidden/>
+            <w:szCs w:val="32"/>
+          </w:rPr>
+          <w:fldChar w:fldCharType="separate"/>
+        </w:r>
+        <w:r>
+          <w:rPr>
+            <w:rFonts w:cs="TH Sarabun New"/>
+            <w:noProof/>
+            <w:webHidden/>
+            <w:szCs w:val="32"/>
+          </w:rPr>
+          <w:t>18</w:t>
+        </w:r>
+        <w:r>
+          <w:rPr>
+            <w:rFonts w:cs="TH Sarabun New"/>
+            <w:noProof/>
+            <w:webHidden/>
+            <w:szCs w:val="32"/>
+          </w:rPr>
+          <w:fldChar w:fldCharType="end"/>
+        </w:r>
+      </w:hyperlink>
+    </w:p>
+    <w:p>
+      <w:pPr>
+        <w:pStyle w:val="TOC1"/>
+        <w:tabs>
+          <w:tab w:val="right" w:leader="dot" w:pos="9016"/>
+        </w:tabs>
+        <w:rPr>
+          <w:rFonts w:eastAsiaTheme="minorEastAsia" w:cs="TH Sarabun New"/>
+          <w:noProof/>
+          <w:kern w:val="2"/>
+          <w:szCs w:val="32"/>
+          <w14:ligatures w14:val="standardContextual"/>
+        </w:rPr>
+      </w:pPr>
+      <w:hyperlink w:anchor="_Toc244043549" w:history="1">
+        <w:r>
+          <w:rPr>
+            <w:rStyle w:val="Hyperlink"/>
+            <w:rFonts w:cs="TH Sarabun New"/>
+            <w:noProof/>
+            <w:szCs w:val="32"/>
+            <w:cs/>
+          </w:rPr>
+          <w:t>4. กระบวนการพัฒนา</w:t>
+        </w:r>
+        <w:r>
+          <w:rPr>
+            <w:rFonts w:cs="TH Sarabun New"/>
+            <w:noProof/>
+            <w:webHidden/>
+            <w:szCs w:val="32"/>
+          </w:rPr>
+          <w:tab/>
+        </w:r>
+        <w:r>
+          <w:rPr>
+            <w:rFonts w:cs="TH Sarabun New"/>
+            <w:noProof/>
+            <w:webHidden/>
+            <w:szCs w:val="32"/>
+          </w:rPr>
+          <w:fldChar w:fldCharType="begin"/>
+        </w:r>
+        <w:r>
+          <w:rPr>
+            <w:rFonts w:cs="TH Sarabun New"/>
+            <w:noProof/>
+            <w:webHidden/>
+            <w:szCs w:val="32"/>
+          </w:rPr>
+          <w:instrText xml:space="preserve"> PAGEREF _Toc244043549 \h </w:instrText>
+        </w:r>
+        <w:r>
+          <w:rPr>
+            <w:rFonts w:cs="TH Sarabun New"/>
+            <w:noProof/>
+            <w:webHidden/>
+            <w:szCs w:val="32"/>
+          </w:rPr>
+        </w:r>
+        <w:r>
+          <w:rPr>
+            <w:rFonts w:cs="TH Sarabun New"/>
+            <w:noProof/>
+            <w:webHidden/>
+            <w:szCs w:val="32"/>
+          </w:rPr>
+          <w:fldChar w:fldCharType="separate"/>
+        </w:r>
+        <w:r>
+          <w:rPr>
+            <w:rFonts w:cs="TH Sarabun New"/>
+            <w:noProof/>
+            <w:webHidden/>
+            <w:szCs w:val="32"/>
+          </w:rPr>
+          <w:t>19</w:t>
+        </w:r>
+        <w:r>
+          <w:rPr>
+            <w:rFonts w:cs="TH Sarabun New"/>
+            <w:noProof/>
+            <w:webHidden/>
+            <w:szCs w:val="32"/>
+          </w:rPr>
+          <w:fldChar w:fldCharType="end"/>
+        </w:r>
+      </w:hyperlink>
+    </w:p>
+    <w:p>
+      <w:pPr>
+        <w:pStyle w:val="TOC2"/>
+        <w:tabs>
+          <w:tab w:val="right" w:leader="dot" w:pos="9016"/>
+        </w:tabs>
+        <w:rPr>
+          <w:rFonts w:eastAsiaTheme="minorEastAsia" w:cs="TH Sarabun New"/>
+          <w:noProof/>
+          <w:kern w:val="2"/>
+          <w:szCs w:val="32"/>
+          <w14:ligatures w14:val="standardContextual"/>
+        </w:rPr>
+      </w:pPr>
+      <w:hyperlink w:anchor="_Toc244043550" w:history="1">
         <w:r>
           <w:rPr>
             <w:rStyle w:val="Hyperlink"/>
@@ -2179,7 +2178,7 @@
             <w:webHidden/>
             <w:szCs w:val="32"/>
           </w:rPr>
-          <w:instrText xml:space="preserve"> PAGEREF _Toc244042484 \h </w:instrText>
+          <w:instrText xml:space="preserve"> PAGEREF _Toc244043550 \h </w:instrText>
         </w:r>
         <w:r>
           <w:rPr>
@@ -2205,7 +2204,7 @@
             <w:webHidden/>
             <w:szCs w:val="32"/>
           </w:rPr>
-          <w:t>17</w:t>
+          <w:t>19</w:t>
         </w:r>
         <w:r>
           <w:rPr>
@@ -2232,7 +2231,7 @@
           <w14:ligatures w14:val="standardContextual"/>
         </w:rPr>
       </w:pPr>
-      <w:hyperlink w:anchor="_Toc244042485" w:history="1">
+      <w:hyperlink w:anchor="_Toc244043551" w:history="1">
         <w:r>
           <w:rPr>
             <w:rStyle w:val="Hyperlink"/>
@@ -2268,7 +2267,7 @@
             <w:webHidden/>
             <w:szCs w:val="32"/>
           </w:rPr>
-          <w:instrText xml:space="preserve"> PAGEREF _Toc244042485 \h </w:instrText>
+          <w:instrText xml:space="preserve"> PAGEREF _Toc244043551 \h </w:instrText>
         </w:r>
         <w:r>
           <w:rPr>
@@ -2294,7 +2293,7 @@
             <w:webHidden/>
             <w:szCs w:val="32"/>
           </w:rPr>
-          <w:t>17</w:t>
+          <w:t>19</w:t>
         </w:r>
         <w:r>
           <w:rPr>
@@ -2321,7 +2320,7 @@
           <w14:ligatures w14:val="standardContextual"/>
         </w:rPr>
       </w:pPr>
-      <w:hyperlink w:anchor="_Toc244042486" w:history="1">
+      <w:hyperlink w:anchor="_Toc244043552" w:history="1">
         <w:r>
           <w:rPr>
             <w:rStyle w:val="Hyperlink"/>
@@ -2376,7 +2375,7 @@
             <w:webHidden/>
             <w:szCs w:val="32"/>
           </w:rPr>
-          <w:instrText xml:space="preserve"> PAGEREF _Toc244042486 \h </w:instrText>
+          <w:instrText xml:space="preserve"> PAGEREF _Toc244043552 \h </w:instrText>
         </w:r>
         <w:r>
           <w:rPr>
@@ -2402,7 +2401,7 @@
             <w:webHidden/>
             <w:szCs w:val="32"/>
           </w:rPr>
-          <w:t>18</w:t>
+          <w:t>20</w:t>
         </w:r>
         <w:r>
           <w:rPr>
@@ -2429,7 +2428,7 @@
           <w14:ligatures w14:val="standardContextual"/>
         </w:rPr>
       </w:pPr>
-      <w:hyperlink w:anchor="_Toc244042487" w:history="1">
+      <w:hyperlink w:anchor="_Toc244043553" w:history="1">
         <w:r>
           <w:rPr>
             <w:rStyle w:val="Hyperlink"/>
@@ -2465,7 +2464,7 @@
             <w:webHidden/>
             <w:szCs w:val="32"/>
           </w:rPr>
-          <w:instrText xml:space="preserve"> PAGEREF _Toc244042487 \h </w:instrText>
+          <w:instrText xml:space="preserve"> PAGEREF _Toc244043553 \h </w:instrText>
         </w:r>
         <w:r>
           <w:rPr>
@@ -2491,7 +2490,7 @@
             <w:webHidden/>
             <w:szCs w:val="32"/>
           </w:rPr>
-          <w:t>19</w:t>
+          <w:t>20</w:t>
         </w:r>
         <w:r>
           <w:rPr>
@@ -2518,7 +2517,7 @@
           <w14:ligatures w14:val="standardContextual"/>
         </w:rPr>
       </w:pPr>
-      <w:hyperlink w:anchor="_Toc244042488" w:history="1">
+      <w:hyperlink w:anchor="_Toc244043554" w:history="1">
         <w:r>
           <w:rPr>
             <w:rStyle w:val="Hyperlink"/>
@@ -2563,541 +2562,7 @@
             <w:webHidden/>
             <w:szCs w:val="32"/>
           </w:rPr>
-          <w:instrText xml:space="preserve"> PAGEREF _Toc244042488 \h </w:instrText>
-        </w:r>
-        <w:r>
-          <w:rPr>
-            <w:rFonts w:cs="TH Sarabun New"/>
-            <w:noProof/>
-            <w:webHidden/>
-            <w:szCs w:val="32"/>
-          </w:rPr>
-        </w:r>
-        <w:r>
-          <w:rPr>
-            <w:rFonts w:cs="TH Sarabun New"/>
-            <w:noProof/>
-            <w:webHidden/>
-            <w:szCs w:val="32"/>
-          </w:rPr>
-          <w:fldChar w:fldCharType="separate"/>
-        </w:r>
-        <w:r>
-          <w:rPr>
-            <w:rFonts w:cs="TH Sarabun New"/>
-            <w:noProof/>
-            <w:webHidden/>
-            <w:szCs w:val="32"/>
-          </w:rPr>
-          <w:t>19</w:t>
-        </w:r>
-        <w:r>
-          <w:rPr>
-            <w:rFonts w:cs="TH Sarabun New"/>
-            <w:noProof/>
-            <w:webHidden/>
-            <w:szCs w:val="32"/>
-          </w:rPr>
-          <w:fldChar w:fldCharType="end"/>
-        </w:r>
-      </w:hyperlink>
-    </w:p>
-    <w:p>
-      <w:pPr>
-        <w:pStyle w:val="TOC1"/>
-        <w:tabs>
-          <w:tab w:val="right" w:leader="dot" w:pos="9016"/>
-        </w:tabs>
-        <w:rPr>
-          <w:rFonts w:eastAsiaTheme="minorEastAsia" w:cs="TH Sarabun New"/>
-          <w:noProof/>
-          <w:kern w:val="2"/>
-          <w:szCs w:val="32"/>
-          <w14:ligatures w14:val="standardContextual"/>
-        </w:rPr>
-      </w:pPr>
-      <w:hyperlink w:anchor="_Toc244042489" w:history="1">
-        <w:r>
-          <w:rPr>
-            <w:rStyle w:val="Hyperlink"/>
-            <w:rFonts w:cs="TH Sarabun New"/>
-            <w:noProof/>
-            <w:szCs w:val="32"/>
-            <w:cs/>
-          </w:rPr>
-          <w:t>5. กระบวนการทดสอบ</w:t>
-        </w:r>
-        <w:r>
-          <w:rPr>
-            <w:rFonts w:cs="TH Sarabun New"/>
-            <w:noProof/>
-            <w:webHidden/>
-            <w:szCs w:val="32"/>
-          </w:rPr>
-          <w:tab/>
-        </w:r>
-        <w:r>
-          <w:rPr>
-            <w:rFonts w:cs="TH Sarabun New"/>
-            <w:noProof/>
-            <w:webHidden/>
-            <w:szCs w:val="32"/>
-          </w:rPr>
-          <w:fldChar w:fldCharType="begin"/>
-        </w:r>
-        <w:r>
-          <w:rPr>
-            <w:rFonts w:cs="TH Sarabun New"/>
-            <w:noProof/>
-            <w:webHidden/>
-            <w:szCs w:val="32"/>
-          </w:rPr>
-          <w:instrText xml:space="preserve"> PAGEREF _Toc244042489 \h </w:instrText>
-        </w:r>
-        <w:r>
-          <w:rPr>
-            <w:rFonts w:cs="TH Sarabun New"/>
-            <w:noProof/>
-            <w:webHidden/>
-            <w:szCs w:val="32"/>
-          </w:rPr>
-        </w:r>
-        <w:r>
-          <w:rPr>
-            <w:rFonts w:cs="TH Sarabun New"/>
-            <w:noProof/>
-            <w:webHidden/>
-            <w:szCs w:val="32"/>
-          </w:rPr>
-          <w:fldChar w:fldCharType="separate"/>
-        </w:r>
-        <w:r>
-          <w:rPr>
-            <w:rFonts w:cs="TH Sarabun New"/>
-            <w:noProof/>
-            <w:webHidden/>
-            <w:szCs w:val="32"/>
-          </w:rPr>
-          <w:t>20</w:t>
-        </w:r>
-        <w:r>
-          <w:rPr>
-            <w:rFonts w:cs="TH Sarabun New"/>
-            <w:noProof/>
-            <w:webHidden/>
-            <w:szCs w:val="32"/>
-          </w:rPr>
-          <w:fldChar w:fldCharType="end"/>
-        </w:r>
-      </w:hyperlink>
-    </w:p>
-    <w:p>
-      <w:pPr>
-        <w:pStyle w:val="TOC2"/>
-        <w:tabs>
-          <w:tab w:val="right" w:leader="dot" w:pos="9016"/>
-        </w:tabs>
-        <w:rPr>
-          <w:rFonts w:eastAsiaTheme="minorEastAsia" w:cs="TH Sarabun New"/>
-          <w:noProof/>
-          <w:kern w:val="2"/>
-          <w:szCs w:val="32"/>
-          <w14:ligatures w14:val="standardContextual"/>
-        </w:rPr>
-      </w:pPr>
-      <w:hyperlink w:anchor="_Toc244042490" w:history="1">
-        <w:r>
-          <w:rPr>
-            <w:rStyle w:val="Hyperlink"/>
-            <w:rFonts w:cs="TH Sarabun New"/>
-            <w:noProof/>
-            <w:szCs w:val="32"/>
-            <w:cs/>
-          </w:rPr>
-          <w:t>5.1 แนวทางการทดสอบ</w:t>
-        </w:r>
-        <w:r>
-          <w:rPr>
-            <w:rFonts w:cs="TH Sarabun New"/>
-            <w:noProof/>
-            <w:webHidden/>
-            <w:szCs w:val="32"/>
-          </w:rPr>
-          <w:tab/>
-        </w:r>
-        <w:r>
-          <w:rPr>
-            <w:rFonts w:cs="TH Sarabun New"/>
-            <w:noProof/>
-            <w:webHidden/>
-            <w:szCs w:val="32"/>
-          </w:rPr>
-          <w:fldChar w:fldCharType="begin"/>
-        </w:r>
-        <w:r>
-          <w:rPr>
-            <w:rFonts w:cs="TH Sarabun New"/>
-            <w:noProof/>
-            <w:webHidden/>
-            <w:szCs w:val="32"/>
-          </w:rPr>
-          <w:instrText xml:space="preserve"> PAGEREF _Toc244042490 \h </w:instrText>
-        </w:r>
-        <w:r>
-          <w:rPr>
-            <w:rFonts w:cs="TH Sarabun New"/>
-            <w:noProof/>
-            <w:webHidden/>
-            <w:szCs w:val="32"/>
-          </w:rPr>
-        </w:r>
-        <w:r>
-          <w:rPr>
-            <w:rFonts w:cs="TH Sarabun New"/>
-            <w:noProof/>
-            <w:webHidden/>
-            <w:szCs w:val="32"/>
-          </w:rPr>
-          <w:fldChar w:fldCharType="separate"/>
-        </w:r>
-        <w:r>
-          <w:rPr>
-            <w:rFonts w:cs="TH Sarabun New"/>
-            <w:noProof/>
-            <w:webHidden/>
-            <w:szCs w:val="32"/>
-          </w:rPr>
-          <w:t>20</w:t>
-        </w:r>
-        <w:r>
-          <w:rPr>
-            <w:rFonts w:cs="TH Sarabun New"/>
-            <w:noProof/>
-            <w:webHidden/>
-            <w:szCs w:val="32"/>
-          </w:rPr>
-          <w:fldChar w:fldCharType="end"/>
-        </w:r>
-      </w:hyperlink>
-    </w:p>
-    <w:p>
-      <w:pPr>
-        <w:pStyle w:val="TOC2"/>
-        <w:tabs>
-          <w:tab w:val="right" w:leader="dot" w:pos="9016"/>
-        </w:tabs>
-        <w:rPr>
-          <w:rFonts w:eastAsiaTheme="minorEastAsia" w:cs="TH Sarabun New"/>
-          <w:noProof/>
-          <w:kern w:val="2"/>
-          <w:szCs w:val="32"/>
-          <w14:ligatures w14:val="standardContextual"/>
-        </w:rPr>
-      </w:pPr>
-      <w:hyperlink w:anchor="_Toc244042491" w:history="1">
-        <w:r>
-          <w:rPr>
-            <w:rStyle w:val="Hyperlink"/>
-            <w:rFonts w:cs="TH Sarabun New"/>
-            <w:noProof/>
-            <w:szCs w:val="32"/>
-            <w:cs/>
-          </w:rPr>
-          <w:t>5.2 ผลการทดสอบด้วยเครื่องมือ</w:t>
-        </w:r>
-        <w:r>
-          <w:rPr>
-            <w:rFonts w:cs="TH Sarabun New"/>
-            <w:noProof/>
-            <w:webHidden/>
-            <w:szCs w:val="32"/>
-          </w:rPr>
-          <w:tab/>
-        </w:r>
-        <w:r>
-          <w:rPr>
-            <w:rFonts w:cs="TH Sarabun New"/>
-            <w:noProof/>
-            <w:webHidden/>
-            <w:szCs w:val="32"/>
-          </w:rPr>
-          <w:fldChar w:fldCharType="begin"/>
-        </w:r>
-        <w:r>
-          <w:rPr>
-            <w:rFonts w:cs="TH Sarabun New"/>
-            <w:noProof/>
-            <w:webHidden/>
-            <w:szCs w:val="32"/>
-          </w:rPr>
-          <w:instrText xml:space="preserve"> PAGEREF _Toc244042491 \h </w:instrText>
-        </w:r>
-        <w:r>
-          <w:rPr>
-            <w:rFonts w:cs="TH Sarabun New"/>
-            <w:noProof/>
-            <w:webHidden/>
-            <w:szCs w:val="32"/>
-          </w:rPr>
-        </w:r>
-        <w:r>
-          <w:rPr>
-            <w:rFonts w:cs="TH Sarabun New"/>
-            <w:noProof/>
-            <w:webHidden/>
-            <w:szCs w:val="32"/>
-          </w:rPr>
-          <w:fldChar w:fldCharType="separate"/>
-        </w:r>
-        <w:r>
-          <w:rPr>
-            <w:rFonts w:cs="TH Sarabun New"/>
-            <w:noProof/>
-            <w:webHidden/>
-            <w:szCs w:val="32"/>
-          </w:rPr>
-          <w:t>20</w:t>
-        </w:r>
-        <w:r>
-          <w:rPr>
-            <w:rFonts w:cs="TH Sarabun New"/>
-            <w:noProof/>
-            <w:webHidden/>
-            <w:szCs w:val="32"/>
-          </w:rPr>
-          <w:fldChar w:fldCharType="end"/>
-        </w:r>
-      </w:hyperlink>
-    </w:p>
-    <w:p>
-      <w:pPr>
-        <w:pStyle w:val="TOC2"/>
-        <w:tabs>
-          <w:tab w:val="right" w:leader="dot" w:pos="9016"/>
-        </w:tabs>
-        <w:rPr>
-          <w:rFonts w:eastAsiaTheme="minorEastAsia" w:cs="TH Sarabun New"/>
-          <w:noProof/>
-          <w:kern w:val="2"/>
-          <w:szCs w:val="32"/>
-          <w14:ligatures w14:val="standardContextual"/>
-        </w:rPr>
-      </w:pPr>
-      <w:hyperlink w:anchor="_Toc244042492" w:history="1">
-        <w:r>
-          <w:rPr>
-            <w:rStyle w:val="Hyperlink"/>
-            <w:rFonts w:cs="TH Sarabun New"/>
-            <w:noProof/>
-            <w:szCs w:val="32"/>
-            <w:cs/>
-          </w:rPr>
-          <w:t>5.3 ผลการทดสอบบนบอร์ดที่ยืนยันแล้ว</w:t>
-        </w:r>
-        <w:r>
-          <w:rPr>
-            <w:rFonts w:cs="TH Sarabun New"/>
-            <w:noProof/>
-            <w:webHidden/>
-            <w:szCs w:val="32"/>
-          </w:rPr>
-          <w:tab/>
-        </w:r>
-        <w:r>
-          <w:rPr>
-            <w:rFonts w:cs="TH Sarabun New"/>
-            <w:noProof/>
-            <w:webHidden/>
-            <w:szCs w:val="32"/>
-          </w:rPr>
-          <w:fldChar w:fldCharType="begin"/>
-        </w:r>
-        <w:r>
-          <w:rPr>
-            <w:rFonts w:cs="TH Sarabun New"/>
-            <w:noProof/>
-            <w:webHidden/>
-            <w:szCs w:val="32"/>
-          </w:rPr>
-          <w:instrText xml:space="preserve"> PAGEREF _Toc244042492 \h </w:instrText>
-        </w:r>
-        <w:r>
-          <w:rPr>
-            <w:rFonts w:cs="TH Sarabun New"/>
-            <w:noProof/>
-            <w:webHidden/>
-            <w:szCs w:val="32"/>
-          </w:rPr>
-        </w:r>
-        <w:r>
-          <w:rPr>
-            <w:rFonts w:cs="TH Sarabun New"/>
-            <w:noProof/>
-            <w:webHidden/>
-            <w:szCs w:val="32"/>
-          </w:rPr>
-          <w:fldChar w:fldCharType="separate"/>
-        </w:r>
-        <w:r>
-          <w:rPr>
-            <w:rFonts w:cs="TH Sarabun New"/>
-            <w:noProof/>
-            <w:webHidden/>
-            <w:szCs w:val="32"/>
-          </w:rPr>
-          <w:t>20</w:t>
-        </w:r>
-        <w:r>
-          <w:rPr>
-            <w:rFonts w:cs="TH Sarabun New"/>
-            <w:noProof/>
-            <w:webHidden/>
-            <w:szCs w:val="32"/>
-          </w:rPr>
-          <w:fldChar w:fldCharType="end"/>
-        </w:r>
-      </w:hyperlink>
-    </w:p>
-    <w:p>
-      <w:pPr>
-        <w:pStyle w:val="TOC2"/>
-        <w:tabs>
-          <w:tab w:val="right" w:leader="dot" w:pos="9016"/>
-        </w:tabs>
-        <w:rPr>
-          <w:rFonts w:eastAsiaTheme="minorEastAsia" w:cs="TH Sarabun New"/>
-          <w:noProof/>
-          <w:kern w:val="2"/>
-          <w:szCs w:val="32"/>
-          <w14:ligatures w14:val="standardContextual"/>
-        </w:rPr>
-      </w:pPr>
-      <w:hyperlink w:anchor="_Toc244042493" w:history="1">
-        <w:r>
-          <w:rPr>
-            <w:rStyle w:val="Hyperlink"/>
-            <w:rFonts w:cs="TH Sarabun New"/>
-            <w:noProof/>
-            <w:szCs w:val="32"/>
-            <w:cs/>
-          </w:rPr>
-          <w:t>5.4 ตารางทดสอบรวมระบบ</w:t>
-        </w:r>
-        <w:r>
-          <w:rPr>
-            <w:rFonts w:cs="TH Sarabun New"/>
-            <w:noProof/>
-            <w:webHidden/>
-            <w:szCs w:val="32"/>
-          </w:rPr>
-          <w:tab/>
-        </w:r>
-        <w:r>
-          <w:rPr>
-            <w:rFonts w:cs="TH Sarabun New"/>
-            <w:noProof/>
-            <w:webHidden/>
-            <w:szCs w:val="32"/>
-          </w:rPr>
-          <w:fldChar w:fldCharType="begin"/>
-        </w:r>
-        <w:r>
-          <w:rPr>
-            <w:rFonts w:cs="TH Sarabun New"/>
-            <w:noProof/>
-            <w:webHidden/>
-            <w:szCs w:val="32"/>
-          </w:rPr>
-          <w:instrText xml:space="preserve"> PAGEREF _Toc244042493 \h </w:instrText>
-        </w:r>
-        <w:r>
-          <w:rPr>
-            <w:rFonts w:cs="TH Sarabun New"/>
-            <w:noProof/>
-            <w:webHidden/>
-            <w:szCs w:val="32"/>
-          </w:rPr>
-        </w:r>
-        <w:r>
-          <w:rPr>
-            <w:rFonts w:cs="TH Sarabun New"/>
-            <w:noProof/>
-            <w:webHidden/>
-            <w:szCs w:val="32"/>
-          </w:rPr>
-          <w:fldChar w:fldCharType="separate"/>
-        </w:r>
-        <w:r>
-          <w:rPr>
-            <w:rFonts w:cs="TH Sarabun New"/>
-            <w:noProof/>
-            <w:webHidden/>
-            <w:szCs w:val="32"/>
-          </w:rPr>
-          <w:t>20</w:t>
-        </w:r>
-        <w:r>
-          <w:rPr>
-            <w:rFonts w:cs="TH Sarabun New"/>
-            <w:noProof/>
-            <w:webHidden/>
-            <w:szCs w:val="32"/>
-          </w:rPr>
-          <w:fldChar w:fldCharType="end"/>
-        </w:r>
-      </w:hyperlink>
-    </w:p>
-    <w:p>
-      <w:pPr>
-        <w:pStyle w:val="TOC2"/>
-        <w:tabs>
-          <w:tab w:val="right" w:leader="dot" w:pos="9016"/>
-        </w:tabs>
-        <w:rPr>
-          <w:rFonts w:eastAsiaTheme="minorEastAsia" w:cs="TH Sarabun New"/>
-          <w:noProof/>
-          <w:kern w:val="2"/>
-          <w:szCs w:val="32"/>
-          <w14:ligatures w14:val="standardContextual"/>
-        </w:rPr>
-      </w:pPr>
-      <w:hyperlink w:anchor="_Toc244042494" w:history="1">
-        <w:r>
-          <w:rPr>
-            <w:rStyle w:val="Hyperlink"/>
-            <w:rFonts w:cs="TH Sarabun New"/>
-            <w:noProof/>
-            <w:szCs w:val="32"/>
-            <w:cs/>
-          </w:rPr>
-          <w:t>5.5 ค่าที่ต้องปรับเทียบก่อนนำเสนอ</w:t>
-        </w:r>
-        <w:r>
-          <w:rPr>
-            <w:rFonts w:cs="TH Sarabun New"/>
-            <w:noProof/>
-            <w:webHidden/>
-            <w:szCs w:val="32"/>
-          </w:rPr>
-          <w:tab/>
-        </w:r>
-        <w:r>
-          <w:rPr>
-            <w:rFonts w:cs="TH Sarabun New"/>
-            <w:noProof/>
-            <w:webHidden/>
-            <w:szCs w:val="32"/>
-          </w:rPr>
-          <w:fldChar w:fldCharType="begin"/>
-        </w:r>
-        <w:r>
-          <w:rPr>
-            <w:rFonts w:cs="TH Sarabun New"/>
-            <w:noProof/>
-            <w:webHidden/>
-            <w:szCs w:val="32"/>
-          </w:rPr>
-          <w:instrText xml:space="preserve"> PAGEREF _Toc244042494 \h </w:instrText>
+          <w:instrText xml:space="preserve"> PAGEREF _Toc244043554 \h </w:instrText>
         </w:r>
         <w:r>
           <w:rPr>
@@ -3150,7 +2615,7 @@
           <w14:ligatures w14:val="standardContextual"/>
         </w:rPr>
       </w:pPr>
-      <w:hyperlink w:anchor="_Toc244042495" w:history="1">
+      <w:hyperlink w:anchor="_Toc244043555" w:history="1">
         <w:r>
           <w:rPr>
             <w:rStyle w:val="Hyperlink"/>
@@ -3159,7 +2624,7 @@
             <w:szCs w:val="32"/>
             <w:cs/>
           </w:rPr>
-          <w:t>6. สรุปและแนวทางพัฒนาต่อ</w:t>
+          <w:t>5. กระบวนการทดสอบ</w:t>
         </w:r>
         <w:r>
           <w:rPr>
@@ -3186,185 +2651,7 @@
             <w:webHidden/>
             <w:szCs w:val="32"/>
           </w:rPr>
-          <w:instrText xml:space="preserve"> PAGEREF _Toc244042495 \h </w:instrText>
-        </w:r>
-        <w:r>
-          <w:rPr>
-            <w:rFonts w:cs="TH Sarabun New"/>
-            <w:noProof/>
-            <w:webHidden/>
-            <w:szCs w:val="32"/>
-          </w:rPr>
-        </w:r>
-        <w:r>
-          <w:rPr>
-            <w:rFonts w:cs="TH Sarabun New"/>
-            <w:noProof/>
-            <w:webHidden/>
-            <w:szCs w:val="32"/>
-          </w:rPr>
-          <w:fldChar w:fldCharType="separate"/>
-        </w:r>
-        <w:r>
-          <w:rPr>
-            <w:rFonts w:cs="TH Sarabun New"/>
-            <w:noProof/>
-            <w:webHidden/>
-            <w:szCs w:val="32"/>
-          </w:rPr>
-          <w:t>21</w:t>
-        </w:r>
-        <w:r>
-          <w:rPr>
-            <w:rFonts w:cs="TH Sarabun New"/>
-            <w:noProof/>
-            <w:webHidden/>
-            <w:szCs w:val="32"/>
-          </w:rPr>
-          <w:fldChar w:fldCharType="end"/>
-        </w:r>
-      </w:hyperlink>
-    </w:p>
-    <w:p>
-      <w:pPr>
-        <w:pStyle w:val="TOC2"/>
-        <w:tabs>
-          <w:tab w:val="right" w:leader="dot" w:pos="9016"/>
-        </w:tabs>
-        <w:rPr>
-          <w:rFonts w:eastAsiaTheme="minorEastAsia" w:cs="TH Sarabun New"/>
-          <w:noProof/>
-          <w:kern w:val="2"/>
-          <w:szCs w:val="32"/>
-          <w14:ligatures w14:val="standardContextual"/>
-        </w:rPr>
-      </w:pPr>
-      <w:hyperlink w:anchor="_Toc244042496" w:history="1">
-        <w:r>
-          <w:rPr>
-            <w:rStyle w:val="Hyperlink"/>
-            <w:rFonts w:cs="TH Sarabun New"/>
-            <w:noProof/>
-            <w:szCs w:val="32"/>
-            <w:cs/>
-          </w:rPr>
-          <w:t>6.1 สรุป</w:t>
-        </w:r>
-        <w:r>
-          <w:rPr>
-            <w:rFonts w:cs="TH Sarabun New"/>
-            <w:noProof/>
-            <w:webHidden/>
-            <w:szCs w:val="32"/>
-          </w:rPr>
-          <w:tab/>
-        </w:r>
-        <w:r>
-          <w:rPr>
-            <w:rFonts w:cs="TH Sarabun New"/>
-            <w:noProof/>
-            <w:webHidden/>
-            <w:szCs w:val="32"/>
-          </w:rPr>
-          <w:fldChar w:fldCharType="begin"/>
-        </w:r>
-        <w:r>
-          <w:rPr>
-            <w:rFonts w:cs="TH Sarabun New"/>
-            <w:noProof/>
-            <w:webHidden/>
-            <w:szCs w:val="32"/>
-          </w:rPr>
-          <w:instrText xml:space="preserve"> PAGEREF _Toc244042496 \h </w:instrText>
-        </w:r>
-        <w:r>
-          <w:rPr>
-            <w:rFonts w:cs="TH Sarabun New"/>
-            <w:noProof/>
-            <w:webHidden/>
-            <w:szCs w:val="32"/>
-          </w:rPr>
-        </w:r>
-        <w:r>
-          <w:rPr>
-            <w:rFonts w:cs="TH Sarabun New"/>
-            <w:noProof/>
-            <w:webHidden/>
-            <w:szCs w:val="32"/>
-          </w:rPr>
-          <w:fldChar w:fldCharType="separate"/>
-        </w:r>
-        <w:r>
-          <w:rPr>
-            <w:rFonts w:cs="TH Sarabun New"/>
-            <w:noProof/>
-            <w:webHidden/>
-            <w:szCs w:val="32"/>
-          </w:rPr>
-          <w:t>21</w:t>
-        </w:r>
-        <w:r>
-          <w:rPr>
-            <w:rFonts w:cs="TH Sarabun New"/>
-            <w:noProof/>
-            <w:webHidden/>
-            <w:szCs w:val="32"/>
-          </w:rPr>
-          <w:fldChar w:fldCharType="end"/>
-        </w:r>
-      </w:hyperlink>
-    </w:p>
-    <w:p>
-      <w:pPr>
-        <w:pStyle w:val="TOC2"/>
-        <w:tabs>
-          <w:tab w:val="right" w:leader="dot" w:pos="9016"/>
-        </w:tabs>
-        <w:rPr>
-          <w:rFonts w:eastAsiaTheme="minorEastAsia" w:cs="TH Sarabun New"/>
-          <w:noProof/>
-          <w:kern w:val="2"/>
-          <w:szCs w:val="32"/>
-          <w14:ligatures w14:val="standardContextual"/>
-        </w:rPr>
-      </w:pPr>
-      <w:hyperlink w:anchor="_Toc244042497" w:history="1">
-        <w:r>
-          <w:rPr>
-            <w:rStyle w:val="Hyperlink"/>
-            <w:rFonts w:cs="TH Sarabun New"/>
-            <w:noProof/>
-            <w:szCs w:val="32"/>
-            <w:cs/>
-          </w:rPr>
-          <w:t>6.2 ข้อจำกัด</w:t>
-        </w:r>
-        <w:r>
-          <w:rPr>
-            <w:rFonts w:cs="TH Sarabun New"/>
-            <w:noProof/>
-            <w:webHidden/>
-            <w:szCs w:val="32"/>
-          </w:rPr>
-          <w:tab/>
-        </w:r>
-        <w:r>
-          <w:rPr>
-            <w:rFonts w:cs="TH Sarabun New"/>
-            <w:noProof/>
-            <w:webHidden/>
-            <w:szCs w:val="32"/>
-          </w:rPr>
-          <w:fldChar w:fldCharType="begin"/>
-        </w:r>
-        <w:r>
-          <w:rPr>
-            <w:rFonts w:cs="TH Sarabun New"/>
-            <w:noProof/>
-            <w:webHidden/>
-            <w:szCs w:val="32"/>
-          </w:rPr>
-          <w:instrText xml:space="preserve"> PAGEREF _Toc244042497 \h </w:instrText>
+          <w:instrText xml:space="preserve"> PAGEREF _Toc244043555 \h </w:instrText>
         </w:r>
         <w:r>
           <w:rPr>
@@ -3417,7 +2704,7 @@
           <w14:ligatures w14:val="standardContextual"/>
         </w:rPr>
       </w:pPr>
-      <w:hyperlink w:anchor="_Toc244042498" w:history="1">
+      <w:hyperlink w:anchor="_Toc244043556" w:history="1">
         <w:r>
           <w:rPr>
             <w:rStyle w:val="Hyperlink"/>
@@ -3426,7 +2713,7 @@
             <w:szCs w:val="32"/>
             <w:cs/>
           </w:rPr>
-          <w:t>6.3 แนวทางพัฒนาต่อ</w:t>
+          <w:t>5.1 แนวทางการทดสอบ</w:t>
         </w:r>
         <w:r>
           <w:rPr>
@@ -3453,7 +2740,7 @@
             <w:webHidden/>
             <w:szCs w:val="32"/>
           </w:rPr>
-          <w:instrText xml:space="preserve"> PAGEREF _Toc244042498 \h </w:instrText>
+          <w:instrText xml:space="preserve"> PAGEREF _Toc244043556 \h </w:instrText>
         </w:r>
         <w:r>
           <w:rPr>
@@ -3494,7 +2781,7 @@
     </w:p>
     <w:p>
       <w:pPr>
-        <w:pStyle w:val="TOC1"/>
+        <w:pStyle w:val="TOC2"/>
         <w:tabs>
           <w:tab w:val="right" w:leader="dot" w:pos="9016"/>
         </w:tabs>
@@ -3506,7 +2793,7 @@
           <w14:ligatures w14:val="standardContextual"/>
         </w:rPr>
       </w:pPr>
-      <w:hyperlink w:anchor="_Toc244042499" w:history="1">
+      <w:hyperlink w:anchor="_Toc244043557" w:history="1">
         <w:r>
           <w:rPr>
             <w:rStyle w:val="Hyperlink"/>
@@ -3515,7 +2802,7 @@
             <w:szCs w:val="32"/>
             <w:cs/>
           </w:rPr>
-          <w:t>ภาคผนวก ก ตารางขาบอร์ด 1 และบอร์ด 2</w:t>
+          <w:t>5.2 ผลการทดสอบด้วยเครื่องมือ</w:t>
         </w:r>
         <w:r>
           <w:rPr>
@@ -3542,7 +2829,7 @@
             <w:webHidden/>
             <w:szCs w:val="32"/>
           </w:rPr>
-          <w:instrText xml:space="preserve"> PAGEREF _Toc244042499 \h </w:instrText>
+          <w:instrText xml:space="preserve"> PAGEREF _Toc244043557 \h </w:instrText>
         </w:r>
         <w:r>
           <w:rPr>
@@ -3583,7 +2870,7 @@
     </w:p>
     <w:p>
       <w:pPr>
-        <w:pStyle w:val="TOC1"/>
+        <w:pStyle w:val="TOC2"/>
         <w:tabs>
           <w:tab w:val="right" w:leader="dot" w:pos="9016"/>
         </w:tabs>
@@ -3595,7 +2882,7 @@
           <w14:ligatures w14:val="standardContextual"/>
         </w:rPr>
       </w:pPr>
-      <w:hyperlink w:anchor="_Toc244042500" w:history="1">
+      <w:hyperlink w:anchor="_Toc244043558" w:history="1">
         <w:r>
           <w:rPr>
             <w:rStyle w:val="Hyperlink"/>
@@ -3604,7 +2891,7 @@
             <w:szCs w:val="32"/>
             <w:cs/>
           </w:rPr>
-          <w:t>ภาคผนวก ข รายการหนังสือและไฟล์ในโครงงาน</w:t>
+          <w:t>5.3 ผลการทดสอบบนบอร์ดที่ยืนยันแล้ว</w:t>
         </w:r>
         <w:r>
           <w:rPr>
@@ -3631,7 +2918,96 @@
             <w:webHidden/>
             <w:szCs w:val="32"/>
           </w:rPr>
-          <w:instrText xml:space="preserve"> PAGEREF _Toc244042500 \h </w:instrText>
+          <w:instrText xml:space="preserve"> PAGEREF _Toc244043558 \h </w:instrText>
+        </w:r>
+        <w:r>
+          <w:rPr>
+            <w:rFonts w:cs="TH Sarabun New"/>
+            <w:noProof/>
+            <w:webHidden/>
+            <w:szCs w:val="32"/>
+          </w:rPr>
+        </w:r>
+        <w:r>
+          <w:rPr>
+            <w:rFonts w:cs="TH Sarabun New"/>
+            <w:noProof/>
+            <w:webHidden/>
+            <w:szCs w:val="32"/>
+          </w:rPr>
+          <w:fldChar w:fldCharType="separate"/>
+        </w:r>
+        <w:r>
+          <w:rPr>
+            <w:rFonts w:cs="TH Sarabun New"/>
+            <w:noProof/>
+            <w:webHidden/>
+            <w:szCs w:val="32"/>
+          </w:rPr>
+          <w:t>22</w:t>
+        </w:r>
+        <w:r>
+          <w:rPr>
+            <w:rFonts w:cs="TH Sarabun New"/>
+            <w:noProof/>
+            <w:webHidden/>
+            <w:szCs w:val="32"/>
+          </w:rPr>
+          <w:fldChar w:fldCharType="end"/>
+        </w:r>
+      </w:hyperlink>
+    </w:p>
+    <w:p>
+      <w:pPr>
+        <w:pStyle w:val="TOC2"/>
+        <w:tabs>
+          <w:tab w:val="right" w:leader="dot" w:pos="9016"/>
+        </w:tabs>
+        <w:rPr>
+          <w:rFonts w:eastAsiaTheme="minorEastAsia" w:cs="TH Sarabun New"/>
+          <w:noProof/>
+          <w:kern w:val="2"/>
+          <w:szCs w:val="32"/>
+          <w14:ligatures w14:val="standardContextual"/>
+        </w:rPr>
+      </w:pPr>
+      <w:hyperlink w:anchor="_Toc244043559" w:history="1">
+        <w:r>
+          <w:rPr>
+            <w:rStyle w:val="Hyperlink"/>
+            <w:rFonts w:cs="TH Sarabun New"/>
+            <w:noProof/>
+            <w:szCs w:val="32"/>
+            <w:cs/>
+          </w:rPr>
+          <w:t>5.4 ตารางทดสอบรวมระบบ</w:t>
+        </w:r>
+        <w:r>
+          <w:rPr>
+            <w:rFonts w:cs="TH Sarabun New"/>
+            <w:noProof/>
+            <w:webHidden/>
+            <w:szCs w:val="32"/>
+          </w:rPr>
+          <w:tab/>
+        </w:r>
+        <w:r>
+          <w:rPr>
+            <w:rFonts w:cs="TH Sarabun New"/>
+            <w:noProof/>
+            <w:webHidden/>
+            <w:szCs w:val="32"/>
+          </w:rPr>
+          <w:fldChar w:fldCharType="begin"/>
+        </w:r>
+        <w:r>
+          <w:rPr>
+            <w:rFonts w:cs="TH Sarabun New"/>
+            <w:noProof/>
+            <w:webHidden/>
+            <w:szCs w:val="32"/>
+          </w:rPr>
+          <w:instrText xml:space="preserve"> PAGEREF _Toc244043559 \h </w:instrText>
         </w:r>
         <w:r>
           <w:rPr>
@@ -3671,25 +3047,643 @@
       </w:hyperlink>
     </w:p>
     <w:p>
-      <w:r>
-        <w:fldChar w:fldCharType="end"/>
-      </w:r>
+      <w:pPr>
+        <w:pStyle w:val="TOC2"/>
+        <w:tabs>
+          <w:tab w:val="right" w:leader="dot" w:pos="9016"/>
+        </w:tabs>
+        <w:rPr>
+          <w:rFonts w:eastAsiaTheme="minorEastAsia" w:cs="TH Sarabun New"/>
+          <w:noProof/>
+          <w:kern w:val="2"/>
+          <w:szCs w:val="32"/>
+          <w14:ligatures w14:val="standardContextual"/>
+        </w:rPr>
+      </w:pPr>
+      <w:hyperlink w:anchor="_Toc244043560" w:history="1">
+        <w:r>
+          <w:rPr>
+            <w:rStyle w:val="Hyperlink"/>
+            <w:rFonts w:cs="TH Sarabun New"/>
+            <w:noProof/>
+            <w:szCs w:val="32"/>
+            <w:cs/>
+          </w:rPr>
+          <w:t>5.5 ค่าที่ต้องปรับเทียบก่อนนำเสนอ</w:t>
+        </w:r>
+        <w:r>
+          <w:rPr>
+            <w:rFonts w:cs="TH Sarabun New"/>
+            <w:noProof/>
+            <w:webHidden/>
+            <w:szCs w:val="32"/>
+          </w:rPr>
+          <w:tab/>
+        </w:r>
+        <w:r>
+          <w:rPr>
+            <w:rFonts w:cs="TH Sarabun New"/>
+            <w:noProof/>
+            <w:webHidden/>
+            <w:szCs w:val="32"/>
+          </w:rPr>
+          <w:fldChar w:fldCharType="begin"/>
+        </w:r>
+        <w:r>
+          <w:rPr>
+            <w:rFonts w:cs="TH Sarabun New"/>
+            <w:noProof/>
+            <w:webHidden/>
+            <w:szCs w:val="32"/>
+          </w:rPr>
+          <w:instrText xml:space="preserve"> PAGEREF _Toc244043560 \h </w:instrText>
+        </w:r>
+        <w:r>
+          <w:rPr>
+            <w:rFonts w:cs="TH Sarabun New"/>
+            <w:noProof/>
+            <w:webHidden/>
+            <w:szCs w:val="32"/>
+          </w:rPr>
+        </w:r>
+        <w:r>
+          <w:rPr>
+            <w:rFonts w:cs="TH Sarabun New"/>
+            <w:noProof/>
+            <w:webHidden/>
+            <w:szCs w:val="32"/>
+          </w:rPr>
+          <w:fldChar w:fldCharType="separate"/>
+        </w:r>
+        <w:r>
+          <w:rPr>
+            <w:rFonts w:cs="TH Sarabun New"/>
+            <w:noProof/>
+            <w:webHidden/>
+            <w:szCs w:val="32"/>
+          </w:rPr>
+          <w:t>23</w:t>
+        </w:r>
+        <w:r>
+          <w:rPr>
+            <w:rFonts w:cs="TH Sarabun New"/>
+            <w:noProof/>
+            <w:webHidden/>
+            <w:szCs w:val="32"/>
+          </w:rPr>
+          <w:fldChar w:fldCharType="end"/>
+        </w:r>
+      </w:hyperlink>
     </w:p>
     <w:p>
-      <w:r>
-        <w:br w:type="page"/>
+      <w:pPr>
+        <w:pStyle w:val="TOC1"/>
+        <w:tabs>
+          <w:tab w:val="right" w:leader="dot" w:pos="9016"/>
+        </w:tabs>
+        <w:rPr>
+          <w:rFonts w:eastAsiaTheme="minorEastAsia" w:cs="TH Sarabun New"/>
+          <w:noProof/>
+          <w:kern w:val="2"/>
+          <w:szCs w:val="32"/>
+          <w14:ligatures w14:val="standardContextual"/>
+        </w:rPr>
+      </w:pPr>
+      <w:hyperlink w:anchor="_Toc244043561" w:history="1">
+        <w:r>
+          <w:rPr>
+            <w:rStyle w:val="Hyperlink"/>
+            <w:rFonts w:cs="TH Sarabun New"/>
+            <w:noProof/>
+            <w:szCs w:val="32"/>
+            <w:cs/>
+          </w:rPr>
+          <w:t>6. สรุปและแนวทางพัฒนาต่อ</w:t>
+        </w:r>
+        <w:r>
+          <w:rPr>
+            <w:rFonts w:cs="TH Sarabun New"/>
+            <w:noProof/>
+            <w:webHidden/>
+            <w:szCs w:val="32"/>
+          </w:rPr>
+          <w:tab/>
+        </w:r>
+        <w:r>
+          <w:rPr>
+            <w:rFonts w:cs="TH Sarabun New"/>
+            <w:noProof/>
+            <w:webHidden/>
+            <w:szCs w:val="32"/>
+          </w:rPr>
+          <w:fldChar w:fldCharType="begin"/>
+        </w:r>
+        <w:r>
+          <w:rPr>
+            <w:rFonts w:cs="TH Sarabun New"/>
+            <w:noProof/>
+            <w:webHidden/>
+            <w:szCs w:val="32"/>
+          </w:rPr>
+          <w:instrText xml:space="preserve"> PAGEREF _Toc244043561 \h </w:instrText>
+        </w:r>
+        <w:r>
+          <w:rPr>
+            <w:rFonts w:cs="TH Sarabun New"/>
+            <w:noProof/>
+            <w:webHidden/>
+            <w:szCs w:val="32"/>
+          </w:rPr>
+        </w:r>
+        <w:r>
+          <w:rPr>
+            <w:rFonts w:cs="TH Sarabun New"/>
+            <w:noProof/>
+            <w:webHidden/>
+            <w:szCs w:val="32"/>
+          </w:rPr>
+          <w:fldChar w:fldCharType="separate"/>
+        </w:r>
+        <w:r>
+          <w:rPr>
+            <w:rFonts w:cs="TH Sarabun New"/>
+            <w:noProof/>
+            <w:webHidden/>
+            <w:szCs w:val="32"/>
+          </w:rPr>
+          <w:t>24</w:t>
+        </w:r>
+        <w:r>
+          <w:rPr>
+            <w:rFonts w:cs="TH Sarabun New"/>
+            <w:noProof/>
+            <w:webHidden/>
+            <w:szCs w:val="32"/>
+          </w:rPr>
+          <w:fldChar w:fldCharType="end"/>
+        </w:r>
+      </w:hyperlink>
+    </w:p>
+    <w:p>
+      <w:pPr>
+        <w:pStyle w:val="TOC2"/>
+        <w:tabs>
+          <w:tab w:val="right" w:leader="dot" w:pos="9016"/>
+        </w:tabs>
+        <w:rPr>
+          <w:rFonts w:eastAsiaTheme="minorEastAsia" w:cs="TH Sarabun New"/>
+          <w:noProof/>
+          <w:kern w:val="2"/>
+          <w:szCs w:val="32"/>
+          <w14:ligatures w14:val="standardContextual"/>
+        </w:rPr>
+      </w:pPr>
+      <w:hyperlink w:anchor="_Toc244043562" w:history="1">
+        <w:r>
+          <w:rPr>
+            <w:rStyle w:val="Hyperlink"/>
+            <w:rFonts w:cs="TH Sarabun New"/>
+            <w:noProof/>
+            <w:szCs w:val="32"/>
+            <w:cs/>
+          </w:rPr>
+          <w:t>6.1 สรุป</w:t>
+        </w:r>
+        <w:r>
+          <w:rPr>
+            <w:rFonts w:cs="TH Sarabun New"/>
+            <w:noProof/>
+            <w:webHidden/>
+            <w:szCs w:val="32"/>
+          </w:rPr>
+          <w:tab/>
+        </w:r>
+        <w:r>
+          <w:rPr>
+            <w:rFonts w:cs="TH Sarabun New"/>
+            <w:noProof/>
+            <w:webHidden/>
+            <w:szCs w:val="32"/>
+          </w:rPr>
+          <w:fldChar w:fldCharType="begin"/>
+        </w:r>
+        <w:r>
+          <w:rPr>
+            <w:rFonts w:cs="TH Sarabun New"/>
+            <w:noProof/>
+            <w:webHidden/>
+            <w:szCs w:val="32"/>
+          </w:rPr>
+          <w:instrText xml:space="preserve"> PAGEREF _Toc244043562 \h </w:instrText>
+        </w:r>
+        <w:r>
+          <w:rPr>
+            <w:rFonts w:cs="TH Sarabun New"/>
+            <w:noProof/>
+            <w:webHidden/>
+            <w:szCs w:val="32"/>
+          </w:rPr>
+        </w:r>
+        <w:r>
+          <w:rPr>
+            <w:rFonts w:cs="TH Sarabun New"/>
+            <w:noProof/>
+            <w:webHidden/>
+            <w:szCs w:val="32"/>
+          </w:rPr>
+          <w:fldChar w:fldCharType="separate"/>
+        </w:r>
+        <w:r>
+          <w:rPr>
+            <w:rFonts w:cs="TH Sarabun New"/>
+            <w:noProof/>
+            <w:webHidden/>
+            <w:szCs w:val="32"/>
+          </w:rPr>
+          <w:t>24</w:t>
+        </w:r>
+        <w:r>
+          <w:rPr>
+            <w:rFonts w:cs="TH Sarabun New"/>
+            <w:noProof/>
+            <w:webHidden/>
+            <w:szCs w:val="32"/>
+          </w:rPr>
+          <w:fldChar w:fldCharType="end"/>
+        </w:r>
+      </w:hyperlink>
+    </w:p>
+    <w:p>
+      <w:pPr>
+        <w:pStyle w:val="TOC2"/>
+        <w:tabs>
+          <w:tab w:val="right" w:leader="dot" w:pos="9016"/>
+        </w:tabs>
+        <w:rPr>
+          <w:rFonts w:eastAsiaTheme="minorEastAsia" w:cs="TH Sarabun New"/>
+          <w:noProof/>
+          <w:kern w:val="2"/>
+          <w:szCs w:val="32"/>
+          <w14:ligatures w14:val="standardContextual"/>
+        </w:rPr>
+      </w:pPr>
+      <w:hyperlink w:anchor="_Toc244043563" w:history="1">
+        <w:r>
+          <w:rPr>
+            <w:rStyle w:val="Hyperlink"/>
+            <w:rFonts w:cs="TH Sarabun New"/>
+            <w:noProof/>
+            <w:szCs w:val="32"/>
+            <w:cs/>
+          </w:rPr>
+          <w:t>6.2 ข้อจำกัด</w:t>
+        </w:r>
+        <w:r>
+          <w:rPr>
+            <w:rFonts w:cs="TH Sarabun New"/>
+            <w:noProof/>
+            <w:webHidden/>
+            <w:szCs w:val="32"/>
+          </w:rPr>
+          <w:tab/>
+        </w:r>
+        <w:r>
+          <w:rPr>
+            <w:rFonts w:cs="TH Sarabun New"/>
+            <w:noProof/>
+            <w:webHidden/>
+            <w:szCs w:val="32"/>
+          </w:rPr>
+          <w:fldChar w:fldCharType="begin"/>
+        </w:r>
+        <w:r>
+          <w:rPr>
+            <w:rFonts w:cs="TH Sarabun New"/>
+            <w:noProof/>
+            <w:webHidden/>
+            <w:szCs w:val="32"/>
+          </w:rPr>
+          <w:instrText xml:space="preserve"> PAGEREF _Toc244043563 \h </w:instrText>
+        </w:r>
+        <w:r>
+          <w:rPr>
+            <w:rFonts w:cs="TH Sarabun New"/>
+            <w:noProof/>
+            <w:webHidden/>
+            <w:szCs w:val="32"/>
+          </w:rPr>
+        </w:r>
+        <w:r>
+          <w:rPr>
+            <w:rFonts w:cs="TH Sarabun New"/>
+            <w:noProof/>
+            <w:webHidden/>
+            <w:szCs w:val="32"/>
+          </w:rPr>
+          <w:fldChar w:fldCharType="separate"/>
+        </w:r>
+        <w:r>
+          <w:rPr>
+            <w:rFonts w:cs="TH Sarabun New"/>
+            <w:noProof/>
+            <w:webHidden/>
+            <w:szCs w:val="32"/>
+          </w:rPr>
+          <w:t>24</w:t>
+        </w:r>
+        <w:r>
+          <w:rPr>
+            <w:rFonts w:cs="TH Sarabun New"/>
+            <w:noProof/>
+            <w:webHidden/>
+            <w:szCs w:val="32"/>
+          </w:rPr>
+          <w:fldChar w:fldCharType="end"/>
+        </w:r>
+      </w:hyperlink>
+    </w:p>
+    <w:p>
+      <w:pPr>
+        <w:pStyle w:val="TOC2"/>
+        <w:tabs>
+          <w:tab w:val="right" w:leader="dot" w:pos="9016"/>
+        </w:tabs>
+        <w:rPr>
+          <w:rFonts w:eastAsiaTheme="minorEastAsia" w:cs="TH Sarabun New"/>
+          <w:noProof/>
+          <w:kern w:val="2"/>
+          <w:szCs w:val="32"/>
+          <w14:ligatures w14:val="standardContextual"/>
+        </w:rPr>
+      </w:pPr>
+      <w:hyperlink w:anchor="_Toc244043564" w:history="1">
+        <w:r>
+          <w:rPr>
+            <w:rStyle w:val="Hyperlink"/>
+            <w:rFonts w:cs="TH Sarabun New"/>
+            <w:noProof/>
+            <w:szCs w:val="32"/>
+            <w:cs/>
+          </w:rPr>
+          <w:t>6.3 แนวทางพัฒนาต่อ</w:t>
+        </w:r>
+        <w:r>
+          <w:rPr>
+            <w:rFonts w:cs="TH Sarabun New"/>
+            <w:noProof/>
+            <w:webHidden/>
+            <w:szCs w:val="32"/>
+          </w:rPr>
+          <w:tab/>
+        </w:r>
+        <w:r>
+          <w:rPr>
+            <w:rFonts w:cs="TH Sarabun New"/>
+            <w:noProof/>
+            <w:webHidden/>
+            <w:szCs w:val="32"/>
+          </w:rPr>
+          <w:fldChar w:fldCharType="begin"/>
+        </w:r>
+        <w:r>
+          <w:rPr>
+            <w:rFonts w:cs="TH Sarabun New"/>
+            <w:noProof/>
+            <w:webHidden/>
+            <w:szCs w:val="32"/>
+          </w:rPr>
+          <w:instrText xml:space="preserve"> PAGEREF _Toc244043564 \h </w:instrText>
+        </w:r>
+        <w:r>
+          <w:rPr>
+            <w:rFonts w:cs="TH Sarabun New"/>
+            <w:noProof/>
+            <w:webHidden/>
+            <w:szCs w:val="32"/>
+          </w:rPr>
+        </w:r>
+        <w:r>
+          <w:rPr>
+            <w:rFonts w:cs="TH Sarabun New"/>
+            <w:noProof/>
+            <w:webHidden/>
+            <w:szCs w:val="32"/>
+          </w:rPr>
+          <w:fldChar w:fldCharType="separate"/>
+        </w:r>
+        <w:r>
+          <w:rPr>
+            <w:rFonts w:cs="TH Sarabun New"/>
+            <w:noProof/>
+            <w:webHidden/>
+            <w:szCs w:val="32"/>
+          </w:rPr>
+          <w:t>24</w:t>
+        </w:r>
+        <w:r>
+          <w:rPr>
+            <w:rFonts w:cs="TH Sarabun New"/>
+            <w:noProof/>
+            <w:webHidden/>
+            <w:szCs w:val="32"/>
+          </w:rPr>
+          <w:fldChar w:fldCharType="end"/>
+        </w:r>
+      </w:hyperlink>
+    </w:p>
+    <w:p>
+      <w:pPr>
+        <w:pStyle w:val="TOC1"/>
+        <w:tabs>
+          <w:tab w:val="right" w:leader="dot" w:pos="9016"/>
+        </w:tabs>
+        <w:rPr>
+          <w:rFonts w:eastAsiaTheme="minorEastAsia" w:cs="TH Sarabun New"/>
+          <w:noProof/>
+          <w:kern w:val="2"/>
+          <w:szCs w:val="32"/>
+          <w14:ligatures w14:val="standardContextual"/>
+        </w:rPr>
+      </w:pPr>
+      <w:hyperlink w:anchor="_Toc244043565" w:history="1">
+        <w:r>
+          <w:rPr>
+            <w:rStyle w:val="Hyperlink"/>
+            <w:rFonts w:cs="TH Sarabun New"/>
+            <w:noProof/>
+            <w:szCs w:val="32"/>
+            <w:cs/>
+          </w:rPr>
+          <w:t>ภาคผนวก ก ตารางขาบอร์ด 1 และบอร์ด 2</w:t>
+        </w:r>
+        <w:r>
+          <w:rPr>
+            <w:rFonts w:cs="TH Sarabun New"/>
+            <w:noProof/>
+            <w:webHidden/>
+            <w:szCs w:val="32"/>
+          </w:rPr>
+          <w:tab/>
+        </w:r>
+        <w:r>
+          <w:rPr>
+            <w:rFonts w:cs="TH Sarabun New"/>
+            <w:noProof/>
+            <w:webHidden/>
+            <w:szCs w:val="32"/>
+          </w:rPr>
+          <w:fldChar w:fldCharType="begin"/>
+        </w:r>
+        <w:r>
+          <w:rPr>
+            <w:rFonts w:cs="TH Sarabun New"/>
+            <w:noProof/>
+            <w:webHidden/>
+            <w:szCs w:val="32"/>
+          </w:rPr>
+          <w:instrText xml:space="preserve"> PAGEREF _Toc244043565 \h </w:instrText>
+        </w:r>
+        <w:r>
+          <w:rPr>
+            <w:rFonts w:cs="TH Sarabun New"/>
+            <w:noProof/>
+            <w:webHidden/>
+            <w:szCs w:val="32"/>
+          </w:rPr>
+        </w:r>
+        <w:r>
+          <w:rPr>
+            <w:rFonts w:cs="TH Sarabun New"/>
+            <w:noProof/>
+            <w:webHidden/>
+            <w:szCs w:val="32"/>
+          </w:rPr>
+          <w:fldChar w:fldCharType="separate"/>
+        </w:r>
+        <w:r>
+          <w:rPr>
+            <w:rFonts w:cs="TH Sarabun New"/>
+            <w:noProof/>
+            <w:webHidden/>
+            <w:szCs w:val="32"/>
+          </w:rPr>
+          <w:t>25</w:t>
+        </w:r>
+        <w:r>
+          <w:rPr>
+            <w:rFonts w:cs="TH Sarabun New"/>
+            <w:noProof/>
+            <w:webHidden/>
+            <w:szCs w:val="32"/>
+          </w:rPr>
+          <w:fldChar w:fldCharType="end"/>
+        </w:r>
+      </w:hyperlink>
+    </w:p>
+    <w:p>
+      <w:pPr>
+        <w:pStyle w:val="TOC1"/>
+        <w:tabs>
+          <w:tab w:val="right" w:leader="dot" w:pos="9016"/>
+        </w:tabs>
+        <w:rPr>
+          <w:rFonts w:eastAsiaTheme="minorEastAsia" w:cs="TH Sarabun New"/>
+          <w:noProof/>
+          <w:kern w:val="2"/>
+          <w:szCs w:val="32"/>
+          <w14:ligatures w14:val="standardContextual"/>
+        </w:rPr>
+      </w:pPr>
+      <w:hyperlink w:anchor="_Toc244043566" w:history="1">
+        <w:r>
+          <w:rPr>
+            <w:rStyle w:val="Hyperlink"/>
+            <w:rFonts w:cs="TH Sarabun New"/>
+            <w:noProof/>
+            <w:szCs w:val="32"/>
+            <w:cs/>
+          </w:rPr>
+          <w:t>ภาคผนวก ข รายการหนังสือและไฟล์ในโครงงาน</w:t>
+        </w:r>
+        <w:r>
+          <w:rPr>
+            <w:rFonts w:cs="TH Sarabun New"/>
+            <w:noProof/>
+            <w:webHidden/>
+            <w:szCs w:val="32"/>
+          </w:rPr>
+          <w:tab/>
+        </w:r>
+        <w:r>
+          <w:rPr>
+            <w:rFonts w:cs="TH Sarabun New"/>
+            <w:noProof/>
+            <w:webHidden/>
+            <w:szCs w:val="32"/>
+          </w:rPr>
+          <w:fldChar w:fldCharType="begin"/>
+        </w:r>
+        <w:r>
+          <w:rPr>
+            <w:rFonts w:cs="TH Sarabun New"/>
+            <w:noProof/>
+            <w:webHidden/>
+            <w:szCs w:val="32"/>
+          </w:rPr>
+          <w:instrText xml:space="preserve"> PAGEREF _Toc244043566 \h </w:instrText>
+        </w:r>
+        <w:r>
+          <w:rPr>
+            <w:rFonts w:cs="TH Sarabun New"/>
+            <w:noProof/>
+            <w:webHidden/>
+            <w:szCs w:val="32"/>
+          </w:rPr>
+        </w:r>
+        <w:r>
+          <w:rPr>
+            <w:rFonts w:cs="TH Sarabun New"/>
+            <w:noProof/>
+            <w:webHidden/>
+            <w:szCs w:val="32"/>
+          </w:rPr>
+          <w:fldChar w:fldCharType="separate"/>
+        </w:r>
+        <w:r>
+          <w:rPr>
+            <w:rFonts w:cs="TH Sarabun New"/>
+            <w:noProof/>
+            <w:webHidden/>
+            <w:szCs w:val="32"/>
+          </w:rPr>
+          <w:t>26</w:t>
+        </w:r>
+        <w:r>
+          <w:rPr>
+            <w:rFonts w:cs="TH Sarabun New"/>
+            <w:noProof/>
+            <w:webHidden/>
+            <w:szCs w:val="32"/>
+          </w:rPr>
+          <w:fldChar w:fldCharType="end"/>
+        </w:r>
+      </w:hyperlink>
+    </w:p>
+    <w:p>
+      <w:r>
+        <w:fldChar w:fldCharType="end"/>
       </w:r>
     </w:p>
     <w:p>
       <w:pPr>
         <w:pStyle w:val="Heading1"/>
+        <w:pageBreakBefore/>
       </w:pPr>
-      <w:bookmarkStart w:id="0" w:name="_Toc244042465"/>
-      <w:r>
-        <w:rPr>
-          <w:cs/>
-        </w:rPr>
-        <w:lastRenderedPageBreak/>
+      <w:bookmarkStart w:id="0" w:name="_Toc244043531"/>
+      <w:r>
+        <w:rPr>
+          <w:cs/>
+        </w:rPr>
         <w:t>1. ภาพรวมชิ้นงาน</w:t>
       </w:r>
       <w:bookmarkEnd w:id="0"/>
@@ -3698,7 +3692,7 @@
       <w:pPr>
         <w:pStyle w:val="Heading2"/>
       </w:pPr>
-      <w:bookmarkStart w:id="1" w:name="_Toc244042466"/>
+      <w:bookmarkStart w:id="1" w:name="_Toc244043532"/>
       <w:r>
         <w:rPr>
           <w:cs/>
@@ -3785,7 +3779,7 @@
       <w:pPr>
         <w:pStyle w:val="Heading2"/>
       </w:pPr>
-      <w:bookmarkStart w:id="2" w:name="_Toc244042467"/>
+      <w:bookmarkStart w:id="2" w:name="_Toc244043533"/>
       <w:r>
         <w:rPr>
           <w:cs/>
@@ -4483,7 +4477,7 @@
       <w:pPr>
         <w:pStyle w:val="Heading2"/>
       </w:pPr>
-      <w:bookmarkStart w:id="3" w:name="_Toc244042468"/>
+      <w:bookmarkStart w:id="3" w:name="_Toc244043534"/>
       <w:r>
         <w:rPr>
           <w:cs/>
@@ -4534,12 +4528,11 @@
       <w:pPr>
         <w:pStyle w:val="Heading2"/>
       </w:pPr>
-      <w:bookmarkStart w:id="4" w:name="_Toc244042469"/>
-      <w:r>
-        <w:rPr>
-          <w:cs/>
-        </w:rPr>
-        <w:lastRenderedPageBreak/>
+      <w:bookmarkStart w:id="4" w:name="_Toc244043535"/>
+      <w:r>
+        <w:rPr>
+          <w:cs/>
+        </w:rPr>
         <w:t>1.4 ข้อกำหนดของงานและการออกแบบให้สอดคล้อง</w:t>
       </w:r>
       <w:bookmarkEnd w:id="4"/>
@@ -4953,8 +4946,9 @@
     <w:p>
       <w:pPr>
         <w:pStyle w:val="Heading1"/>
+        <w:pageBreakBefore/>
       </w:pPr>
-      <w:bookmarkStart w:id="5" w:name="_Toc244042470"/>
+      <w:bookmarkStart w:id="5" w:name="_Toc244043536"/>
       <w:r>
         <w:rPr>
           <w:cs/>
@@ -4989,12 +4983,11 @@
       <w:pPr>
         <w:pStyle w:val="Heading2"/>
       </w:pPr>
-      <w:bookmarkStart w:id="6" w:name="_Toc244042471"/>
-      <w:r>
-        <w:rPr>
-          <w:cs/>
-        </w:rPr>
-        <w:lastRenderedPageBreak/>
+      <w:bookmarkStart w:id="6" w:name="_Toc244043537"/>
+      <w:r>
+        <w:rPr>
+          <w:cs/>
+        </w:rPr>
         <w:t>2.1 แหล่งข้อมูลที่ใช้</w:t>
       </w:r>
       <w:bookmarkEnd w:id="6"/>
@@ -5949,7 +5942,7 @@
       <w:pPr>
         <w:pStyle w:val="Heading2"/>
       </w:pPr>
-      <w:bookmarkStart w:id="7" w:name="_Toc244042472"/>
+      <w:bookmarkStart w:id="7" w:name="_Toc244043538"/>
       <w:r>
         <w:rPr>
           <w:cs/>
@@ -5960,6 +5953,7 @@
     </w:p>
     <w:p>
       <w:pPr>
+        <w:keepNext/>
         <w:spacing w:after="80"/>
         <w:ind w:firstLine="709"/>
         <w:jc w:val="thaiDistribute"/>
@@ -5984,7 +5978,6 @@
           <w:szCs w:val="30"/>
           <w:cs/>
         </w:rPr>
-        <w:lastRenderedPageBreak/>
         <w:t xml:space="preserve">ตารางที่ 4 </w:t>
       </w:r>
       <w:r>
@@ -7181,7 +7174,7 @@
       <w:pPr>
         <w:pStyle w:val="Heading2"/>
       </w:pPr>
-      <w:bookmarkStart w:id="8" w:name="_Toc244042473"/>
+      <w:bookmarkStart w:id="8" w:name="_Toc244043539"/>
       <w:r>
         <w:rPr>
           <w:cs/>
@@ -7403,7 +7396,6 @@
         <w:ind w:left="1077" w:hanging="369"/>
       </w:pPr>
       <w:r>
-        <w:lastRenderedPageBreak/>
         <w:t>6.</w:t>
       </w:r>
       <w:r>
@@ -7458,8 +7450,9 @@
     <w:p>
       <w:pPr>
         <w:pStyle w:val="Heading1"/>
+        <w:pageBreakBefore/>
       </w:pPr>
-      <w:bookmarkStart w:id="9" w:name="_Toc244042474"/>
+      <w:bookmarkStart w:id="9" w:name="_Toc244043540"/>
       <w:r>
         <w:rPr>
           <w:cs/>
@@ -7475,7 +7468,7 @@
       <w:pPr>
         <w:pStyle w:val="Heading2"/>
       </w:pPr>
-      <w:bookmarkStart w:id="10" w:name="_Toc244042475"/>
+      <w:bookmarkStart w:id="10" w:name="_Toc244043541"/>
       <w:r>
         <w:rPr>
           <w:cs/>
@@ -7489,6 +7482,7 @@
     </w:p>
     <w:p>
       <w:pPr>
+        <w:keepNext/>
         <w:spacing w:after="80"/>
         <w:ind w:firstLine="709"/>
         <w:jc w:val="thaiDistribute"/>
@@ -7974,9 +7968,8 @@
         <w:rPr>
           <w:noProof/>
         </w:rPr>
-        <w:lastRenderedPageBreak/>
         <w:drawing>
-          <wp:inline distT="0" distB="0" distL="0" distR="0" wp14:anchorId="4D632948" wp14:editId="70339E46">
+          <wp:inline distT="0" distB="0" distL="0" distR="0" wp14:anchorId="5BB0385E" wp14:editId="126F449E">
             <wp:extent cx="5760000" cy="3168000"/>
             <wp:effectExtent l="0" t="0" r="0" b="0"/>
             <wp:docPr id="1" name="Picture 1"/>
@@ -8062,7 +8055,7 @@
       <w:pPr>
         <w:pStyle w:val="Heading2"/>
       </w:pPr>
-      <w:bookmarkStart w:id="11" w:name="_Toc244042476"/>
+      <w:bookmarkStart w:id="11" w:name="_Toc244043542"/>
       <w:r>
         <w:t xml:space="preserve">3.2 Level 0: </w:t>
       </w:r>
@@ -8085,7 +8078,7 @@
           <w:noProof/>
         </w:rPr>
         <w:drawing>
-          <wp:inline distT="0" distB="0" distL="0" distR="0" wp14:anchorId="074BCB95" wp14:editId="01CDD931">
+          <wp:inline distT="0" distB="0" distL="0" distR="0" wp14:anchorId="51A82C67" wp14:editId="3BBC3E70">
             <wp:extent cx="5760000" cy="2962286"/>
             <wp:effectExtent l="0" t="0" r="0" b="0"/>
             <wp:docPr id="2" name="Picture 2"/>
@@ -8239,7 +8232,6 @@
         <w:ind w:left="1077" w:hanging="369"/>
       </w:pPr>
       <w:r>
-        <w:lastRenderedPageBreak/>
         <w:t>•</w:t>
       </w:r>
       <w:r>
@@ -8385,7 +8377,7 @@
       <w:pPr>
         <w:pStyle w:val="Heading2"/>
       </w:pPr>
-      <w:bookmarkStart w:id="12" w:name="_Toc244042477"/>
+      <w:bookmarkStart w:id="12" w:name="_Toc244043543"/>
       <w:r>
         <w:t xml:space="preserve">3.3 Level 1: </w:t>
       </w:r>
@@ -8462,7 +8454,7 @@
           <w:noProof/>
         </w:rPr>
         <w:drawing>
-          <wp:inline distT="0" distB="0" distL="0" distR="0" wp14:anchorId="5111D9E8" wp14:editId="34E18076">
+          <wp:inline distT="0" distB="0" distL="0" distR="0" wp14:anchorId="3FB4326B" wp14:editId="7EFF03A4">
             <wp:extent cx="5760000" cy="3240000"/>
             <wp:effectExtent l="0" t="0" r="0" b="0"/>
             <wp:docPr id="3" name="Picture 3"/>
@@ -8593,9 +8585,8 @@
         <w:rPr>
           <w:noProof/>
         </w:rPr>
-        <w:lastRenderedPageBreak/>
         <w:drawing>
-          <wp:inline distT="0" distB="0" distL="0" distR="0" wp14:anchorId="4A09FDEB" wp14:editId="7C5EEC0C">
+          <wp:inline distT="0" distB="0" distL="0" distR="0" wp14:anchorId="183BA371" wp14:editId="42F9D914">
             <wp:extent cx="5760000" cy="2150400"/>
             <wp:effectExtent l="0" t="0" r="0" b="0"/>
             <wp:docPr id="4" name="Picture 4"/>
@@ -8675,6 +8666,7 @@
     </w:p>
     <w:p>
       <w:pPr>
+        <w:keepNext/>
         <w:spacing w:after="80"/>
         <w:ind w:firstLine="709"/>
         <w:jc w:val="thaiDistribute"/>
@@ -9576,7 +9568,7 @@
       <w:pPr>
         <w:pStyle w:val="Heading2"/>
       </w:pPr>
-      <w:bookmarkStart w:id="13" w:name="_Toc244042478"/>
+      <w:bookmarkStart w:id="13" w:name="_Toc244043544"/>
       <w:r>
         <w:t xml:space="preserve">3.4 Level 2–3: </w:t>
       </w:r>
@@ -10860,6 +10852,9 @@
         <w:gridCol w:w="9014"/>
       </w:tblGrid>
       <w:tr>
+        <w:trPr>
+          <w:cantSplit/>
+        </w:trPr>
         <w:tc>
           <w:tcPr>
             <w:tcW w:w="9014" w:type="dxa"/>
@@ -12000,6 +11995,9 @@
         <w:gridCol w:w="9014"/>
       </w:tblGrid>
       <w:tr>
+        <w:trPr>
+          <w:cantSplit/>
+        </w:trPr>
         <w:tc>
           <w:tcPr>
             <w:tcW w:w="9014" w:type="dxa"/>
@@ -12284,7 +12282,7 @@
       <w:pPr>
         <w:pStyle w:val="Heading2"/>
       </w:pPr>
-      <w:bookmarkStart w:id="14" w:name="_Toc244042479"/>
+      <w:bookmarkStart w:id="14" w:name="_Toc244043545"/>
       <w:r>
         <w:rPr>
           <w:cs/>
@@ -12307,7 +12305,7 @@
           <w:noProof/>
         </w:rPr>
         <w:drawing>
-          <wp:inline distT="0" distB="0" distL="0" distR="0" wp14:anchorId="609273BB" wp14:editId="6D6EB202">
+          <wp:inline distT="0" distB="0" distL="0" distR="0" wp14:anchorId="0609A27F" wp14:editId="3AAB8787">
             <wp:extent cx="5760000" cy="3600000"/>
             <wp:effectExtent l="0" t="0" r="0" b="0"/>
             <wp:docPr id="5" name="Picture 5"/>
@@ -12386,7 +12384,7 @@
       <w:pPr>
         <w:pStyle w:val="Heading2"/>
       </w:pPr>
-      <w:bookmarkStart w:id="15" w:name="_Toc244042480"/>
+      <w:bookmarkStart w:id="15" w:name="_Toc244043546"/>
       <w:r>
         <w:rPr>
           <w:cs/>
@@ -12397,6 +12395,7 @@
     </w:p>
     <w:p>
       <w:pPr>
+        <w:keepNext/>
         <w:spacing w:after="80"/>
         <w:ind w:firstLine="709"/>
         <w:jc w:val="thaiDistribute"/>
@@ -12733,6 +12732,7 @@
     </w:tbl>
     <w:p>
       <w:pPr>
+        <w:keepNext/>
         <w:spacing w:after="40"/>
       </w:pPr>
     </w:p>
@@ -13151,6 +13151,7 @@
     </w:tbl>
     <w:p>
       <w:pPr>
+        <w:keepNext/>
         <w:spacing w:after="40"/>
       </w:pPr>
     </w:p>
@@ -13524,7 +13525,7 @@
       <w:pPr>
         <w:pStyle w:val="Heading2"/>
       </w:pPr>
-      <w:bookmarkStart w:id="16" w:name="_Toc244042481"/>
+      <w:bookmarkStart w:id="16" w:name="_Toc244043547"/>
       <w:r>
         <w:rPr>
           <w:cs/>
@@ -13764,7 +13765,7 @@
       <w:pPr>
         <w:pStyle w:val="Heading2"/>
       </w:pPr>
-      <w:bookmarkStart w:id="17" w:name="_Toc244042482"/>
+      <w:bookmarkStart w:id="17" w:name="_Toc244043548"/>
       <w:r>
         <w:rPr>
           <w:cs/>
@@ -14629,8 +14630,9 @@
     <w:p>
       <w:pPr>
         <w:pStyle w:val="Heading1"/>
+        <w:pageBreakBefore/>
       </w:pPr>
-      <w:bookmarkStart w:id="18" w:name="_Toc244042483"/>
+      <w:bookmarkStart w:id="18" w:name="_Toc244043549"/>
       <w:r>
         <w:rPr>
           <w:cs/>
@@ -14643,7 +14645,7 @@
       <w:pPr>
         <w:pStyle w:val="Heading2"/>
       </w:pPr>
-      <w:bookmarkStart w:id="19" w:name="_Toc244042484"/>
+      <w:bookmarkStart w:id="19" w:name="_Toc244043550"/>
       <w:r>
         <w:rPr>
           <w:cs/>
@@ -15055,7 +15057,7 @@
       <w:pPr>
         <w:pStyle w:val="Heading2"/>
       </w:pPr>
-      <w:bookmarkStart w:id="20" w:name="_Toc244042485"/>
+      <w:bookmarkStart w:id="20" w:name="_Toc244043551"/>
       <w:r>
         <w:rPr>
           <w:cs/>
@@ -15324,7 +15326,7 @@
       <w:pPr>
         <w:pStyle w:val="Heading2"/>
       </w:pPr>
-      <w:bookmarkStart w:id="21" w:name="_Toc244042486"/>
+      <w:bookmarkStart w:id="21" w:name="_Toc244043552"/>
       <w:r>
         <w:rPr>
           <w:cs/>
@@ -15352,6 +15354,9 @@
         <w:gridCol w:w="9014"/>
       </w:tblGrid>
       <w:tr>
+        <w:trPr>
+          <w:cantSplit/>
+        </w:trPr>
         <w:tc>
           <w:tcPr>
             <w:tcW w:w="9014" w:type="dxa"/>
@@ -15664,7 +15669,7 @@
       <w:pPr>
         <w:pStyle w:val="Heading2"/>
       </w:pPr>
-      <w:bookmarkStart w:id="22" w:name="_Toc244042487"/>
+      <w:bookmarkStart w:id="22" w:name="_Toc244043553"/>
       <w:r>
         <w:rPr>
           <w:cs/>
@@ -16585,7 +16590,7 @@
       <w:pPr>
         <w:pStyle w:val="Heading2"/>
       </w:pPr>
-      <w:bookmarkStart w:id="23" w:name="_Toc244042488"/>
+      <w:bookmarkStart w:id="23" w:name="_Toc244043554"/>
       <w:r>
         <w:rPr>
           <w:cs/>
@@ -16599,6 +16604,7 @@
     </w:p>
     <w:p>
       <w:pPr>
+        <w:keepNext/>
         <w:spacing w:after="80"/>
         <w:ind w:firstLine="709"/>
         <w:jc w:val="thaiDistribute"/>
@@ -17364,8 +17370,9 @@
     <w:p>
       <w:pPr>
         <w:pStyle w:val="Heading1"/>
+        <w:pageBreakBefore/>
       </w:pPr>
-      <w:bookmarkStart w:id="24" w:name="_Toc244042489"/>
+      <w:bookmarkStart w:id="24" w:name="_Toc244043555"/>
       <w:r>
         <w:rPr>
           <w:cs/>
@@ -17378,7 +17385,7 @@
       <w:pPr>
         <w:pStyle w:val="Heading2"/>
       </w:pPr>
-      <w:bookmarkStart w:id="25" w:name="_Toc244042490"/>
+      <w:bookmarkStart w:id="25" w:name="_Toc244043556"/>
       <w:r>
         <w:rPr>
           <w:cs/>
@@ -17559,7 +17566,7 @@
       <w:pPr>
         <w:pStyle w:val="Heading2"/>
       </w:pPr>
-      <w:bookmarkStart w:id="26" w:name="_Toc244042491"/>
+      <w:bookmarkStart w:id="26" w:name="_Toc244043557"/>
       <w:r>
         <w:rPr>
           <w:cs/>
@@ -18003,7 +18010,7 @@
       <w:pPr>
         <w:pStyle w:val="Heading2"/>
       </w:pPr>
-      <w:bookmarkStart w:id="27" w:name="_Toc244042492"/>
+      <w:bookmarkStart w:id="27" w:name="_Toc244043558"/>
       <w:r>
         <w:rPr>
           <w:cs/>
@@ -18614,7 +18621,7 @@
       <w:pPr>
         <w:pStyle w:val="Heading2"/>
       </w:pPr>
-      <w:bookmarkStart w:id="28" w:name="_Toc244042493"/>
+      <w:bookmarkStart w:id="28" w:name="_Toc244043559"/>
       <w:r>
         <w:rPr>
           <w:cs/>
@@ -18625,6 +18632,7 @@
     </w:p>
     <w:p>
       <w:pPr>
+        <w:keepNext/>
         <w:spacing w:after="80"/>
         <w:ind w:firstLine="709"/>
         <w:jc w:val="thaiDistribute"/>
@@ -20185,7 +20193,7 @@
       <w:pPr>
         <w:pStyle w:val="Heading2"/>
       </w:pPr>
-      <w:bookmarkStart w:id="29" w:name="_Toc244042494"/>
+      <w:bookmarkStart w:id="29" w:name="_Toc244043560"/>
       <w:r>
         <w:rPr>
           <w:cs/>
@@ -20306,8 +20314,9 @@
     <w:p>
       <w:pPr>
         <w:pStyle w:val="Heading1"/>
+        <w:pageBreakBefore/>
       </w:pPr>
-      <w:bookmarkStart w:id="30" w:name="_Toc244042495"/>
+      <w:bookmarkStart w:id="30" w:name="_Toc244043561"/>
       <w:r>
         <w:rPr>
           <w:cs/>
@@ -20320,7 +20329,7 @@
       <w:pPr>
         <w:pStyle w:val="Heading2"/>
       </w:pPr>
-      <w:bookmarkStart w:id="31" w:name="_Toc244042496"/>
+      <w:bookmarkStart w:id="31" w:name="_Toc244043562"/>
       <w:r>
         <w:rPr>
           <w:cs/>
@@ -20469,7 +20478,7 @@
       <w:pPr>
         <w:pStyle w:val="Heading2"/>
       </w:pPr>
-      <w:bookmarkStart w:id="32" w:name="_Toc244042497"/>
+      <w:bookmarkStart w:id="32" w:name="_Toc244043563"/>
       <w:r>
         <w:rPr>
           <w:cs/>
@@ -20585,7 +20594,7 @@
       <w:pPr>
         <w:pStyle w:val="Heading2"/>
       </w:pPr>
-      <w:bookmarkStart w:id="33" w:name="_Toc244042498"/>
+      <w:bookmarkStart w:id="33" w:name="_Toc244043564"/>
       <w:r>
         <w:rPr>
           <w:cs/>
@@ -20699,8 +20708,9 @@
     <w:p>
       <w:pPr>
         <w:pStyle w:val="Heading1"/>
+        <w:pageBreakBefore/>
       </w:pPr>
-      <w:bookmarkStart w:id="34" w:name="_Toc244042499"/>
+      <w:bookmarkStart w:id="34" w:name="_Toc244043565"/>
       <w:r>
         <w:rPr>
           <w:cs/>
@@ -21973,6 +21983,7 @@
     </w:tbl>
     <w:p>
       <w:pPr>
+        <w:keepNext/>
         <w:spacing w:after="40"/>
       </w:pPr>
     </w:p>
@@ -22763,8 +22774,9 @@
     <w:p>
       <w:pPr>
         <w:pStyle w:val="Heading1"/>
+        <w:pageBreakBefore/>
       </w:pPr>
-      <w:bookmarkStart w:id="35" w:name="_Toc244042500"/>
+      <w:bookmarkStart w:id="35" w:name="_Toc244043566"/>
       <w:r>
         <w:rPr>
           <w:cs/>
@@ -23575,6 +23587,7 @@
     </w:tbl>
     <w:p>
       <w:pPr>
+        <w:keepNext/>
         <w:spacing w:after="40"/>
       </w:pPr>
     </w:p>
@@ -24329,31 +24342,31 @@
       </w:rPr>
     </w:lvl>
   </w:abstractNum>
-  <w:num w:numId="1" w16cid:durableId="862978350">
+  <w:num w:numId="1" w16cid:durableId="1665165384">
     <w:abstractNumId w:val="8"/>
   </w:num>
-  <w:num w:numId="2" w16cid:durableId="125973612">
+  <w:num w:numId="2" w16cid:durableId="258022984">
     <w:abstractNumId w:val="6"/>
   </w:num>
-  <w:num w:numId="3" w16cid:durableId="1653287585">
+  <w:num w:numId="3" w16cid:durableId="1892765109">
     <w:abstractNumId w:val="5"/>
   </w:num>
-  <w:num w:numId="4" w16cid:durableId="2062898741">
+  <w:num w:numId="4" w16cid:durableId="679818695">
     <w:abstractNumId w:val="4"/>
   </w:num>
-  <w:num w:numId="5" w16cid:durableId="673411937">
+  <w:num w:numId="5" w16cid:durableId="1512378364">
     <w:abstractNumId w:val="7"/>
   </w:num>
-  <w:num w:numId="6" w16cid:durableId="1952857394">
+  <w:num w:numId="6" w16cid:durableId="2004576823">
     <w:abstractNumId w:val="3"/>
   </w:num>
-  <w:num w:numId="7" w16cid:durableId="1303383581">
+  <w:num w:numId="7" w16cid:durableId="551961003">
     <w:abstractNumId w:val="2"/>
   </w:num>
-  <w:num w:numId="8" w16cid:durableId="1702436989">
+  <w:num w:numId="8" w16cid:durableId="981468074">
     <w:abstractNumId w:val="1"/>
   </w:num>
-  <w:num w:numId="9" w16cid:durableId="477695648">
+  <w:num w:numId="9" w16cid:durableId="2018387841">
     <w:abstractNumId w:val="0"/>
   </w:num>
 </w:numbering>
@@ -35770,7 +35783,7 @@
     <w:autoRedefine/>
     <w:uiPriority w:val="39"/>
     <w:unhideWhenUsed/>
-    <w:rsid w:val="00866DB4"/>
+    <w:rsid w:val="00AA1670"/>
     <w:pPr>
       <w:spacing w:after="100"/>
     </w:pPr>
@@ -35786,7 +35799,7 @@
     <w:autoRedefine/>
     <w:uiPriority w:val="39"/>
     <w:unhideWhenUsed/>
-    <w:rsid w:val="00866DB4"/>
+    <w:rsid w:val="00AA1670"/>
     <w:pPr>
       <w:spacing w:after="100"/>
       <w:ind w:left="320"/>
@@ -35801,7 +35814,7 @@
     <w:basedOn w:val="DefaultParagraphFont"/>
     <w:uiPriority w:val="99"/>
     <w:unhideWhenUsed/>
-    <w:rsid w:val="00866DB4"/>
+    <w:rsid w:val="00AA1670"/>
     <w:rPr>
       <w:color w:val="0000FF" w:themeColor="hyperlink"/>
       <w:u w:val="single"/>

</xml_diff>

<commit_message>
Design doc: no table fill, left-aligned chapter titles, no running header
</commit_message>
<xml_diff>
--- a/DesignDocument_SmartLibrary.docx
+++ b/DesignDocument_SmartLibrary.docx
@@ -378,7 +378,7 @@
         </w:rPr>
         <w:fldChar w:fldCharType="separate"/>
       </w:r>
-      <w:hyperlink w:anchor="_Toc244043898" w:history="1">
+      <w:hyperlink w:anchor="_Toc244044054" w:history="1">
         <w:r>
           <w:rPr>
             <w:rStyle w:val="Hyperlink"/>
@@ -414,7 +414,7 @@
             <w:webHidden/>
             <w:szCs w:val="32"/>
           </w:rPr>
-          <w:instrText xml:space="preserve"> PAGEREF _Toc244043898 \h </w:instrText>
+          <w:instrText xml:space="preserve"> PAGEREF _Toc244044054 \h </w:instrText>
         </w:r>
         <w:r>
           <w:rPr>
@@ -467,7 +467,7 @@
           <w14:ligatures w14:val="standardContextual"/>
         </w:rPr>
       </w:pPr>
-      <w:hyperlink w:anchor="_Toc244043899" w:history="1">
+      <w:hyperlink w:anchor="_Toc244044055" w:history="1">
         <w:r>
           <w:rPr>
             <w:rStyle w:val="Hyperlink"/>
@@ -503,7 +503,7 @@
             <w:webHidden/>
             <w:szCs w:val="32"/>
           </w:rPr>
-          <w:instrText xml:space="preserve"> PAGEREF _Toc244043899 \h </w:instrText>
+          <w:instrText xml:space="preserve"> PAGEREF _Toc244044055 \h </w:instrText>
         </w:r>
         <w:r>
           <w:rPr>
@@ -556,7 +556,7 @@
           <w14:ligatures w14:val="standardContextual"/>
         </w:rPr>
       </w:pPr>
-      <w:hyperlink w:anchor="_Toc244043900" w:history="1">
+      <w:hyperlink w:anchor="_Toc244044056" w:history="1">
         <w:r>
           <w:rPr>
             <w:rStyle w:val="Hyperlink"/>
@@ -592,7 +592,7 @@
             <w:webHidden/>
             <w:szCs w:val="32"/>
           </w:rPr>
-          <w:instrText xml:space="preserve"> PAGEREF _Toc244043900 \h </w:instrText>
+          <w:instrText xml:space="preserve"> PAGEREF _Toc244044056 \h </w:instrText>
         </w:r>
         <w:r>
           <w:rPr>
@@ -645,7 +645,7 @@
           <w14:ligatures w14:val="standardContextual"/>
         </w:rPr>
       </w:pPr>
-      <w:hyperlink w:anchor="_Toc244043901" w:history="1">
+      <w:hyperlink w:anchor="_Toc244044057" w:history="1">
         <w:r>
           <w:rPr>
             <w:rStyle w:val="Hyperlink"/>
@@ -681,7 +681,7 @@
             <w:webHidden/>
             <w:szCs w:val="32"/>
           </w:rPr>
-          <w:instrText xml:space="preserve"> PAGEREF _Toc244043901 \h </w:instrText>
+          <w:instrText xml:space="preserve"> PAGEREF _Toc244044057 \h </w:instrText>
         </w:r>
         <w:r>
           <w:rPr>
@@ -734,7 +734,7 @@
           <w14:ligatures w14:val="standardContextual"/>
         </w:rPr>
       </w:pPr>
-      <w:hyperlink w:anchor="_Toc244043902" w:history="1">
+      <w:hyperlink w:anchor="_Toc244044058" w:history="1">
         <w:r>
           <w:rPr>
             <w:rStyle w:val="Hyperlink"/>
@@ -770,7 +770,7 @@
             <w:webHidden/>
             <w:szCs w:val="32"/>
           </w:rPr>
-          <w:instrText xml:space="preserve"> PAGEREF _Toc244043902 \h </w:instrText>
+          <w:instrText xml:space="preserve"> PAGEREF _Toc244044058 \h </w:instrText>
         </w:r>
         <w:r>
           <w:rPr>
@@ -823,7 +823,7 @@
           <w14:ligatures w14:val="standardContextual"/>
         </w:rPr>
       </w:pPr>
-      <w:hyperlink w:anchor="_Toc244043903" w:history="1">
+      <w:hyperlink w:anchor="_Toc244044059" w:history="1">
         <w:r>
           <w:rPr>
             <w:rStyle w:val="Hyperlink"/>
@@ -859,7 +859,7 @@
             <w:webHidden/>
             <w:szCs w:val="32"/>
           </w:rPr>
-          <w:instrText xml:space="preserve"> PAGEREF _Toc244043903 \h </w:instrText>
+          <w:instrText xml:space="preserve"> PAGEREF _Toc244044059 \h </w:instrText>
         </w:r>
         <w:r>
           <w:rPr>
@@ -912,7 +912,7 @@
           <w14:ligatures w14:val="standardContextual"/>
         </w:rPr>
       </w:pPr>
-      <w:hyperlink w:anchor="_Toc244043904" w:history="1">
+      <w:hyperlink w:anchor="_Toc244044060" w:history="1">
         <w:r>
           <w:rPr>
             <w:rStyle w:val="Hyperlink"/>
@@ -948,7 +948,7 @@
             <w:webHidden/>
             <w:szCs w:val="32"/>
           </w:rPr>
-          <w:instrText xml:space="preserve"> PAGEREF _Toc244043904 \h </w:instrText>
+          <w:instrText xml:space="preserve"> PAGEREF _Toc244044060 \h </w:instrText>
         </w:r>
         <w:r>
           <w:rPr>
@@ -1001,7 +1001,7 @@
           <w14:ligatures w14:val="standardContextual"/>
         </w:rPr>
       </w:pPr>
-      <w:hyperlink w:anchor="_Toc244043905" w:history="1">
+      <w:hyperlink w:anchor="_Toc244044061" w:history="1">
         <w:r>
           <w:rPr>
             <w:rStyle w:val="Hyperlink"/>
@@ -1037,7 +1037,7 @@
             <w:webHidden/>
             <w:szCs w:val="32"/>
           </w:rPr>
-          <w:instrText xml:space="preserve"> PAGEREF _Toc244043905 \h </w:instrText>
+          <w:instrText xml:space="preserve"> PAGEREF _Toc244044061 \h </w:instrText>
         </w:r>
         <w:r>
           <w:rPr>
@@ -1090,7 +1090,7 @@
           <w14:ligatures w14:val="standardContextual"/>
         </w:rPr>
       </w:pPr>
-      <w:hyperlink w:anchor="_Toc244043906" w:history="1">
+      <w:hyperlink w:anchor="_Toc244044062" w:history="1">
         <w:r>
           <w:rPr>
             <w:rStyle w:val="Hyperlink"/>
@@ -1126,7 +1126,7 @@
             <w:webHidden/>
             <w:szCs w:val="32"/>
           </w:rPr>
-          <w:instrText xml:space="preserve"> PAGEREF _Toc244043906 \h </w:instrText>
+          <w:instrText xml:space="preserve"> PAGEREF _Toc244044062 \h </w:instrText>
         </w:r>
         <w:r>
           <w:rPr>
@@ -1179,7 +1179,7 @@
           <w14:ligatures w14:val="standardContextual"/>
         </w:rPr>
       </w:pPr>
-      <w:hyperlink w:anchor="_Toc244043907" w:history="1">
+      <w:hyperlink w:anchor="_Toc244044063" w:history="1">
         <w:r>
           <w:rPr>
             <w:rStyle w:val="Hyperlink"/>
@@ -1224,7 +1224,7 @@
             <w:webHidden/>
             <w:szCs w:val="32"/>
           </w:rPr>
-          <w:instrText xml:space="preserve"> PAGEREF _Toc244043907 \h </w:instrText>
+          <w:instrText xml:space="preserve"> PAGEREF _Toc244044063 \h </w:instrText>
         </w:r>
         <w:r>
           <w:rPr>
@@ -1277,7 +1277,7 @@
           <w14:ligatures w14:val="standardContextual"/>
         </w:rPr>
       </w:pPr>
-      <w:hyperlink w:anchor="_Toc244043908" w:history="1">
+      <w:hyperlink w:anchor="_Toc244044064" w:history="1">
         <w:r>
           <w:rPr>
             <w:rStyle w:val="Hyperlink"/>
@@ -1322,7 +1322,7 @@
             <w:webHidden/>
             <w:szCs w:val="32"/>
           </w:rPr>
-          <w:instrText xml:space="preserve"> PAGEREF _Toc244043908 \h </w:instrText>
+          <w:instrText xml:space="preserve"> PAGEREF _Toc244044064 \h </w:instrText>
         </w:r>
         <w:r>
           <w:rPr>
@@ -1375,7 +1375,7 @@
           <w14:ligatures w14:val="standardContextual"/>
         </w:rPr>
       </w:pPr>
-      <w:hyperlink w:anchor="_Toc244043909" w:history="1">
+      <w:hyperlink w:anchor="_Toc244044065" w:history="1">
         <w:r>
           <w:rPr>
             <w:rStyle w:val="Hyperlink"/>
@@ -1420,7 +1420,7 @@
             <w:webHidden/>
             <w:szCs w:val="32"/>
           </w:rPr>
-          <w:instrText xml:space="preserve"> PAGEREF _Toc244043909 \h </w:instrText>
+          <w:instrText xml:space="preserve"> PAGEREF _Toc244044065 \h </w:instrText>
         </w:r>
         <w:r>
           <w:rPr>
@@ -1473,7 +1473,7 @@
           <w14:ligatures w14:val="standardContextual"/>
         </w:rPr>
       </w:pPr>
-      <w:hyperlink w:anchor="_Toc244043910" w:history="1">
+      <w:hyperlink w:anchor="_Toc244044066" w:history="1">
         <w:r>
           <w:rPr>
             <w:rStyle w:val="Hyperlink"/>
@@ -1518,7 +1518,7 @@
             <w:webHidden/>
             <w:szCs w:val="32"/>
           </w:rPr>
-          <w:instrText xml:space="preserve"> PAGEREF _Toc244043910 \h </w:instrText>
+          <w:instrText xml:space="preserve"> PAGEREF _Toc244044066 \h </w:instrText>
         </w:r>
         <w:r>
           <w:rPr>
@@ -1571,7 +1571,7 @@
           <w14:ligatures w14:val="standardContextual"/>
         </w:rPr>
       </w:pPr>
-      <w:hyperlink w:anchor="_Toc244043911" w:history="1">
+      <w:hyperlink w:anchor="_Toc244044067" w:history="1">
         <w:r>
           <w:rPr>
             <w:rStyle w:val="Hyperlink"/>
@@ -1616,7 +1616,7 @@
             <w:webHidden/>
             <w:szCs w:val="32"/>
           </w:rPr>
-          <w:instrText xml:space="preserve"> PAGEREF _Toc244043911 \h </w:instrText>
+          <w:instrText xml:space="preserve"> PAGEREF _Toc244044067 \h </w:instrText>
         </w:r>
         <w:r>
           <w:rPr>
@@ -1669,7 +1669,7 @@
           <w14:ligatures w14:val="standardContextual"/>
         </w:rPr>
       </w:pPr>
-      <w:hyperlink w:anchor="_Toc244043912" w:history="1">
+      <w:hyperlink w:anchor="_Toc244044068" w:history="1">
         <w:r>
           <w:rPr>
             <w:rStyle w:val="Hyperlink"/>
@@ -1714,7 +1714,7 @@
             <w:webHidden/>
             <w:szCs w:val="32"/>
           </w:rPr>
-          <w:instrText xml:space="preserve"> PAGEREF _Toc244043912 \h </w:instrText>
+          <w:instrText xml:space="preserve"> PAGEREF _Toc244044068 \h </w:instrText>
         </w:r>
         <w:r>
           <w:rPr>
@@ -1767,7 +1767,7 @@
           <w14:ligatures w14:val="standardContextual"/>
         </w:rPr>
       </w:pPr>
-      <w:hyperlink w:anchor="_Toc244043913" w:history="1">
+      <w:hyperlink w:anchor="_Toc244044069" w:history="1">
         <w:r>
           <w:rPr>
             <w:rStyle w:val="Hyperlink"/>
@@ -1803,7 +1803,7 @@
             <w:webHidden/>
             <w:szCs w:val="32"/>
           </w:rPr>
-          <w:instrText xml:space="preserve"> PAGEREF _Toc244043913 \h </w:instrText>
+          <w:instrText xml:space="preserve"> PAGEREF _Toc244044069 \h </w:instrText>
         </w:r>
         <w:r>
           <w:rPr>
@@ -1856,7 +1856,7 @@
           <w14:ligatures w14:val="standardContextual"/>
         </w:rPr>
       </w:pPr>
-      <w:hyperlink w:anchor="_Toc244043914" w:history="1">
+      <w:hyperlink w:anchor="_Toc244044070" w:history="1">
         <w:r>
           <w:rPr>
             <w:rStyle w:val="Hyperlink"/>
@@ -1911,7 +1911,7 @@
             <w:webHidden/>
             <w:szCs w:val="32"/>
           </w:rPr>
-          <w:instrText xml:space="preserve"> PAGEREF _Toc244043914 \h </w:instrText>
+          <w:instrText xml:space="preserve"> PAGEREF _Toc244044070 \h </w:instrText>
         </w:r>
         <w:r>
           <w:rPr>
@@ -1964,7 +1964,7 @@
           <w14:ligatures w14:val="standardContextual"/>
         </w:rPr>
       </w:pPr>
-      <w:hyperlink w:anchor="_Toc244043915" w:history="1">
+      <w:hyperlink w:anchor="_Toc244044071" w:history="1">
         <w:r>
           <w:rPr>
             <w:rStyle w:val="Hyperlink"/>
@@ -2000,7 +2000,7 @@
             <w:webHidden/>
             <w:szCs w:val="32"/>
           </w:rPr>
-          <w:instrText xml:space="preserve"> PAGEREF _Toc244043915 \h </w:instrText>
+          <w:instrText xml:space="preserve"> PAGEREF _Toc244044071 \h </w:instrText>
         </w:r>
         <w:r>
           <w:rPr>
@@ -2053,7 +2053,7 @@
           <w14:ligatures w14:val="standardContextual"/>
         </w:rPr>
       </w:pPr>
-      <w:hyperlink w:anchor="_Toc244043916" w:history="1">
+      <w:hyperlink w:anchor="_Toc244044072" w:history="1">
         <w:r>
           <w:rPr>
             <w:rStyle w:val="Hyperlink"/>
@@ -2089,7 +2089,7 @@
             <w:webHidden/>
             <w:szCs w:val="32"/>
           </w:rPr>
-          <w:instrText xml:space="preserve"> PAGEREF _Toc244043916 \h </w:instrText>
+          <w:instrText xml:space="preserve"> PAGEREF _Toc244044072 \h </w:instrText>
         </w:r>
         <w:r>
           <w:rPr>
@@ -2142,7 +2142,7 @@
           <w14:ligatures w14:val="standardContextual"/>
         </w:rPr>
       </w:pPr>
-      <w:hyperlink w:anchor="_Toc244043917" w:history="1">
+      <w:hyperlink w:anchor="_Toc244044073" w:history="1">
         <w:r>
           <w:rPr>
             <w:rStyle w:val="Hyperlink"/>
@@ -2178,7 +2178,7 @@
             <w:webHidden/>
             <w:szCs w:val="32"/>
           </w:rPr>
-          <w:instrText xml:space="preserve"> PAGEREF _Toc244043917 \h </w:instrText>
+          <w:instrText xml:space="preserve"> PAGEREF _Toc244044073 \h </w:instrText>
         </w:r>
         <w:r>
           <w:rPr>
@@ -2231,7 +2231,7 @@
           <w14:ligatures w14:val="standardContextual"/>
         </w:rPr>
       </w:pPr>
-      <w:hyperlink w:anchor="_Toc244043918" w:history="1">
+      <w:hyperlink w:anchor="_Toc244044074" w:history="1">
         <w:r>
           <w:rPr>
             <w:rStyle w:val="Hyperlink"/>
@@ -2267,7 +2267,7 @@
             <w:webHidden/>
             <w:szCs w:val="32"/>
           </w:rPr>
-          <w:instrText xml:space="preserve"> PAGEREF _Toc244043918 \h </w:instrText>
+          <w:instrText xml:space="preserve"> PAGEREF _Toc244044074 \h </w:instrText>
         </w:r>
         <w:r>
           <w:rPr>
@@ -2320,7 +2320,7 @@
           <w14:ligatures w14:val="standardContextual"/>
         </w:rPr>
       </w:pPr>
-      <w:hyperlink w:anchor="_Toc244043919" w:history="1">
+      <w:hyperlink w:anchor="_Toc244044075" w:history="1">
         <w:r>
           <w:rPr>
             <w:rStyle w:val="Hyperlink"/>
@@ -2375,7 +2375,7 @@
             <w:webHidden/>
             <w:szCs w:val="32"/>
           </w:rPr>
-          <w:instrText xml:space="preserve"> PAGEREF _Toc244043919 \h </w:instrText>
+          <w:instrText xml:space="preserve"> PAGEREF _Toc244044075 \h </w:instrText>
         </w:r>
         <w:r>
           <w:rPr>
@@ -2428,7 +2428,7 @@
           <w14:ligatures w14:val="standardContextual"/>
         </w:rPr>
       </w:pPr>
-      <w:hyperlink w:anchor="_Toc244043920" w:history="1">
+      <w:hyperlink w:anchor="_Toc244044076" w:history="1">
         <w:r>
           <w:rPr>
             <w:rStyle w:val="Hyperlink"/>
@@ -2464,7 +2464,7 @@
             <w:webHidden/>
             <w:szCs w:val="32"/>
           </w:rPr>
-          <w:instrText xml:space="preserve"> PAGEREF _Toc244043920 \h </w:instrText>
+          <w:instrText xml:space="preserve"> PAGEREF _Toc244044076 \h </w:instrText>
         </w:r>
         <w:r>
           <w:rPr>
@@ -2517,7 +2517,7 @@
           <w14:ligatures w14:val="standardContextual"/>
         </w:rPr>
       </w:pPr>
-      <w:hyperlink w:anchor="_Toc244043921" w:history="1">
+      <w:hyperlink w:anchor="_Toc244044077" w:history="1">
         <w:r>
           <w:rPr>
             <w:rStyle w:val="Hyperlink"/>
@@ -2562,7 +2562,7 @@
             <w:webHidden/>
             <w:szCs w:val="32"/>
           </w:rPr>
-          <w:instrText xml:space="preserve"> PAGEREF _Toc244043921 \h </w:instrText>
+          <w:instrText xml:space="preserve"> PAGEREF _Toc244044077 \h </w:instrText>
         </w:r>
         <w:r>
           <w:rPr>
@@ -2615,7 +2615,7 @@
           <w14:ligatures w14:val="standardContextual"/>
         </w:rPr>
       </w:pPr>
-      <w:hyperlink w:anchor="_Toc244043922" w:history="1">
+      <w:hyperlink w:anchor="_Toc244044078" w:history="1">
         <w:r>
           <w:rPr>
             <w:rStyle w:val="Hyperlink"/>
@@ -2651,7 +2651,7 @@
             <w:webHidden/>
             <w:szCs w:val="32"/>
           </w:rPr>
-          <w:instrText xml:space="preserve"> PAGEREF _Toc244043922 \h </w:instrText>
+          <w:instrText xml:space="preserve"> PAGEREF _Toc244044078 \h </w:instrText>
         </w:r>
         <w:r>
           <w:rPr>
@@ -2704,7 +2704,7 @@
           <w14:ligatures w14:val="standardContextual"/>
         </w:rPr>
       </w:pPr>
-      <w:hyperlink w:anchor="_Toc244043923" w:history="1">
+      <w:hyperlink w:anchor="_Toc244044079" w:history="1">
         <w:r>
           <w:rPr>
             <w:rStyle w:val="Hyperlink"/>
@@ -2740,7 +2740,7 @@
             <w:webHidden/>
             <w:szCs w:val="32"/>
           </w:rPr>
-          <w:instrText xml:space="preserve"> PAGEREF _Toc244043923 \h </w:instrText>
+          <w:instrText xml:space="preserve"> PAGEREF _Toc244044079 \h </w:instrText>
         </w:r>
         <w:r>
           <w:rPr>
@@ -2793,7 +2793,7 @@
           <w14:ligatures w14:val="standardContextual"/>
         </w:rPr>
       </w:pPr>
-      <w:hyperlink w:anchor="_Toc244043924" w:history="1">
+      <w:hyperlink w:anchor="_Toc244044080" w:history="1">
         <w:r>
           <w:rPr>
             <w:rStyle w:val="Hyperlink"/>
@@ -2829,7 +2829,7 @@
             <w:webHidden/>
             <w:szCs w:val="32"/>
           </w:rPr>
-          <w:instrText xml:space="preserve"> PAGEREF _Toc244043924 \h </w:instrText>
+          <w:instrText xml:space="preserve"> PAGEREF _Toc244044080 \h </w:instrText>
         </w:r>
         <w:r>
           <w:rPr>
@@ -2882,7 +2882,7 @@
           <w14:ligatures w14:val="standardContextual"/>
         </w:rPr>
       </w:pPr>
-      <w:hyperlink w:anchor="_Toc244043925" w:history="1">
+      <w:hyperlink w:anchor="_Toc244044081" w:history="1">
         <w:r>
           <w:rPr>
             <w:rStyle w:val="Hyperlink"/>
@@ -2918,7 +2918,7 @@
             <w:webHidden/>
             <w:szCs w:val="32"/>
           </w:rPr>
-          <w:instrText xml:space="preserve"> PAGEREF _Toc244043925 \h </w:instrText>
+          <w:instrText xml:space="preserve"> PAGEREF _Toc244044081 \h </w:instrText>
         </w:r>
         <w:r>
           <w:rPr>
@@ -2971,7 +2971,7 @@
           <w14:ligatures w14:val="standardContextual"/>
         </w:rPr>
       </w:pPr>
-      <w:hyperlink w:anchor="_Toc244043926" w:history="1">
+      <w:hyperlink w:anchor="_Toc244044082" w:history="1">
         <w:r>
           <w:rPr>
             <w:rStyle w:val="Hyperlink"/>
@@ -3007,7 +3007,7 @@
             <w:webHidden/>
             <w:szCs w:val="32"/>
           </w:rPr>
-          <w:instrText xml:space="preserve"> PAGEREF _Toc244043926 \h </w:instrText>
+          <w:instrText xml:space="preserve"> PAGEREF _Toc244044082 \h </w:instrText>
         </w:r>
         <w:r>
           <w:rPr>
@@ -3060,7 +3060,7 @@
           <w14:ligatures w14:val="standardContextual"/>
         </w:rPr>
       </w:pPr>
-      <w:hyperlink w:anchor="_Toc244043927" w:history="1">
+      <w:hyperlink w:anchor="_Toc244044083" w:history="1">
         <w:r>
           <w:rPr>
             <w:rStyle w:val="Hyperlink"/>
@@ -3096,7 +3096,7 @@
             <w:webHidden/>
             <w:szCs w:val="32"/>
           </w:rPr>
-          <w:instrText xml:space="preserve"> PAGEREF _Toc244043927 \h </w:instrText>
+          <w:instrText xml:space="preserve"> PAGEREF _Toc244044083 \h </w:instrText>
         </w:r>
         <w:r>
           <w:rPr>
@@ -3149,7 +3149,7 @@
           <w14:ligatures w14:val="standardContextual"/>
         </w:rPr>
       </w:pPr>
-      <w:hyperlink w:anchor="_Toc244043928" w:history="1">
+      <w:hyperlink w:anchor="_Toc244044084" w:history="1">
         <w:r>
           <w:rPr>
             <w:rStyle w:val="Hyperlink"/>
@@ -3185,7 +3185,7 @@
             <w:webHidden/>
             <w:szCs w:val="32"/>
           </w:rPr>
-          <w:instrText xml:space="preserve"> PAGEREF _Toc244043928 \h </w:instrText>
+          <w:instrText xml:space="preserve"> PAGEREF _Toc244044084 \h </w:instrText>
         </w:r>
         <w:r>
           <w:rPr>
@@ -3238,7 +3238,7 @@
           <w14:ligatures w14:val="standardContextual"/>
         </w:rPr>
       </w:pPr>
-      <w:hyperlink w:anchor="_Toc244043929" w:history="1">
+      <w:hyperlink w:anchor="_Toc244044085" w:history="1">
         <w:r>
           <w:rPr>
             <w:rStyle w:val="Hyperlink"/>
@@ -3274,7 +3274,7 @@
             <w:webHidden/>
             <w:szCs w:val="32"/>
           </w:rPr>
-          <w:instrText xml:space="preserve"> PAGEREF _Toc244043929 \h </w:instrText>
+          <w:instrText xml:space="preserve"> PAGEREF _Toc244044085 \h </w:instrText>
         </w:r>
         <w:r>
           <w:rPr>
@@ -3327,7 +3327,7 @@
           <w14:ligatures w14:val="standardContextual"/>
         </w:rPr>
       </w:pPr>
-      <w:hyperlink w:anchor="_Toc244043930" w:history="1">
+      <w:hyperlink w:anchor="_Toc244044086" w:history="1">
         <w:r>
           <w:rPr>
             <w:rStyle w:val="Hyperlink"/>
@@ -3363,7 +3363,7 @@
             <w:webHidden/>
             <w:szCs w:val="32"/>
           </w:rPr>
-          <w:instrText xml:space="preserve"> PAGEREF _Toc244043930 \h </w:instrText>
+          <w:instrText xml:space="preserve"> PAGEREF _Toc244044086 \h </w:instrText>
         </w:r>
         <w:r>
           <w:rPr>
@@ -3416,7 +3416,7 @@
           <w14:ligatures w14:val="standardContextual"/>
         </w:rPr>
       </w:pPr>
-      <w:hyperlink w:anchor="_Toc244043931" w:history="1">
+      <w:hyperlink w:anchor="_Toc244044087" w:history="1">
         <w:r>
           <w:rPr>
             <w:rStyle w:val="Hyperlink"/>
@@ -3452,7 +3452,7 @@
             <w:webHidden/>
             <w:szCs w:val="32"/>
           </w:rPr>
-          <w:instrText xml:space="preserve"> PAGEREF _Toc244043931 \h </w:instrText>
+          <w:instrText xml:space="preserve"> PAGEREF _Toc244044087 \h </w:instrText>
         </w:r>
         <w:r>
           <w:rPr>
@@ -3505,7 +3505,7 @@
           <w14:ligatures w14:val="standardContextual"/>
         </w:rPr>
       </w:pPr>
-      <w:hyperlink w:anchor="_Toc244043932" w:history="1">
+      <w:hyperlink w:anchor="_Toc244044088" w:history="1">
         <w:r>
           <w:rPr>
             <w:rStyle w:val="Hyperlink"/>
@@ -3541,7 +3541,7 @@
             <w:webHidden/>
             <w:szCs w:val="32"/>
           </w:rPr>
-          <w:instrText xml:space="preserve"> PAGEREF _Toc244043932 \h </w:instrText>
+          <w:instrText xml:space="preserve"> PAGEREF _Toc244044088 \h </w:instrText>
         </w:r>
         <w:r>
           <w:rPr>
@@ -3594,7 +3594,7 @@
           <w14:ligatures w14:val="standardContextual"/>
         </w:rPr>
       </w:pPr>
-      <w:hyperlink w:anchor="_Toc244043933" w:history="1">
+      <w:hyperlink w:anchor="_Toc244044089" w:history="1">
         <w:r>
           <w:rPr>
             <w:rStyle w:val="Hyperlink"/>
@@ -3630,7 +3630,7 @@
             <w:webHidden/>
             <w:szCs w:val="32"/>
           </w:rPr>
-          <w:instrText xml:space="preserve"> PAGEREF _Toc244043933 \h </w:instrText>
+          <w:instrText xml:space="preserve"> PAGEREF _Toc244044089 \h </w:instrText>
         </w:r>
         <w:r>
           <w:rPr>
@@ -3679,7 +3679,7 @@
         <w:pStyle w:val="Heading1"/>
         <w:pageBreakBefore/>
       </w:pPr>
-      <w:bookmarkStart w:id="0" w:name="_Toc244043898"/>
+      <w:bookmarkStart w:id="0" w:name="_Toc244044054"/>
       <w:r>
         <w:rPr>
           <w:cs/>
@@ -3692,7 +3692,7 @@
       <w:pPr>
         <w:pStyle w:val="Heading2"/>
       </w:pPr>
-      <w:bookmarkStart w:id="1" w:name="_Toc244043899"/>
+      <w:bookmarkStart w:id="1" w:name="_Toc244044055"/>
       <w:r>
         <w:rPr>
           <w:cs/>
@@ -3779,7 +3779,7 @@
       <w:pPr>
         <w:pStyle w:val="Heading2"/>
       </w:pPr>
-      <w:bookmarkStart w:id="2" w:name="_Toc244043900"/>
+      <w:bookmarkStart w:id="2" w:name="_Toc244044056"/>
       <w:r>
         <w:rPr>
           <w:cs/>
@@ -3854,7 +3854,6 @@
         <w:tc>
           <w:tcPr>
             <w:tcW w:w="1474" w:type="dxa"/>
-            <w:shd w:val="clear" w:color="auto" w:fill="E8EEF6"/>
             <w:vAlign w:val="center"/>
           </w:tcPr>
           <w:p>
@@ -3877,7 +3876,6 @@
         <w:tc>
           <w:tcPr>
             <w:tcW w:w="2608" w:type="dxa"/>
-            <w:shd w:val="clear" w:color="auto" w:fill="E8EEF6"/>
             <w:vAlign w:val="center"/>
           </w:tcPr>
           <w:p>
@@ -3900,7 +3898,6 @@
         <w:tc>
           <w:tcPr>
             <w:tcW w:w="2608" w:type="dxa"/>
-            <w:shd w:val="clear" w:color="auto" w:fill="E8EEF6"/>
             <w:vAlign w:val="center"/>
           </w:tcPr>
           <w:p>
@@ -3923,7 +3920,6 @@
         <w:tc>
           <w:tcPr>
             <w:tcW w:w="2324" w:type="dxa"/>
-            <w:shd w:val="clear" w:color="auto" w:fill="E8EEF6"/>
             <w:vAlign w:val="center"/>
           </w:tcPr>
           <w:p>
@@ -4523,7 +4519,7 @@
       <w:pPr>
         <w:pStyle w:val="Heading2"/>
       </w:pPr>
-      <w:bookmarkStart w:id="3" w:name="_Toc244043901"/>
+      <w:bookmarkStart w:id="3" w:name="_Toc244044057"/>
       <w:r>
         <w:rPr>
           <w:cs/>
@@ -4574,7 +4570,7 @@
       <w:pPr>
         <w:pStyle w:val="Heading2"/>
       </w:pPr>
-      <w:bookmarkStart w:id="4" w:name="_Toc244043902"/>
+      <w:bookmarkStart w:id="4" w:name="_Toc244044058"/>
       <w:r>
         <w:rPr>
           <w:cs/>
@@ -4640,7 +4636,6 @@
         <w:tc>
           <w:tcPr>
             <w:tcW w:w="3402" w:type="dxa"/>
-            <w:shd w:val="clear" w:color="auto" w:fill="E8EEF6"/>
             <w:vAlign w:val="center"/>
           </w:tcPr>
           <w:p>
@@ -4671,7 +4666,6 @@
         <w:tc>
           <w:tcPr>
             <w:tcW w:w="5613" w:type="dxa"/>
-            <w:shd w:val="clear" w:color="auto" w:fill="E8EEF6"/>
             <w:vAlign w:val="center"/>
           </w:tcPr>
           <w:p>
@@ -5020,7 +5014,7 @@
         <w:pStyle w:val="Heading1"/>
         <w:pageBreakBefore/>
       </w:pPr>
-      <w:bookmarkStart w:id="5" w:name="_Toc244043903"/>
+      <w:bookmarkStart w:id="5" w:name="_Toc244044059"/>
       <w:r>
         <w:rPr>
           <w:cs/>
@@ -5055,7 +5049,7 @@
       <w:pPr>
         <w:pStyle w:val="Heading2"/>
       </w:pPr>
-      <w:bookmarkStart w:id="6" w:name="_Toc244043904"/>
+      <w:bookmarkStart w:id="6" w:name="_Toc244044060"/>
       <w:r>
         <w:rPr>
           <w:cs/>
@@ -5122,7 +5116,6 @@
         <w:tc>
           <w:tcPr>
             <w:tcW w:w="2381" w:type="dxa"/>
-            <w:shd w:val="clear" w:color="auto" w:fill="E8EEF6"/>
             <w:vAlign w:val="center"/>
           </w:tcPr>
           <w:p>
@@ -5145,7 +5138,6 @@
         <w:tc>
           <w:tcPr>
             <w:tcW w:w="3628" w:type="dxa"/>
-            <w:shd w:val="clear" w:color="auto" w:fill="E8EEF6"/>
             <w:vAlign w:val="center"/>
           </w:tcPr>
           <w:p>
@@ -5168,7 +5160,6 @@
         <w:tc>
           <w:tcPr>
             <w:tcW w:w="3005" w:type="dxa"/>
-            <w:shd w:val="clear" w:color="auto" w:fill="E8EEF6"/>
             <w:vAlign w:val="center"/>
           </w:tcPr>
           <w:p>
@@ -6055,7 +6046,7 @@
       <w:pPr>
         <w:pStyle w:val="Heading2"/>
       </w:pPr>
-      <w:bookmarkStart w:id="7" w:name="_Toc244043905"/>
+      <w:bookmarkStart w:id="7" w:name="_Toc244044061"/>
       <w:r>
         <w:rPr>
           <w:cs/>
@@ -6137,7 +6128,6 @@
         <w:tc>
           <w:tcPr>
             <w:tcW w:w="1701" w:type="dxa"/>
-            <w:shd w:val="clear" w:color="auto" w:fill="E8EEF6"/>
             <w:vAlign w:val="center"/>
           </w:tcPr>
           <w:p>
@@ -6160,7 +6150,6 @@
         <w:tc>
           <w:tcPr>
             <w:tcW w:w="2041" w:type="dxa"/>
-            <w:shd w:val="clear" w:color="auto" w:fill="E8EEF6"/>
             <w:vAlign w:val="center"/>
           </w:tcPr>
           <w:p>
@@ -6183,7 +6172,6 @@
         <w:tc>
           <w:tcPr>
             <w:tcW w:w="3005" w:type="dxa"/>
-            <w:shd w:val="clear" w:color="auto" w:fill="E8EEF6"/>
             <w:vAlign w:val="center"/>
           </w:tcPr>
           <w:p>
@@ -6206,7 +6194,6 @@
         <w:tc>
           <w:tcPr>
             <w:tcW w:w="2268" w:type="dxa"/>
-            <w:shd w:val="clear" w:color="auto" w:fill="E8EEF6"/>
             <w:vAlign w:val="center"/>
           </w:tcPr>
           <w:p>
@@ -7337,7 +7324,7 @@
       <w:pPr>
         <w:pStyle w:val="Heading2"/>
       </w:pPr>
-      <w:bookmarkStart w:id="8" w:name="_Toc244043906"/>
+      <w:bookmarkStart w:id="8" w:name="_Toc244044062"/>
       <w:r>
         <w:rPr>
           <w:cs/>
@@ -7615,7 +7602,7 @@
         <w:pStyle w:val="Heading1"/>
         <w:pageBreakBefore/>
       </w:pPr>
-      <w:bookmarkStart w:id="9" w:name="_Toc244043907"/>
+      <w:bookmarkStart w:id="9" w:name="_Toc244044063"/>
       <w:r>
         <w:rPr>
           <w:cs/>
@@ -7631,7 +7618,7 @@
       <w:pPr>
         <w:pStyle w:val="Heading2"/>
       </w:pPr>
-      <w:bookmarkStart w:id="10" w:name="_Toc244043908"/>
+      <w:bookmarkStart w:id="10" w:name="_Toc244044064"/>
       <w:r>
         <w:rPr>
           <w:cs/>
@@ -7767,7 +7754,6 @@
         <w:tc>
           <w:tcPr>
             <w:tcW w:w="1701" w:type="dxa"/>
-            <w:shd w:val="clear" w:color="auto" w:fill="E8EEF6"/>
             <w:vAlign w:val="center"/>
           </w:tcPr>
           <w:p>
@@ -7790,7 +7776,6 @@
         <w:tc>
           <w:tcPr>
             <w:tcW w:w="4195" w:type="dxa"/>
-            <w:shd w:val="clear" w:color="auto" w:fill="E8EEF6"/>
             <w:vAlign w:val="center"/>
           </w:tcPr>
           <w:p>
@@ -7813,7 +7798,6 @@
         <w:tc>
           <w:tcPr>
             <w:tcW w:w="3118" w:type="dxa"/>
-            <w:shd w:val="clear" w:color="auto" w:fill="E8EEF6"/>
             <w:vAlign w:val="center"/>
           </w:tcPr>
           <w:p>
@@ -8164,7 +8148,7 @@
           <w:noProof/>
         </w:rPr>
         <w:drawing>
-          <wp:inline distT="0" distB="0" distL="0" distR="0" wp14:anchorId="28CC692D" wp14:editId="44EBA822">
+          <wp:inline distT="0" distB="0" distL="0" distR="0" wp14:anchorId="62CC679C" wp14:editId="56AFC129">
             <wp:extent cx="5760000" cy="3168000"/>
             <wp:effectExtent l="0" t="0" r="0" b="0"/>
             <wp:docPr id="1" name="Picture 1"/>
@@ -8250,7 +8234,7 @@
       <w:pPr>
         <w:pStyle w:val="Heading2"/>
       </w:pPr>
-      <w:bookmarkStart w:id="11" w:name="_Toc244043909"/>
+      <w:bookmarkStart w:id="11" w:name="_Toc244044065"/>
       <w:r>
         <w:t xml:space="preserve">3.2 Level 0: </w:t>
       </w:r>
@@ -8273,7 +8257,7 @@
           <w:noProof/>
         </w:rPr>
         <w:drawing>
-          <wp:inline distT="0" distB="0" distL="0" distR="0" wp14:anchorId="1F9DF074" wp14:editId="091E4C4A">
+          <wp:inline distT="0" distB="0" distL="0" distR="0" wp14:anchorId="2F92148B" wp14:editId="122AD963">
             <wp:extent cx="5760000" cy="2962286"/>
             <wp:effectExtent l="0" t="0" r="0" b="0"/>
             <wp:docPr id="2" name="Picture 2"/>
@@ -8572,7 +8556,7 @@
       <w:pPr>
         <w:pStyle w:val="Heading2"/>
       </w:pPr>
-      <w:bookmarkStart w:id="12" w:name="_Toc244043910"/>
+      <w:bookmarkStart w:id="12" w:name="_Toc244044066"/>
       <w:r>
         <w:t xml:space="preserve">3.3 Level 1: </w:t>
       </w:r>
@@ -8649,7 +8633,7 @@
           <w:noProof/>
         </w:rPr>
         <w:drawing>
-          <wp:inline distT="0" distB="0" distL="0" distR="0" wp14:anchorId="6A61648F" wp14:editId="355BAC33">
+          <wp:inline distT="0" distB="0" distL="0" distR="0" wp14:anchorId="10E269FC" wp14:editId="590892CE">
             <wp:extent cx="5760000" cy="3240000"/>
             <wp:effectExtent l="0" t="0" r="0" b="0"/>
             <wp:docPr id="3" name="Picture 3"/>
@@ -8781,7 +8765,7 @@
           <w:noProof/>
         </w:rPr>
         <w:drawing>
-          <wp:inline distT="0" distB="0" distL="0" distR="0" wp14:anchorId="18E9E9BC" wp14:editId="60B89687">
+          <wp:inline distT="0" distB="0" distL="0" distR="0" wp14:anchorId="38F4D3C2" wp14:editId="236C9B09">
             <wp:extent cx="5760000" cy="2150400"/>
             <wp:effectExtent l="0" t="0" r="0" b="0"/>
             <wp:docPr id="4" name="Picture 4"/>
@@ -8941,7 +8925,6 @@
         <w:tc>
           <w:tcPr>
             <w:tcW w:w="2041" w:type="dxa"/>
-            <w:shd w:val="clear" w:color="auto" w:fill="E8EEF6"/>
             <w:vAlign w:val="center"/>
           </w:tcPr>
           <w:p>
@@ -8964,7 +8947,6 @@
         <w:tc>
           <w:tcPr>
             <w:tcW w:w="907" w:type="dxa"/>
-            <w:shd w:val="clear" w:color="auto" w:fill="E8EEF6"/>
             <w:vAlign w:val="center"/>
           </w:tcPr>
           <w:p>
@@ -8987,7 +8969,6 @@
         <w:tc>
           <w:tcPr>
             <w:tcW w:w="1928" w:type="dxa"/>
-            <w:shd w:val="clear" w:color="auto" w:fill="E8EEF6"/>
             <w:vAlign w:val="center"/>
           </w:tcPr>
           <w:p>
@@ -9010,7 +8991,6 @@
         <w:tc>
           <w:tcPr>
             <w:tcW w:w="4139" w:type="dxa"/>
-            <w:shd w:val="clear" w:color="auto" w:fill="E8EEF6"/>
             <w:vAlign w:val="center"/>
           </w:tcPr>
           <w:p>
@@ -9821,7 +9801,7 @@
       <w:pPr>
         <w:pStyle w:val="Heading2"/>
       </w:pPr>
-      <w:bookmarkStart w:id="13" w:name="_Toc244043911"/>
+      <w:bookmarkStart w:id="13" w:name="_Toc244044067"/>
       <w:r>
         <w:t xml:space="preserve">3.4 Level 2–3: </w:t>
       </w:r>
@@ -11125,7 +11105,6 @@
         <w:tc>
           <w:tcPr>
             <w:tcW w:w="9014" w:type="dxa"/>
-            <w:shd w:val="clear" w:color="auto" w:fill="F6F7F9"/>
           </w:tcPr>
           <w:p>
             <w:r>
@@ -11292,7 +11271,6 @@
         <w:tc>
           <w:tcPr>
             <w:tcW w:w="1474" w:type="dxa"/>
-            <w:shd w:val="clear" w:color="auto" w:fill="E8EEF6"/>
             <w:vAlign w:val="center"/>
           </w:tcPr>
           <w:p>
@@ -11315,7 +11293,6 @@
         <w:tc>
           <w:tcPr>
             <w:tcW w:w="3969" w:type="dxa"/>
-            <w:shd w:val="clear" w:color="auto" w:fill="E8EEF6"/>
             <w:vAlign w:val="center"/>
           </w:tcPr>
           <w:p>
@@ -11338,7 +11315,6 @@
         <w:tc>
           <w:tcPr>
             <w:tcW w:w="3572" w:type="dxa"/>
-            <w:shd w:val="clear" w:color="auto" w:fill="E8EEF6"/>
             <w:vAlign w:val="center"/>
           </w:tcPr>
           <w:p>
@@ -12332,7 +12308,6 @@
         <w:tc>
           <w:tcPr>
             <w:tcW w:w="9014" w:type="dxa"/>
-            <w:shd w:val="clear" w:color="auto" w:fill="F6F7F9"/>
           </w:tcPr>
           <w:p>
             <w:r>
@@ -12613,7 +12588,7 @@
       <w:pPr>
         <w:pStyle w:val="Heading2"/>
       </w:pPr>
-      <w:bookmarkStart w:id="14" w:name="_Toc244043912"/>
+      <w:bookmarkStart w:id="14" w:name="_Toc244044068"/>
       <w:r>
         <w:rPr>
           <w:cs/>
@@ -12636,7 +12611,7 @@
           <w:noProof/>
         </w:rPr>
         <w:drawing>
-          <wp:inline distT="0" distB="0" distL="0" distR="0" wp14:anchorId="2473B2F4" wp14:editId="05A5026D">
+          <wp:inline distT="0" distB="0" distL="0" distR="0" wp14:anchorId="18846EC8" wp14:editId="2B9A9F36">
             <wp:extent cx="5760000" cy="3600000"/>
             <wp:effectExtent l="0" t="0" r="0" b="0"/>
             <wp:docPr id="5" name="Picture 5"/>
@@ -12715,7 +12690,7 @@
       <w:pPr>
         <w:pStyle w:val="Heading2"/>
       </w:pPr>
-      <w:bookmarkStart w:id="15" w:name="_Toc244043913"/>
+      <w:bookmarkStart w:id="15" w:name="_Toc244044069"/>
       <w:r>
         <w:rPr>
           <w:cs/>
@@ -12814,7 +12789,6 @@
         <w:tc>
           <w:tcPr>
             <w:tcW w:w="2041" w:type="dxa"/>
-            <w:shd w:val="clear" w:color="auto" w:fill="E8EEF6"/>
             <w:vAlign w:val="center"/>
           </w:tcPr>
           <w:p>
@@ -12837,7 +12811,6 @@
         <w:tc>
           <w:tcPr>
             <w:tcW w:w="4309" w:type="dxa"/>
-            <w:shd w:val="clear" w:color="auto" w:fill="E8EEF6"/>
             <w:vAlign w:val="center"/>
           </w:tcPr>
           <w:p>
@@ -12860,7 +12833,6 @@
         <w:tc>
           <w:tcPr>
             <w:tcW w:w="2665" w:type="dxa"/>
-            <w:shd w:val="clear" w:color="auto" w:fill="E8EEF6"/>
             <w:vAlign w:val="center"/>
           </w:tcPr>
           <w:p>
@@ -13161,7 +13133,6 @@
         <w:tc>
           <w:tcPr>
             <w:tcW w:w="1134" w:type="dxa"/>
-            <w:shd w:val="clear" w:color="auto" w:fill="E8EEF6"/>
             <w:vAlign w:val="center"/>
           </w:tcPr>
           <w:p>
@@ -13182,7 +13153,6 @@
         <w:tc>
           <w:tcPr>
             <w:tcW w:w="3402" w:type="dxa"/>
-            <w:shd w:val="clear" w:color="auto" w:fill="E8EEF6"/>
             <w:vAlign w:val="center"/>
           </w:tcPr>
           <w:p>
@@ -13205,7 +13175,6 @@
         <w:tc>
           <w:tcPr>
             <w:tcW w:w="4479" w:type="dxa"/>
-            <w:shd w:val="clear" w:color="auto" w:fill="E8EEF6"/>
             <w:vAlign w:val="center"/>
           </w:tcPr>
           <w:p>
@@ -13629,7 +13598,6 @@
         <w:tc>
           <w:tcPr>
             <w:tcW w:w="1984" w:type="dxa"/>
-            <w:shd w:val="clear" w:color="auto" w:fill="E8EEF6"/>
             <w:vAlign w:val="center"/>
           </w:tcPr>
           <w:p>
@@ -13660,7 +13628,6 @@
         <w:tc>
           <w:tcPr>
             <w:tcW w:w="7030" w:type="dxa"/>
-            <w:shd w:val="clear" w:color="auto" w:fill="E8EEF6"/>
             <w:vAlign w:val="center"/>
           </w:tcPr>
           <w:p>
@@ -13950,7 +13917,7 @@
       <w:pPr>
         <w:pStyle w:val="Heading2"/>
       </w:pPr>
-      <w:bookmarkStart w:id="16" w:name="_Toc244043914"/>
+      <w:bookmarkStart w:id="16" w:name="_Toc244044070"/>
       <w:r>
         <w:rPr>
           <w:cs/>
@@ -14190,7 +14157,7 @@
       <w:pPr>
         <w:pStyle w:val="Heading2"/>
       </w:pPr>
-      <w:bookmarkStart w:id="17" w:name="_Toc244043915"/>
+      <w:bookmarkStart w:id="17" w:name="_Toc244044071"/>
       <w:r>
         <w:rPr>
           <w:cs/>
@@ -14257,7 +14224,6 @@
         <w:tc>
           <w:tcPr>
             <w:tcW w:w="1701" w:type="dxa"/>
-            <w:shd w:val="clear" w:color="auto" w:fill="E8EEF6"/>
             <w:vAlign w:val="center"/>
           </w:tcPr>
           <w:p>
@@ -14280,7 +14246,6 @@
         <w:tc>
           <w:tcPr>
             <w:tcW w:w="3061" w:type="dxa"/>
-            <w:shd w:val="clear" w:color="auto" w:fill="E8EEF6"/>
             <w:vAlign w:val="center"/>
           </w:tcPr>
           <w:p>
@@ -14303,7 +14268,6 @@
         <w:tc>
           <w:tcPr>
             <w:tcW w:w="4252" w:type="dxa"/>
-            <w:shd w:val="clear" w:color="auto" w:fill="E8EEF6"/>
             <w:vAlign w:val="center"/>
           </w:tcPr>
           <w:p>
@@ -15125,7 +15089,7 @@
         <w:pStyle w:val="Heading1"/>
         <w:pageBreakBefore/>
       </w:pPr>
-      <w:bookmarkStart w:id="18" w:name="_Toc244043916"/>
+      <w:bookmarkStart w:id="18" w:name="_Toc244044072"/>
       <w:r>
         <w:rPr>
           <w:cs/>
@@ -15138,7 +15102,7 @@
       <w:pPr>
         <w:pStyle w:val="Heading2"/>
       </w:pPr>
-      <w:bookmarkStart w:id="19" w:name="_Toc244043917"/>
+      <w:bookmarkStart w:id="19" w:name="_Toc244044073"/>
       <w:r>
         <w:rPr>
           <w:cs/>
@@ -15204,7 +15168,6 @@
         <w:tc>
           <w:tcPr>
             <w:tcW w:w="3118" w:type="dxa"/>
-            <w:shd w:val="clear" w:color="auto" w:fill="E8EEF6"/>
             <w:vAlign w:val="center"/>
           </w:tcPr>
           <w:p>
@@ -15227,7 +15190,6 @@
         <w:tc>
           <w:tcPr>
             <w:tcW w:w="5896" w:type="dxa"/>
-            <w:shd w:val="clear" w:color="auto" w:fill="E8EEF6"/>
             <w:vAlign w:val="center"/>
           </w:tcPr>
           <w:p>
@@ -15578,7 +15540,7 @@
       <w:pPr>
         <w:pStyle w:val="Heading2"/>
       </w:pPr>
-      <w:bookmarkStart w:id="20" w:name="_Toc244043918"/>
+      <w:bookmarkStart w:id="20" w:name="_Toc244044074"/>
       <w:r>
         <w:rPr>
           <w:cs/>
@@ -15847,7 +15809,7 @@
       <w:pPr>
         <w:pStyle w:val="Heading2"/>
       </w:pPr>
-      <w:bookmarkStart w:id="21" w:name="_Toc244043919"/>
+      <w:bookmarkStart w:id="21" w:name="_Toc244044075"/>
       <w:r>
         <w:rPr>
           <w:cs/>
@@ -15895,7 +15857,6 @@
         <w:tc>
           <w:tcPr>
             <w:tcW w:w="9014" w:type="dxa"/>
-            <w:shd w:val="clear" w:color="auto" w:fill="F6F7F9"/>
           </w:tcPr>
           <w:p>
             <w:r>
@@ -16204,7 +16165,7 @@
       <w:pPr>
         <w:pStyle w:val="Heading2"/>
       </w:pPr>
-      <w:bookmarkStart w:id="22" w:name="_Toc244043920"/>
+      <w:bookmarkStart w:id="22" w:name="_Toc244044076"/>
       <w:r>
         <w:rPr>
           <w:cs/>
@@ -16271,7 +16232,6 @@
         <w:tc>
           <w:tcPr>
             <w:tcW w:w="2608" w:type="dxa"/>
-            <w:shd w:val="clear" w:color="auto" w:fill="E8EEF6"/>
             <w:vAlign w:val="center"/>
           </w:tcPr>
           <w:p>
@@ -16294,7 +16254,6 @@
         <w:tc>
           <w:tcPr>
             <w:tcW w:w="2835" w:type="dxa"/>
-            <w:shd w:val="clear" w:color="auto" w:fill="E8EEF6"/>
             <w:vAlign w:val="center"/>
           </w:tcPr>
           <w:p>
@@ -16317,7 +16276,6 @@
         <w:tc>
           <w:tcPr>
             <w:tcW w:w="3572" w:type="dxa"/>
-            <w:shd w:val="clear" w:color="auto" w:fill="E8EEF6"/>
             <w:vAlign w:val="center"/>
           </w:tcPr>
           <w:p>
@@ -17172,7 +17130,7 @@
       <w:pPr>
         <w:pStyle w:val="Heading2"/>
       </w:pPr>
-      <w:bookmarkStart w:id="23" w:name="_Toc244043921"/>
+      <w:bookmarkStart w:id="23" w:name="_Toc244044077"/>
       <w:r>
         <w:rPr>
           <w:cs/>
@@ -17294,7 +17252,6 @@
         <w:tc>
           <w:tcPr>
             <w:tcW w:w="2835" w:type="dxa"/>
-            <w:shd w:val="clear" w:color="auto" w:fill="E8EEF6"/>
             <w:vAlign w:val="center"/>
           </w:tcPr>
           <w:p>
@@ -17317,7 +17274,6 @@
         <w:tc>
           <w:tcPr>
             <w:tcW w:w="2041" w:type="dxa"/>
-            <w:shd w:val="clear" w:color="auto" w:fill="E8EEF6"/>
             <w:vAlign w:val="center"/>
           </w:tcPr>
           <w:p>
@@ -17340,7 +17296,6 @@
         <w:tc>
           <w:tcPr>
             <w:tcW w:w="2041" w:type="dxa"/>
-            <w:shd w:val="clear" w:color="auto" w:fill="E8EEF6"/>
             <w:vAlign w:val="center"/>
           </w:tcPr>
           <w:p>
@@ -17363,7 +17318,6 @@
         <w:tc>
           <w:tcPr>
             <w:tcW w:w="2098" w:type="dxa"/>
-            <w:shd w:val="clear" w:color="auto" w:fill="E8EEF6"/>
             <w:vAlign w:val="center"/>
           </w:tcPr>
           <w:p>
@@ -18004,7 +17958,7 @@
         <w:pStyle w:val="Heading1"/>
         <w:pageBreakBefore/>
       </w:pPr>
-      <w:bookmarkStart w:id="24" w:name="_Toc244043922"/>
+      <w:bookmarkStart w:id="24" w:name="_Toc244044078"/>
       <w:r>
         <w:rPr>
           <w:cs/>
@@ -18017,7 +17971,7 @@
       <w:pPr>
         <w:pStyle w:val="Heading2"/>
       </w:pPr>
-      <w:bookmarkStart w:id="25" w:name="_Toc244043923"/>
+      <w:bookmarkStart w:id="25" w:name="_Toc244044079"/>
       <w:r>
         <w:rPr>
           <w:cs/>
@@ -18198,7 +18152,7 @@
       <w:pPr>
         <w:pStyle w:val="Heading2"/>
       </w:pPr>
-      <w:bookmarkStart w:id="26" w:name="_Toc244043924"/>
+      <w:bookmarkStart w:id="26" w:name="_Toc244044080"/>
       <w:r>
         <w:rPr>
           <w:cs/>
@@ -18264,7 +18218,6 @@
         <w:tc>
           <w:tcPr>
             <w:tcW w:w="5102" w:type="dxa"/>
-            <w:shd w:val="clear" w:color="auto" w:fill="E8EEF6"/>
             <w:vAlign w:val="center"/>
           </w:tcPr>
           <w:p>
@@ -18287,7 +18240,6 @@
         <w:tc>
           <w:tcPr>
             <w:tcW w:w="3912" w:type="dxa"/>
-            <w:shd w:val="clear" w:color="auto" w:fill="E8EEF6"/>
             <w:vAlign w:val="center"/>
           </w:tcPr>
           <w:p>
@@ -18670,7 +18622,7 @@
       <w:pPr>
         <w:pStyle w:val="Heading2"/>
       </w:pPr>
-      <w:bookmarkStart w:id="27" w:name="_Toc244043925"/>
+      <w:bookmarkStart w:id="27" w:name="_Toc244044081"/>
       <w:r>
         <w:rPr>
           <w:cs/>
@@ -18737,7 +18689,6 @@
         <w:tc>
           <w:tcPr>
             <w:tcW w:w="2381" w:type="dxa"/>
-            <w:shd w:val="clear" w:color="auto" w:fill="E8EEF6"/>
             <w:vAlign w:val="center"/>
           </w:tcPr>
           <w:p>
@@ -18760,7 +18711,6 @@
         <w:tc>
           <w:tcPr>
             <w:tcW w:w="3402" w:type="dxa"/>
-            <w:shd w:val="clear" w:color="auto" w:fill="E8EEF6"/>
             <w:vAlign w:val="center"/>
           </w:tcPr>
           <w:p>
@@ -18783,7 +18733,6 @@
         <w:tc>
           <w:tcPr>
             <w:tcW w:w="3231" w:type="dxa"/>
-            <w:shd w:val="clear" w:color="auto" w:fill="E8EEF6"/>
             <w:vAlign w:val="center"/>
           </w:tcPr>
           <w:p>
@@ -19316,7 +19265,7 @@
       <w:pPr>
         <w:pStyle w:val="Heading2"/>
       </w:pPr>
-      <w:bookmarkStart w:id="28" w:name="_Toc244043926"/>
+      <w:bookmarkStart w:id="28" w:name="_Toc244044082"/>
       <w:r>
         <w:rPr>
           <w:cs/>
@@ -19398,7 +19347,6 @@
         <w:tc>
           <w:tcPr>
             <w:tcW w:w="1474" w:type="dxa"/>
-            <w:shd w:val="clear" w:color="auto" w:fill="E8EEF6"/>
             <w:vAlign w:val="center"/>
           </w:tcPr>
           <w:p>
@@ -19421,7 +19369,6 @@
         <w:tc>
           <w:tcPr>
             <w:tcW w:w="2494" w:type="dxa"/>
-            <w:shd w:val="clear" w:color="auto" w:fill="E8EEF6"/>
             <w:vAlign w:val="center"/>
           </w:tcPr>
           <w:p>
@@ -19444,7 +19391,6 @@
         <w:tc>
           <w:tcPr>
             <w:tcW w:w="3402" w:type="dxa"/>
-            <w:shd w:val="clear" w:color="auto" w:fill="E8EEF6"/>
             <w:vAlign w:val="center"/>
           </w:tcPr>
           <w:p>
@@ -19467,7 +19413,6 @@
         <w:tc>
           <w:tcPr>
             <w:tcW w:w="1644" w:type="dxa"/>
-            <w:shd w:val="clear" w:color="auto" w:fill="E8EEF6"/>
             <w:vAlign w:val="center"/>
           </w:tcPr>
           <w:p>
@@ -20966,7 +20911,7 @@
       <w:pPr>
         <w:pStyle w:val="Heading2"/>
       </w:pPr>
-      <w:bookmarkStart w:id="29" w:name="_Toc244043927"/>
+      <w:bookmarkStart w:id="29" w:name="_Toc244044083"/>
       <w:r>
         <w:rPr>
           <w:cs/>
@@ -21089,7 +21034,7 @@
         <w:pStyle w:val="Heading1"/>
         <w:pageBreakBefore/>
       </w:pPr>
-      <w:bookmarkStart w:id="30" w:name="_Toc244043928"/>
+      <w:bookmarkStart w:id="30" w:name="_Toc244044084"/>
       <w:r>
         <w:rPr>
           <w:cs/>
@@ -21102,7 +21047,7 @@
       <w:pPr>
         <w:pStyle w:val="Heading2"/>
       </w:pPr>
-      <w:bookmarkStart w:id="31" w:name="_Toc244043929"/>
+      <w:bookmarkStart w:id="31" w:name="_Toc244044085"/>
       <w:r>
         <w:rPr>
           <w:cs/>
@@ -21251,7 +21196,7 @@
       <w:pPr>
         <w:pStyle w:val="Heading2"/>
       </w:pPr>
-      <w:bookmarkStart w:id="32" w:name="_Toc244043930"/>
+      <w:bookmarkStart w:id="32" w:name="_Toc244044086"/>
       <w:r>
         <w:rPr>
           <w:cs/>
@@ -21367,7 +21312,7 @@
       <w:pPr>
         <w:pStyle w:val="Heading2"/>
       </w:pPr>
-      <w:bookmarkStart w:id="33" w:name="_Toc244043931"/>
+      <w:bookmarkStart w:id="33" w:name="_Toc244044087"/>
       <w:r>
         <w:rPr>
           <w:cs/>
@@ -21483,7 +21428,7 @@
         <w:pStyle w:val="Heading1"/>
         <w:pageBreakBefore/>
       </w:pPr>
-      <w:bookmarkStart w:id="34" w:name="_Toc244043932"/>
+      <w:bookmarkStart w:id="34" w:name="_Toc244044088"/>
       <w:r>
         <w:rPr>
           <w:cs/>
@@ -21558,7 +21503,6 @@
         <w:tc>
           <w:tcPr>
             <w:tcW w:w="3061" w:type="dxa"/>
-            <w:shd w:val="clear" w:color="auto" w:fill="E8EEF6"/>
             <w:vAlign w:val="center"/>
           </w:tcPr>
           <w:p>
@@ -21579,7 +21523,6 @@
         <w:tc>
           <w:tcPr>
             <w:tcW w:w="1020" w:type="dxa"/>
-            <w:shd w:val="clear" w:color="auto" w:fill="E8EEF6"/>
             <w:vAlign w:val="center"/>
           </w:tcPr>
           <w:p>
@@ -21602,7 +21545,6 @@
         <w:tc>
           <w:tcPr>
             <w:tcW w:w="2494" w:type="dxa"/>
-            <w:shd w:val="clear" w:color="auto" w:fill="E8EEF6"/>
             <w:vAlign w:val="center"/>
           </w:tcPr>
           <w:p>
@@ -21625,7 +21567,6 @@
         <w:tc>
           <w:tcPr>
             <w:tcW w:w="2438" w:type="dxa"/>
-            <w:shd w:val="clear" w:color="auto" w:fill="E8EEF6"/>
             <w:vAlign w:val="center"/>
           </w:tcPr>
           <w:p>
@@ -22908,7 +22849,6 @@
         <w:tc>
           <w:tcPr>
             <w:tcW w:w="2154" w:type="dxa"/>
-            <w:shd w:val="clear" w:color="auto" w:fill="E8EEF6"/>
             <w:vAlign w:val="center"/>
           </w:tcPr>
           <w:p>
@@ -22929,7 +22869,6 @@
         <w:tc>
           <w:tcPr>
             <w:tcW w:w="907" w:type="dxa"/>
-            <w:shd w:val="clear" w:color="auto" w:fill="E8EEF6"/>
             <w:vAlign w:val="center"/>
           </w:tcPr>
           <w:p>
@@ -22952,7 +22891,6 @@
         <w:tc>
           <w:tcPr>
             <w:tcW w:w="2268" w:type="dxa"/>
-            <w:shd w:val="clear" w:color="auto" w:fill="E8EEF6"/>
             <w:vAlign w:val="center"/>
           </w:tcPr>
           <w:p>
@@ -22975,7 +22913,6 @@
         <w:tc>
           <w:tcPr>
             <w:tcW w:w="3685" w:type="dxa"/>
-            <w:shd w:val="clear" w:color="auto" w:fill="E8EEF6"/>
             <w:vAlign w:val="center"/>
           </w:tcPr>
           <w:p>
@@ -23685,7 +23622,7 @@
         <w:pStyle w:val="Heading1"/>
         <w:pageBreakBefore/>
       </w:pPr>
-      <w:bookmarkStart w:id="35" w:name="_Toc244043933"/>
+      <w:bookmarkStart w:id="35" w:name="_Toc244044089"/>
       <w:r>
         <w:rPr>
           <w:cs/>
@@ -23753,7 +23690,6 @@
         <w:tc>
           <w:tcPr>
             <w:tcW w:w="2268" w:type="dxa"/>
-            <w:shd w:val="clear" w:color="auto" w:fill="E8EEF6"/>
             <w:vAlign w:val="center"/>
           </w:tcPr>
           <w:p>
@@ -23776,7 +23712,6 @@
         <w:tc>
           <w:tcPr>
             <w:tcW w:w="2268" w:type="dxa"/>
-            <w:shd w:val="clear" w:color="auto" w:fill="E8EEF6"/>
             <w:vAlign w:val="center"/>
           </w:tcPr>
           <w:p>
@@ -23799,7 +23734,6 @@
         <w:tc>
           <w:tcPr>
             <w:tcW w:w="2268" w:type="dxa"/>
-            <w:shd w:val="clear" w:color="auto" w:fill="E8EEF6"/>
             <w:vAlign w:val="center"/>
           </w:tcPr>
           <w:p>
@@ -23822,7 +23756,6 @@
         <w:tc>
           <w:tcPr>
             <w:tcW w:w="2211" w:type="dxa"/>
-            <w:shd w:val="clear" w:color="auto" w:fill="E8EEF6"/>
             <w:vAlign w:val="center"/>
           </w:tcPr>
           <w:p>
@@ -24615,7 +24548,6 @@
         <w:tc>
           <w:tcPr>
             <w:tcW w:w="2268" w:type="dxa"/>
-            <w:shd w:val="clear" w:color="auto" w:fill="E8EEF6"/>
             <w:vAlign w:val="center"/>
           </w:tcPr>
           <w:p>
@@ -24638,7 +24570,6 @@
         <w:tc>
           <w:tcPr>
             <w:tcW w:w="6746" w:type="dxa"/>
-            <w:shd w:val="clear" w:color="auto" w:fill="E8EEF6"/>
             <w:vAlign w:val="center"/>
           </w:tcPr>
           <w:p>
@@ -25093,8 +25024,7 @@
       </w:pPr>
     </w:p>
     <w:sectPr>
-      <w:headerReference w:type="default" r:id="rId13"/>
-      <w:footerReference w:type="default" r:id="rId14"/>
+      <w:footerReference w:type="default" r:id="rId13"/>
       <w:pgSz w:w="11906" w:h="16838"/>
       <w:pgMar w:top="1440" w:right="1440" w:bottom="1440" w:left="1440" w:header="720" w:footer="720" w:gutter="0"/>
       <w:cols w:space="720"/>
@@ -25167,28 +25097,6 @@
     </w:p>
   </w:footnote>
 </w:footnotes>
-</file>
-
-<file path=word/header1.xml><?xml version="1.0" encoding="utf-8"?>
-<w:hdr xmlns:wpc="http://schemas.microsoft.com/office/word/2010/wordprocessingCanvas" xmlns:cx="http://schemas.microsoft.com/office/drawing/2014/chartex" xmlns:cx1="http://schemas.microsoft.com/office/drawing/2015/9/8/chartex" xmlns:cx2="http://schemas.microsoft.com/office/drawing/2015/10/21/chartex" xmlns:cx3="http://schemas.microsoft.com/office/drawing/2016/5/9/chartex" xmlns:cx4="http://schemas.microsoft.com/office/drawing/2016/5/10/chartex" xmlns:cx5="http://schemas.microsoft.com/office/drawing/2016/5/11/chartex" xmlns:cx6="http://schemas.microsoft.com/office/drawing/2016/5/12/chartex" xmlns:cx7="http://schemas.microsoft.com/office/drawing/2016/5/13/chartex" xmlns:cx8="http://schemas.microsoft.com/office/drawing/2016/5/14/chartex" xmlns:mc="http://schemas.openxmlformats.org/markup-compatibility/2006" xmlns:aink="http://schemas.microsoft.com/office/drawing/2016/ink" xmlns:am3d="http://schemas.microsoft.com/office/drawing/2017/model3d" xmlns:o="urn:schemas-microsoft-com:office:office" xmlns:oel="http://schemas.microsoft.com/office/2019/extlst" xmlns:r="http://schemas.openxmlformats.org/officeDocument/2006/relationships" xmlns:m="http://schemas.openxmlformats.org/officeDocument/2006/math" xmlns:v="urn:schemas-microsoft-com:vml" xmlns:wp14="http://schemas.microsoft.com/office/word/2010/wordprocessingDrawing" xmlns:wp="http://schemas.openxmlformats.org/drawingml/2006/wordprocessingDrawing" xmlns:w10="urn:schemas-microsoft-com:office:word" xmlns:w="http://schemas.openxmlformats.org/wordprocessingml/2006/main" xmlns:w14="http://schemas.microsoft.com/office/word/2010/wordml" xmlns:w15="http://schemas.microsoft.com/office/word/2012/wordml" xmlns:w16cex="http://schemas.microsoft.com/office/word/2018/wordml/cex" xmlns:w16cid="http://schemas.microsoft.com/office/word/2016/wordml/cid" xmlns:w16="http://schemas.microsoft.com/office/word/2018/wordml" xmlns:w16du="http://schemas.microsoft.com/office/word/2023/wordml/word16du" xmlns:w16sdtdh="http://schemas.microsoft.com/office/word/2020/wordml/sdtdatahash" xmlns:w16sdtfl="http://schemas.microsoft.com/office/word/2024/wordml/sdtformatlock" xmlns:w16se="http://schemas.microsoft.com/office/word/2015/wordml/symex" xmlns:wpg="http://schemas.microsoft.com/office/word/2010/wordprocessingGroup" xmlns:wpi="http://schemas.microsoft.com/office/word/2010/wordprocessingInk" xmlns:wne="http://schemas.microsoft.com/office/word/2006/wordml" xmlns:wps="http://schemas.microsoft.com/office/word/2010/wordprocessingShape" mc:Ignorable="w14 w15 w16se w16cid w16 w16cex w16sdtdh w16sdtfl w16du wp14">
-  <w:p>
-    <w:pPr>
-      <w:pStyle w:val="Header"/>
-      <w:pBdr>
-        <w:bottom w:val="single" w:sz="4" w:space="4" w:color="BFC5CC"/>
-      </w:pBdr>
-      <w:jc w:val="right"/>
-    </w:pPr>
-    <w:r>
-      <w:rPr>
-        <w:color w:val="7F7F7F"/>
-        <w:sz w:val="24"/>
-        <w:szCs w:val="24"/>
-      </w:rPr>
-      <w:t>Design Document · Smart Library</w:t>
-    </w:r>
-  </w:p>
-</w:hdr>
 </file>
 
 <file path=word/numbering.xml><?xml version="1.0" encoding="utf-8"?>
@@ -25364,31 +25272,31 @@
       </w:rPr>
     </w:lvl>
   </w:abstractNum>
-  <w:num w:numId="1" w16cid:durableId="1598901003">
+  <w:num w:numId="1" w16cid:durableId="1339189693">
     <w:abstractNumId w:val="8"/>
   </w:num>
-  <w:num w:numId="2" w16cid:durableId="1081297704">
+  <w:num w:numId="2" w16cid:durableId="25103299">
     <w:abstractNumId w:val="6"/>
   </w:num>
-  <w:num w:numId="3" w16cid:durableId="865095393">
+  <w:num w:numId="3" w16cid:durableId="2138405563">
     <w:abstractNumId w:val="5"/>
   </w:num>
-  <w:num w:numId="4" w16cid:durableId="1714235651">
+  <w:num w:numId="4" w16cid:durableId="109396108">
     <w:abstractNumId w:val="4"/>
   </w:num>
-  <w:num w:numId="5" w16cid:durableId="1581674139">
+  <w:num w:numId="5" w16cid:durableId="456415837">
     <w:abstractNumId w:val="7"/>
   </w:num>
-  <w:num w:numId="6" w16cid:durableId="2070959460">
+  <w:num w:numId="6" w16cid:durableId="178356091">
     <w:abstractNumId w:val="3"/>
   </w:num>
-  <w:num w:numId="7" w16cid:durableId="1839419996">
+  <w:num w:numId="7" w16cid:durableId="1545286193">
     <w:abstractNumId w:val="2"/>
   </w:num>
-  <w:num w:numId="8" w16cid:durableId="1582106042">
+  <w:num w:numId="8" w16cid:durableId="1421104890">
     <w:abstractNumId w:val="1"/>
   </w:num>
-  <w:num w:numId="9" w16cid:durableId="1202940287">
+  <w:num w:numId="9" w16cid:durableId="1058238391">
     <w:abstractNumId w:val="0"/>
   </w:num>
 </w:numbering>
@@ -25805,7 +25713,6 @@
       <w:keepNext/>
       <w:keepLines/>
       <w:spacing w:after="360"/>
-      <w:jc w:val="center"/>
       <w:outlineLvl w:val="0"/>
     </w:pPr>
     <w:rPr>
@@ -36806,7 +36713,7 @@
     <w:autoRedefine/>
     <w:uiPriority w:val="39"/>
     <w:unhideWhenUsed/>
-    <w:rsid w:val="00D3745A"/>
+    <w:rsid w:val="004D07CE"/>
     <w:pPr>
       <w:spacing w:after="100"/>
     </w:pPr>
@@ -36822,7 +36729,7 @@
     <w:autoRedefine/>
     <w:uiPriority w:val="39"/>
     <w:unhideWhenUsed/>
-    <w:rsid w:val="00D3745A"/>
+    <w:rsid w:val="004D07CE"/>
     <w:pPr>
       <w:spacing w:after="100"/>
       <w:ind w:left="320"/>
@@ -36837,7 +36744,7 @@
     <w:basedOn w:val="DefaultParagraphFont"/>
     <w:uiPriority w:val="99"/>
     <w:unhideWhenUsed/>
-    <w:rsid w:val="00D3745A"/>
+    <w:rsid w:val="004D07CE"/>
     <w:rPr>
       <w:color w:val="0000FF" w:themeColor="hyperlink"/>
       <w:u w:val="single"/>

</xml_diff>

<commit_message>
Design doc: follow the sample Design Document layout
- Cover with KMITL seal, 'จัดทำโดย' and 'วิชา' blocks
- Chapters as in the sample: บทนำ, ทฤษฎี, อุปกรณ์และเครื่องมือ,
  การออกแบบและการพัฒนา, โค้ด VHDL, ผลการทดลอง, สรุป, แหล่งจัดเก็บข้อมูล
- Centered chapter titles on new pages, 'ภาพที่' captions
- Redrawn figures at 1000px width so text stays readable when printed
- Table identifiers at body size, results column is a checkbox only
</commit_message>
<xml_diff>
--- a/DesignDocument_SmartLibrary.docx
+++ b/DesignDocument_SmartLibrary.docx
@@ -350,7 +350,7 @@
           <w:tab w:val="right" w:leader="dot" w:pos="9016"/>
         </w:tabs>
         <w:rPr>
-          <w:rFonts w:eastAsiaTheme="minorEastAsia" w:cs="TH Sarabun New"/>
+          <w:rFonts w:eastAsiaTheme="minorEastAsia" w:cs="TH SarabunIT๙"/>
           <w:noProof/>
           <w:kern w:val="2"/>
           <w:szCs w:val="32"/>
@@ -359,30 +359,30 @@
       </w:pPr>
       <w:r>
         <w:rPr>
-          <w:rFonts w:cs="TH Sarabun New"/>
+          <w:rFonts w:cs="TH SarabunIT๙"/>
           <w:szCs w:val="32"/>
         </w:rPr>
         <w:fldChar w:fldCharType="begin"/>
       </w:r>
       <w:r>
         <w:rPr>
-          <w:rFonts w:cs="TH Sarabun New"/>
+          <w:rFonts w:cs="TH SarabunIT๙"/>
           <w:szCs w:val="32"/>
         </w:rPr>
         <w:instrText>TOC \o "1-2" \h \z \u</w:instrText>
       </w:r>
       <w:r>
         <w:rPr>
-          <w:rFonts w:cs="TH Sarabun New"/>
+          <w:rFonts w:cs="TH SarabunIT๙"/>
           <w:szCs w:val="32"/>
         </w:rPr>
         <w:fldChar w:fldCharType="separate"/>
       </w:r>
-      <w:hyperlink w:anchor="_Toc244044730" w:history="1">
+      <w:hyperlink w:anchor="_Toc244045415" w:history="1">
         <w:r>
           <w:rPr>
             <w:rStyle w:val="Hyperlink"/>
-            <w:rFonts w:cs="TH Sarabun New"/>
+            <w:rFonts w:cs="TH SarabunIT๙"/>
             <w:noProof/>
             <w:szCs w:val="32"/>
             <w:cs/>
@@ -391,7 +391,7 @@
         </w:r>
         <w:r>
           <w:rPr>
-            <w:rFonts w:cs="TH Sarabun New"/>
+            <w:rFonts w:cs="TH SarabunIT๙"/>
             <w:noProof/>
             <w:webHidden/>
             <w:szCs w:val="32"/>
@@ -400,7 +400,7 @@
         </w:r>
         <w:r>
           <w:rPr>
-            <w:rFonts w:cs="TH Sarabun New"/>
+            <w:rFonts w:cs="TH SarabunIT๙"/>
             <w:noProof/>
             <w:webHidden/>
             <w:szCs w:val="32"/>
@@ -409,16 +409,16 @@
         </w:r>
         <w:r>
           <w:rPr>
-            <w:rFonts w:cs="TH Sarabun New"/>
+            <w:rFonts w:cs="TH SarabunIT๙"/>
             <w:noProof/>
             <w:webHidden/>
             <w:szCs w:val="32"/>
           </w:rPr>
-          <w:instrText xml:space="preserve"> PAGEREF _Toc244044730 \h </w:instrText>
+          <w:instrText xml:space="preserve"> PAGEREF _Toc244045415 \h </w:instrText>
         </w:r>
         <w:r>
           <w:rPr>
-            <w:rFonts w:cs="TH Sarabun New"/>
+            <w:rFonts w:cs="TH SarabunIT๙"/>
             <w:noProof/>
             <w:webHidden/>
             <w:szCs w:val="32"/>
@@ -426,7 +426,7 @@
         </w:r>
         <w:r>
           <w:rPr>
-            <w:rFonts w:cs="TH Sarabun New"/>
+            <w:rFonts w:cs="TH SarabunIT๙"/>
             <w:noProof/>
             <w:webHidden/>
             <w:szCs w:val="32"/>
@@ -435,7 +435,7 @@
         </w:r>
         <w:r>
           <w:rPr>
-            <w:rFonts w:cs="TH Sarabun New"/>
+            <w:rFonts w:cs="TH SarabunIT๙"/>
             <w:noProof/>
             <w:webHidden/>
             <w:szCs w:val="32"/>
@@ -444,7 +444,7 @@
         </w:r>
         <w:r>
           <w:rPr>
-            <w:rFonts w:cs="TH Sarabun New"/>
+            <w:rFonts w:cs="TH SarabunIT๙"/>
             <w:noProof/>
             <w:webHidden/>
             <w:szCs w:val="32"/>
@@ -460,18 +460,18 @@
           <w:tab w:val="right" w:leader="dot" w:pos="9016"/>
         </w:tabs>
         <w:rPr>
-          <w:rFonts w:eastAsiaTheme="minorEastAsia" w:cs="TH Sarabun New"/>
+          <w:rFonts w:eastAsiaTheme="minorEastAsia" w:cs="TH SarabunIT๙"/>
           <w:noProof/>
           <w:kern w:val="2"/>
           <w:szCs w:val="32"/>
           <w14:ligatures w14:val="standardContextual"/>
         </w:rPr>
       </w:pPr>
-      <w:hyperlink w:anchor="_Toc244044731" w:history="1">
+      <w:hyperlink w:anchor="_Toc244045416" w:history="1">
         <w:r>
           <w:rPr>
             <w:rStyle w:val="Hyperlink"/>
-            <w:rFonts w:cs="TH Sarabun New"/>
+            <w:rFonts w:cs="TH SarabunIT๙"/>
             <w:noProof/>
             <w:szCs w:val="32"/>
             <w:cs/>
@@ -480,7 +480,7 @@
         </w:r>
         <w:r>
           <w:rPr>
-            <w:rFonts w:cs="TH Sarabun New"/>
+            <w:rFonts w:cs="TH SarabunIT๙"/>
             <w:noProof/>
             <w:webHidden/>
             <w:szCs w:val="32"/>
@@ -489,7 +489,7 @@
         </w:r>
         <w:r>
           <w:rPr>
-            <w:rFonts w:cs="TH Sarabun New"/>
+            <w:rFonts w:cs="TH SarabunIT๙"/>
             <w:noProof/>
             <w:webHidden/>
             <w:szCs w:val="32"/>
@@ -498,16 +498,16 @@
         </w:r>
         <w:r>
           <w:rPr>
-            <w:rFonts w:cs="TH Sarabun New"/>
+            <w:rFonts w:cs="TH SarabunIT๙"/>
             <w:noProof/>
             <w:webHidden/>
             <w:szCs w:val="32"/>
           </w:rPr>
-          <w:instrText xml:space="preserve"> PAGEREF _Toc244044731 \h </w:instrText>
+          <w:instrText xml:space="preserve"> PAGEREF _Toc244045416 \h </w:instrText>
         </w:r>
         <w:r>
           <w:rPr>
-            <w:rFonts w:cs="TH Sarabun New"/>
+            <w:rFonts w:cs="TH SarabunIT๙"/>
             <w:noProof/>
             <w:webHidden/>
             <w:szCs w:val="32"/>
@@ -515,7 +515,7 @@
         </w:r>
         <w:r>
           <w:rPr>
-            <w:rFonts w:cs="TH Sarabun New"/>
+            <w:rFonts w:cs="TH SarabunIT๙"/>
             <w:noProof/>
             <w:webHidden/>
             <w:szCs w:val="32"/>
@@ -524,7 +524,7 @@
         </w:r>
         <w:r>
           <w:rPr>
-            <w:rFonts w:cs="TH Sarabun New"/>
+            <w:rFonts w:cs="TH SarabunIT๙"/>
             <w:noProof/>
             <w:webHidden/>
             <w:szCs w:val="32"/>
@@ -533,7 +533,7 @@
         </w:r>
         <w:r>
           <w:rPr>
-            <w:rFonts w:cs="TH Sarabun New"/>
+            <w:rFonts w:cs="TH SarabunIT๙"/>
             <w:noProof/>
             <w:webHidden/>
             <w:szCs w:val="32"/>
@@ -549,18 +549,18 @@
           <w:tab w:val="right" w:leader="dot" w:pos="9016"/>
         </w:tabs>
         <w:rPr>
-          <w:rFonts w:eastAsiaTheme="minorEastAsia" w:cs="TH Sarabun New"/>
+          <w:rFonts w:eastAsiaTheme="minorEastAsia" w:cs="TH SarabunIT๙"/>
           <w:noProof/>
           <w:kern w:val="2"/>
           <w:szCs w:val="32"/>
           <w14:ligatures w14:val="standardContextual"/>
         </w:rPr>
       </w:pPr>
-      <w:hyperlink w:anchor="_Toc244044732" w:history="1">
+      <w:hyperlink w:anchor="_Toc244045417" w:history="1">
         <w:r>
           <w:rPr>
             <w:rStyle w:val="Hyperlink"/>
-            <w:rFonts w:cs="TH Sarabun New"/>
+            <w:rFonts w:cs="TH SarabunIT๙"/>
             <w:noProof/>
             <w:szCs w:val="32"/>
             <w:cs/>
@@ -569,7 +569,7 @@
         </w:r>
         <w:r>
           <w:rPr>
-            <w:rFonts w:cs="TH Sarabun New"/>
+            <w:rFonts w:cs="TH SarabunIT๙"/>
             <w:noProof/>
             <w:webHidden/>
             <w:szCs w:val="32"/>
@@ -578,7 +578,7 @@
         </w:r>
         <w:r>
           <w:rPr>
-            <w:rFonts w:cs="TH Sarabun New"/>
+            <w:rFonts w:cs="TH SarabunIT๙"/>
             <w:noProof/>
             <w:webHidden/>
             <w:szCs w:val="32"/>
@@ -587,16 +587,16 @@
         </w:r>
         <w:r>
           <w:rPr>
-            <w:rFonts w:cs="TH Sarabun New"/>
+            <w:rFonts w:cs="TH SarabunIT๙"/>
             <w:noProof/>
             <w:webHidden/>
             <w:szCs w:val="32"/>
           </w:rPr>
-          <w:instrText xml:space="preserve"> PAGEREF _Toc244044732 \h </w:instrText>
+          <w:instrText xml:space="preserve"> PAGEREF _Toc244045417 \h </w:instrText>
         </w:r>
         <w:r>
           <w:rPr>
-            <w:rFonts w:cs="TH Sarabun New"/>
+            <w:rFonts w:cs="TH SarabunIT๙"/>
             <w:noProof/>
             <w:webHidden/>
             <w:szCs w:val="32"/>
@@ -604,7 +604,7 @@
         </w:r>
         <w:r>
           <w:rPr>
-            <w:rFonts w:cs="TH Sarabun New"/>
+            <w:rFonts w:cs="TH SarabunIT๙"/>
             <w:noProof/>
             <w:webHidden/>
             <w:szCs w:val="32"/>
@@ -613,7 +613,7 @@
         </w:r>
         <w:r>
           <w:rPr>
-            <w:rFonts w:cs="TH Sarabun New"/>
+            <w:rFonts w:cs="TH SarabunIT๙"/>
             <w:noProof/>
             <w:webHidden/>
             <w:szCs w:val="32"/>
@@ -622,7 +622,7 @@
         </w:r>
         <w:r>
           <w:rPr>
-            <w:rFonts w:cs="TH Sarabun New"/>
+            <w:rFonts w:cs="TH SarabunIT๙"/>
             <w:noProof/>
             <w:webHidden/>
             <w:szCs w:val="32"/>
@@ -638,18 +638,18 @@
           <w:tab w:val="right" w:leader="dot" w:pos="9016"/>
         </w:tabs>
         <w:rPr>
-          <w:rFonts w:eastAsiaTheme="minorEastAsia" w:cs="TH Sarabun New"/>
+          <w:rFonts w:eastAsiaTheme="minorEastAsia" w:cs="TH SarabunIT๙"/>
           <w:noProof/>
           <w:kern w:val="2"/>
           <w:szCs w:val="32"/>
           <w14:ligatures w14:val="standardContextual"/>
         </w:rPr>
       </w:pPr>
-      <w:hyperlink w:anchor="_Toc244044733" w:history="1">
+      <w:hyperlink w:anchor="_Toc244045418" w:history="1">
         <w:r>
           <w:rPr>
             <w:rStyle w:val="Hyperlink"/>
-            <w:rFonts w:cs="TH Sarabun New"/>
+            <w:rFonts w:cs="TH SarabunIT๙"/>
             <w:noProof/>
             <w:szCs w:val="32"/>
             <w:cs/>
@@ -658,7 +658,7 @@
         </w:r>
         <w:r>
           <w:rPr>
-            <w:rFonts w:cs="TH Sarabun New"/>
+            <w:rFonts w:cs="TH SarabunIT๙"/>
             <w:noProof/>
             <w:webHidden/>
             <w:szCs w:val="32"/>
@@ -667,7 +667,7 @@
         </w:r>
         <w:r>
           <w:rPr>
-            <w:rFonts w:cs="TH Sarabun New"/>
+            <w:rFonts w:cs="TH SarabunIT๙"/>
             <w:noProof/>
             <w:webHidden/>
             <w:szCs w:val="32"/>
@@ -676,16 +676,16 @@
         </w:r>
         <w:r>
           <w:rPr>
-            <w:rFonts w:cs="TH Sarabun New"/>
+            <w:rFonts w:cs="TH SarabunIT๙"/>
             <w:noProof/>
             <w:webHidden/>
             <w:szCs w:val="32"/>
           </w:rPr>
-          <w:instrText xml:space="preserve"> PAGEREF _Toc244044733 \h </w:instrText>
+          <w:instrText xml:space="preserve"> PAGEREF _Toc244045418 \h </w:instrText>
         </w:r>
         <w:r>
           <w:rPr>
-            <w:rFonts w:cs="TH Sarabun New"/>
+            <w:rFonts w:cs="TH SarabunIT๙"/>
             <w:noProof/>
             <w:webHidden/>
             <w:szCs w:val="32"/>
@@ -693,7 +693,7 @@
         </w:r>
         <w:r>
           <w:rPr>
-            <w:rFonts w:cs="TH Sarabun New"/>
+            <w:rFonts w:cs="TH SarabunIT๙"/>
             <w:noProof/>
             <w:webHidden/>
             <w:szCs w:val="32"/>
@@ -702,7 +702,7 @@
         </w:r>
         <w:r>
           <w:rPr>
-            <w:rFonts w:cs="TH Sarabun New"/>
+            <w:rFonts w:cs="TH SarabunIT๙"/>
             <w:noProof/>
             <w:webHidden/>
             <w:szCs w:val="32"/>
@@ -711,7 +711,7 @@
         </w:r>
         <w:r>
           <w:rPr>
-            <w:rFonts w:cs="TH Sarabun New"/>
+            <w:rFonts w:cs="TH SarabunIT๙"/>
             <w:noProof/>
             <w:webHidden/>
             <w:szCs w:val="32"/>
@@ -727,18 +727,18 @@
           <w:tab w:val="right" w:leader="dot" w:pos="9016"/>
         </w:tabs>
         <w:rPr>
-          <w:rFonts w:eastAsiaTheme="minorEastAsia" w:cs="TH Sarabun New"/>
+          <w:rFonts w:eastAsiaTheme="minorEastAsia" w:cs="TH SarabunIT๙"/>
           <w:noProof/>
           <w:kern w:val="2"/>
           <w:szCs w:val="32"/>
           <w14:ligatures w14:val="standardContextual"/>
         </w:rPr>
       </w:pPr>
-      <w:hyperlink w:anchor="_Toc244044734" w:history="1">
+      <w:hyperlink w:anchor="_Toc244045419" w:history="1">
         <w:r>
           <w:rPr>
             <w:rStyle w:val="Hyperlink"/>
-            <w:rFonts w:cs="TH Sarabun New"/>
+            <w:rFonts w:cs="TH SarabunIT๙"/>
             <w:noProof/>
             <w:szCs w:val="32"/>
             <w:cs/>
@@ -747,7 +747,7 @@
         </w:r>
         <w:r>
           <w:rPr>
-            <w:rFonts w:cs="TH Sarabun New"/>
+            <w:rFonts w:cs="TH SarabunIT๙"/>
             <w:noProof/>
             <w:webHidden/>
             <w:szCs w:val="32"/>
@@ -756,7 +756,7 @@
         </w:r>
         <w:r>
           <w:rPr>
-            <w:rFonts w:cs="TH Sarabun New"/>
+            <w:rFonts w:cs="TH SarabunIT๙"/>
             <w:noProof/>
             <w:webHidden/>
             <w:szCs w:val="32"/>
@@ -765,16 +765,16 @@
         </w:r>
         <w:r>
           <w:rPr>
-            <w:rFonts w:cs="TH Sarabun New"/>
+            <w:rFonts w:cs="TH SarabunIT๙"/>
             <w:noProof/>
             <w:webHidden/>
             <w:szCs w:val="32"/>
           </w:rPr>
-          <w:instrText xml:space="preserve"> PAGEREF _Toc244044734 \h </w:instrText>
+          <w:instrText xml:space="preserve"> PAGEREF _Toc244045419 \h </w:instrText>
         </w:r>
         <w:r>
           <w:rPr>
-            <w:rFonts w:cs="TH Sarabun New"/>
+            <w:rFonts w:cs="TH SarabunIT๙"/>
             <w:noProof/>
             <w:webHidden/>
             <w:szCs w:val="32"/>
@@ -782,7 +782,7 @@
         </w:r>
         <w:r>
           <w:rPr>
-            <w:rFonts w:cs="TH Sarabun New"/>
+            <w:rFonts w:cs="TH SarabunIT๙"/>
             <w:noProof/>
             <w:webHidden/>
             <w:szCs w:val="32"/>
@@ -791,16 +791,16 @@
         </w:r>
         <w:r>
           <w:rPr>
-            <w:rFonts w:cs="TH Sarabun New"/>
+            <w:rFonts w:cs="TH SarabunIT๙"/>
             <w:noProof/>
             <w:webHidden/>
             <w:szCs w:val="32"/>
           </w:rPr>
-          <w:t>5</w:t>
+          <w:t>4</w:t>
         </w:r>
         <w:r>
           <w:rPr>
-            <w:rFonts w:cs="TH Sarabun New"/>
+            <w:rFonts w:cs="TH SarabunIT๙"/>
             <w:noProof/>
             <w:webHidden/>
             <w:szCs w:val="32"/>
@@ -816,18 +816,18 @@
           <w:tab w:val="right" w:leader="dot" w:pos="9016"/>
         </w:tabs>
         <w:rPr>
-          <w:rFonts w:eastAsiaTheme="minorEastAsia" w:cs="TH Sarabun New"/>
+          <w:rFonts w:eastAsiaTheme="minorEastAsia" w:cs="TH SarabunIT๙"/>
           <w:noProof/>
           <w:kern w:val="2"/>
           <w:szCs w:val="32"/>
           <w14:ligatures w14:val="standardContextual"/>
         </w:rPr>
       </w:pPr>
-      <w:hyperlink w:anchor="_Toc244044735" w:history="1">
+      <w:hyperlink w:anchor="_Toc244045420" w:history="1">
         <w:r>
           <w:rPr>
             <w:rStyle w:val="Hyperlink"/>
-            <w:rFonts w:cs="TH Sarabun New"/>
+            <w:rFonts w:cs="TH SarabunIT๙"/>
             <w:noProof/>
             <w:szCs w:val="32"/>
             <w:cs/>
@@ -836,7 +836,7 @@
         </w:r>
         <w:r>
           <w:rPr>
-            <w:rFonts w:cs="TH Sarabun New"/>
+            <w:rFonts w:cs="TH SarabunIT๙"/>
             <w:noProof/>
             <w:webHidden/>
             <w:szCs w:val="32"/>
@@ -845,7 +845,7 @@
         </w:r>
         <w:r>
           <w:rPr>
-            <w:rFonts w:cs="TH Sarabun New"/>
+            <w:rFonts w:cs="TH SarabunIT๙"/>
             <w:noProof/>
             <w:webHidden/>
             <w:szCs w:val="32"/>
@@ -854,16 +854,16 @@
         </w:r>
         <w:r>
           <w:rPr>
-            <w:rFonts w:cs="TH Sarabun New"/>
+            <w:rFonts w:cs="TH SarabunIT๙"/>
             <w:noProof/>
             <w:webHidden/>
             <w:szCs w:val="32"/>
           </w:rPr>
-          <w:instrText xml:space="preserve"> PAGEREF _Toc244044735 \h </w:instrText>
+          <w:instrText xml:space="preserve"> PAGEREF _Toc244045420 \h </w:instrText>
         </w:r>
         <w:r>
           <w:rPr>
-            <w:rFonts w:cs="TH Sarabun New"/>
+            <w:rFonts w:cs="TH SarabunIT๙"/>
             <w:noProof/>
             <w:webHidden/>
             <w:szCs w:val="32"/>
@@ -871,7 +871,7 @@
         </w:r>
         <w:r>
           <w:rPr>
-            <w:rFonts w:cs="TH Sarabun New"/>
+            <w:rFonts w:cs="TH SarabunIT๙"/>
             <w:noProof/>
             <w:webHidden/>
             <w:szCs w:val="32"/>
@@ -880,7 +880,7 @@
         </w:r>
         <w:r>
           <w:rPr>
-            <w:rFonts w:cs="TH Sarabun New"/>
+            <w:rFonts w:cs="TH SarabunIT๙"/>
             <w:noProof/>
             <w:webHidden/>
             <w:szCs w:val="32"/>
@@ -889,7 +889,7 @@
         </w:r>
         <w:r>
           <w:rPr>
-            <w:rFonts w:cs="TH Sarabun New"/>
+            <w:rFonts w:cs="TH SarabunIT๙"/>
             <w:noProof/>
             <w:webHidden/>
             <w:szCs w:val="32"/>
@@ -905,18 +905,18 @@
           <w:tab w:val="right" w:leader="dot" w:pos="9016"/>
         </w:tabs>
         <w:rPr>
-          <w:rFonts w:eastAsiaTheme="minorEastAsia" w:cs="TH Sarabun New"/>
+          <w:rFonts w:eastAsiaTheme="minorEastAsia" w:cs="TH SarabunIT๙"/>
           <w:noProof/>
           <w:kern w:val="2"/>
           <w:szCs w:val="32"/>
           <w14:ligatures w14:val="standardContextual"/>
         </w:rPr>
       </w:pPr>
-      <w:hyperlink w:anchor="_Toc244044736" w:history="1">
+      <w:hyperlink w:anchor="_Toc244045421" w:history="1">
         <w:r>
           <w:rPr>
             <w:rStyle w:val="Hyperlink"/>
-            <w:rFonts w:cs="TH Sarabun New"/>
+            <w:rFonts w:cs="TH SarabunIT๙"/>
             <w:noProof/>
             <w:szCs w:val="32"/>
             <w:cs/>
@@ -925,7 +925,7 @@
         </w:r>
         <w:r>
           <w:rPr>
-            <w:rFonts w:cs="TH Sarabun New"/>
+            <w:rFonts w:cs="TH SarabunIT๙"/>
             <w:noProof/>
             <w:webHidden/>
             <w:szCs w:val="32"/>
@@ -934,7 +934,7 @@
         </w:r>
         <w:r>
           <w:rPr>
-            <w:rFonts w:cs="TH Sarabun New"/>
+            <w:rFonts w:cs="TH SarabunIT๙"/>
             <w:noProof/>
             <w:webHidden/>
             <w:szCs w:val="32"/>
@@ -943,16 +943,16 @@
         </w:r>
         <w:r>
           <w:rPr>
-            <w:rFonts w:cs="TH Sarabun New"/>
+            <w:rFonts w:cs="TH SarabunIT๙"/>
             <w:noProof/>
             <w:webHidden/>
             <w:szCs w:val="32"/>
           </w:rPr>
-          <w:instrText xml:space="preserve"> PAGEREF _Toc244044736 \h </w:instrText>
+          <w:instrText xml:space="preserve"> PAGEREF _Toc244045421 \h </w:instrText>
         </w:r>
         <w:r>
           <w:rPr>
-            <w:rFonts w:cs="TH Sarabun New"/>
+            <w:rFonts w:cs="TH SarabunIT๙"/>
             <w:noProof/>
             <w:webHidden/>
             <w:szCs w:val="32"/>
@@ -960,7 +960,7 @@
         </w:r>
         <w:r>
           <w:rPr>
-            <w:rFonts w:cs="TH Sarabun New"/>
+            <w:rFonts w:cs="TH SarabunIT๙"/>
             <w:noProof/>
             <w:webHidden/>
             <w:szCs w:val="32"/>
@@ -969,7 +969,7 @@
         </w:r>
         <w:r>
           <w:rPr>
-            <w:rFonts w:cs="TH Sarabun New"/>
+            <w:rFonts w:cs="TH SarabunIT๙"/>
             <w:noProof/>
             <w:webHidden/>
             <w:szCs w:val="32"/>
@@ -978,7 +978,7 @@
         </w:r>
         <w:r>
           <w:rPr>
-            <w:rFonts w:cs="TH Sarabun New"/>
+            <w:rFonts w:cs="TH SarabunIT๙"/>
             <w:noProof/>
             <w:webHidden/>
             <w:szCs w:val="32"/>
@@ -994,18 +994,18 @@
           <w:tab w:val="right" w:leader="dot" w:pos="9016"/>
         </w:tabs>
         <w:rPr>
-          <w:rFonts w:eastAsiaTheme="minorEastAsia" w:cs="TH Sarabun New"/>
+          <w:rFonts w:eastAsiaTheme="minorEastAsia" w:cs="TH SarabunIT๙"/>
           <w:noProof/>
           <w:kern w:val="2"/>
           <w:szCs w:val="32"/>
           <w14:ligatures w14:val="standardContextual"/>
         </w:rPr>
       </w:pPr>
-      <w:hyperlink w:anchor="_Toc244044737" w:history="1">
+      <w:hyperlink w:anchor="_Toc244045422" w:history="1">
         <w:r>
           <w:rPr>
             <w:rStyle w:val="Hyperlink"/>
-            <w:rFonts w:cs="TH Sarabun New"/>
+            <w:rFonts w:cs="TH SarabunIT๙"/>
             <w:noProof/>
             <w:szCs w:val="32"/>
             <w:cs/>
@@ -1014,7 +1014,7 @@
         </w:r>
         <w:r>
           <w:rPr>
-            <w:rFonts w:cs="TH Sarabun New"/>
+            <w:rFonts w:cs="TH SarabunIT๙"/>
             <w:noProof/>
             <w:webHidden/>
             <w:szCs w:val="32"/>
@@ -1023,7 +1023,7 @@
         </w:r>
         <w:r>
           <w:rPr>
-            <w:rFonts w:cs="TH Sarabun New"/>
+            <w:rFonts w:cs="TH SarabunIT๙"/>
             <w:noProof/>
             <w:webHidden/>
             <w:szCs w:val="32"/>
@@ -1032,16 +1032,16 @@
         </w:r>
         <w:r>
           <w:rPr>
-            <w:rFonts w:cs="TH Sarabun New"/>
+            <w:rFonts w:cs="TH SarabunIT๙"/>
             <w:noProof/>
             <w:webHidden/>
             <w:szCs w:val="32"/>
           </w:rPr>
-          <w:instrText xml:space="preserve"> PAGEREF _Toc244044737 \h </w:instrText>
+          <w:instrText xml:space="preserve"> PAGEREF _Toc244045422 \h </w:instrText>
         </w:r>
         <w:r>
           <w:rPr>
-            <w:rFonts w:cs="TH Sarabun New"/>
+            <w:rFonts w:cs="TH SarabunIT๙"/>
             <w:noProof/>
             <w:webHidden/>
             <w:szCs w:val="32"/>
@@ -1049,7 +1049,7 @@
         </w:r>
         <w:r>
           <w:rPr>
-            <w:rFonts w:cs="TH Sarabun New"/>
+            <w:rFonts w:cs="TH SarabunIT๙"/>
             <w:noProof/>
             <w:webHidden/>
             <w:szCs w:val="32"/>
@@ -1058,7 +1058,7 @@
         </w:r>
         <w:r>
           <w:rPr>
-            <w:rFonts w:cs="TH Sarabun New"/>
+            <w:rFonts w:cs="TH SarabunIT๙"/>
             <w:noProof/>
             <w:webHidden/>
             <w:szCs w:val="32"/>
@@ -1067,7 +1067,7 @@
         </w:r>
         <w:r>
           <w:rPr>
-            <w:rFonts w:cs="TH Sarabun New"/>
+            <w:rFonts w:cs="TH SarabunIT๙"/>
             <w:noProof/>
             <w:webHidden/>
             <w:szCs w:val="32"/>
@@ -1083,18 +1083,18 @@
           <w:tab w:val="right" w:leader="dot" w:pos="9016"/>
         </w:tabs>
         <w:rPr>
-          <w:rFonts w:eastAsiaTheme="minorEastAsia" w:cs="TH Sarabun New"/>
+          <w:rFonts w:eastAsiaTheme="minorEastAsia" w:cs="TH SarabunIT๙"/>
           <w:noProof/>
           <w:kern w:val="2"/>
           <w:szCs w:val="32"/>
           <w14:ligatures w14:val="standardContextual"/>
         </w:rPr>
       </w:pPr>
-      <w:hyperlink w:anchor="_Toc244044738" w:history="1">
+      <w:hyperlink w:anchor="_Toc244045423" w:history="1">
         <w:r>
           <w:rPr>
             <w:rStyle w:val="Hyperlink"/>
-            <w:rFonts w:cs="TH Sarabun New"/>
+            <w:rFonts w:cs="TH SarabunIT๙"/>
             <w:noProof/>
             <w:szCs w:val="32"/>
             <w:cs/>
@@ -1103,7 +1103,7 @@
         </w:r>
         <w:r>
           <w:rPr>
-            <w:rFonts w:cs="TH Sarabun New"/>
+            <w:rFonts w:cs="TH SarabunIT๙"/>
             <w:noProof/>
             <w:webHidden/>
             <w:szCs w:val="32"/>
@@ -1112,7 +1112,7 @@
         </w:r>
         <w:r>
           <w:rPr>
-            <w:rFonts w:cs="TH Sarabun New"/>
+            <w:rFonts w:cs="TH SarabunIT๙"/>
             <w:noProof/>
             <w:webHidden/>
             <w:szCs w:val="32"/>
@@ -1121,16 +1121,16 @@
         </w:r>
         <w:r>
           <w:rPr>
-            <w:rFonts w:cs="TH Sarabun New"/>
+            <w:rFonts w:cs="TH SarabunIT๙"/>
             <w:noProof/>
             <w:webHidden/>
             <w:szCs w:val="32"/>
           </w:rPr>
-          <w:instrText xml:space="preserve"> PAGEREF _Toc244044738 \h </w:instrText>
+          <w:instrText xml:space="preserve"> PAGEREF _Toc244045423 \h </w:instrText>
         </w:r>
         <w:r>
           <w:rPr>
-            <w:rFonts w:cs="TH Sarabun New"/>
+            <w:rFonts w:cs="TH SarabunIT๙"/>
             <w:noProof/>
             <w:webHidden/>
             <w:szCs w:val="32"/>
@@ -1138,7 +1138,7 @@
         </w:r>
         <w:r>
           <w:rPr>
-            <w:rFonts w:cs="TH Sarabun New"/>
+            <w:rFonts w:cs="TH SarabunIT๙"/>
             <w:noProof/>
             <w:webHidden/>
             <w:szCs w:val="32"/>
@@ -1147,16 +1147,16 @@
         </w:r>
         <w:r>
           <w:rPr>
-            <w:rFonts w:cs="TH Sarabun New"/>
+            <w:rFonts w:cs="TH SarabunIT๙"/>
             <w:noProof/>
             <w:webHidden/>
             <w:szCs w:val="32"/>
           </w:rPr>
-          <w:t>7</w:t>
+          <w:t>6</w:t>
         </w:r>
         <w:r>
           <w:rPr>
-            <w:rFonts w:cs="TH Sarabun New"/>
+            <w:rFonts w:cs="TH SarabunIT๙"/>
             <w:noProof/>
             <w:webHidden/>
             <w:szCs w:val="32"/>
@@ -1172,18 +1172,18 @@
           <w:tab w:val="right" w:leader="dot" w:pos="9016"/>
         </w:tabs>
         <w:rPr>
-          <w:rFonts w:eastAsiaTheme="minorEastAsia" w:cs="TH Sarabun New"/>
+          <w:rFonts w:eastAsiaTheme="minorEastAsia" w:cs="TH SarabunIT๙"/>
           <w:noProof/>
           <w:kern w:val="2"/>
           <w:szCs w:val="32"/>
           <w14:ligatures w14:val="standardContextual"/>
         </w:rPr>
       </w:pPr>
-      <w:hyperlink w:anchor="_Toc244044739" w:history="1">
+      <w:hyperlink w:anchor="_Toc244045424" w:history="1">
         <w:r>
           <w:rPr>
             <w:rStyle w:val="Hyperlink"/>
-            <w:rFonts w:cs="TH Sarabun New"/>
+            <w:rFonts w:cs="TH SarabunIT๙"/>
             <w:noProof/>
             <w:szCs w:val="32"/>
             <w:cs/>
@@ -1193,7 +1193,7 @@
         <w:r>
           <w:rPr>
             <w:rStyle w:val="Hyperlink"/>
-            <w:rFonts w:cs="TH Sarabun New"/>
+            <w:rFonts w:cs="TH SarabunIT๙"/>
             <w:noProof/>
             <w:szCs w:val="32"/>
           </w:rPr>
@@ -1201,7 +1201,7 @@
         </w:r>
         <w:r>
           <w:rPr>
-            <w:rFonts w:cs="TH Sarabun New"/>
+            <w:rFonts w:cs="TH SarabunIT๙"/>
             <w:noProof/>
             <w:webHidden/>
             <w:szCs w:val="32"/>
@@ -1210,7 +1210,7 @@
         </w:r>
         <w:r>
           <w:rPr>
-            <w:rFonts w:cs="TH Sarabun New"/>
+            <w:rFonts w:cs="TH SarabunIT๙"/>
             <w:noProof/>
             <w:webHidden/>
             <w:szCs w:val="32"/>
@@ -1219,16 +1219,16 @@
         </w:r>
         <w:r>
           <w:rPr>
-            <w:rFonts w:cs="TH Sarabun New"/>
+            <w:rFonts w:cs="TH SarabunIT๙"/>
             <w:noProof/>
             <w:webHidden/>
             <w:szCs w:val="32"/>
           </w:rPr>
-          <w:instrText xml:space="preserve"> PAGEREF _Toc244044739 \h </w:instrText>
+          <w:instrText xml:space="preserve"> PAGEREF _Toc244045424 \h </w:instrText>
         </w:r>
         <w:r>
           <w:rPr>
-            <w:rFonts w:cs="TH Sarabun New"/>
+            <w:rFonts w:cs="TH SarabunIT๙"/>
             <w:noProof/>
             <w:webHidden/>
             <w:szCs w:val="32"/>
@@ -1236,7 +1236,7 @@
         </w:r>
         <w:r>
           <w:rPr>
-            <w:rFonts w:cs="TH Sarabun New"/>
+            <w:rFonts w:cs="TH SarabunIT๙"/>
             <w:noProof/>
             <w:webHidden/>
             <w:szCs w:val="32"/>
@@ -1245,7 +1245,7 @@
         </w:r>
         <w:r>
           <w:rPr>
-            <w:rFonts w:cs="TH Sarabun New"/>
+            <w:rFonts w:cs="TH SarabunIT๙"/>
             <w:noProof/>
             <w:webHidden/>
             <w:szCs w:val="32"/>
@@ -1254,7 +1254,7 @@
         </w:r>
         <w:r>
           <w:rPr>
-            <w:rFonts w:cs="TH Sarabun New"/>
+            <w:rFonts w:cs="TH SarabunIT๙"/>
             <w:noProof/>
             <w:webHidden/>
             <w:szCs w:val="32"/>
@@ -1270,18 +1270,18 @@
           <w:tab w:val="right" w:leader="dot" w:pos="9016"/>
         </w:tabs>
         <w:rPr>
-          <w:rFonts w:eastAsiaTheme="minorEastAsia" w:cs="TH Sarabun New"/>
+          <w:rFonts w:eastAsiaTheme="minorEastAsia" w:cs="TH SarabunIT๙"/>
           <w:noProof/>
           <w:kern w:val="2"/>
           <w:szCs w:val="32"/>
           <w14:ligatures w14:val="standardContextual"/>
         </w:rPr>
       </w:pPr>
-      <w:hyperlink w:anchor="_Toc244044740" w:history="1">
+      <w:hyperlink w:anchor="_Toc244045425" w:history="1">
         <w:r>
           <w:rPr>
             <w:rStyle w:val="Hyperlink"/>
-            <w:rFonts w:cs="TH Sarabun New"/>
+            <w:rFonts w:cs="TH SarabunIT๙"/>
             <w:noProof/>
             <w:szCs w:val="32"/>
             <w:cs/>
@@ -1291,7 +1291,7 @@
         <w:r>
           <w:rPr>
             <w:rStyle w:val="Hyperlink"/>
-            <w:rFonts w:cs="TH Sarabun New"/>
+            <w:rFonts w:cs="TH SarabunIT๙"/>
             <w:noProof/>
             <w:szCs w:val="32"/>
           </w:rPr>
@@ -1299,7 +1299,7 @@
         </w:r>
         <w:r>
           <w:rPr>
-            <w:rFonts w:cs="TH Sarabun New"/>
+            <w:rFonts w:cs="TH SarabunIT๙"/>
             <w:noProof/>
             <w:webHidden/>
             <w:szCs w:val="32"/>
@@ -1308,7 +1308,7 @@
         </w:r>
         <w:r>
           <w:rPr>
-            <w:rFonts w:cs="TH Sarabun New"/>
+            <w:rFonts w:cs="TH SarabunIT๙"/>
             <w:noProof/>
             <w:webHidden/>
             <w:szCs w:val="32"/>
@@ -1317,16 +1317,16 @@
         </w:r>
         <w:r>
           <w:rPr>
-            <w:rFonts w:cs="TH Sarabun New"/>
+            <w:rFonts w:cs="TH SarabunIT๙"/>
             <w:noProof/>
             <w:webHidden/>
             <w:szCs w:val="32"/>
           </w:rPr>
-          <w:instrText xml:space="preserve"> PAGEREF _Toc244044740 \h </w:instrText>
+          <w:instrText xml:space="preserve"> PAGEREF _Toc244045425 \h </w:instrText>
         </w:r>
         <w:r>
           <w:rPr>
-            <w:rFonts w:cs="TH Sarabun New"/>
+            <w:rFonts w:cs="TH SarabunIT๙"/>
             <w:noProof/>
             <w:webHidden/>
             <w:szCs w:val="32"/>
@@ -1334,7 +1334,7 @@
         </w:r>
         <w:r>
           <w:rPr>
-            <w:rFonts w:cs="TH Sarabun New"/>
+            <w:rFonts w:cs="TH SarabunIT๙"/>
             <w:noProof/>
             <w:webHidden/>
             <w:szCs w:val="32"/>
@@ -1343,7 +1343,7 @@
         </w:r>
         <w:r>
           <w:rPr>
-            <w:rFonts w:cs="TH Sarabun New"/>
+            <w:rFonts w:cs="TH SarabunIT๙"/>
             <w:noProof/>
             <w:webHidden/>
             <w:szCs w:val="32"/>
@@ -1352,7 +1352,7 @@
         </w:r>
         <w:r>
           <w:rPr>
-            <w:rFonts w:cs="TH Sarabun New"/>
+            <w:rFonts w:cs="TH SarabunIT๙"/>
             <w:noProof/>
             <w:webHidden/>
             <w:szCs w:val="32"/>
@@ -1368,18 +1368,18 @@
           <w:tab w:val="right" w:leader="dot" w:pos="9016"/>
         </w:tabs>
         <w:rPr>
-          <w:rFonts w:eastAsiaTheme="minorEastAsia" w:cs="TH Sarabun New"/>
+          <w:rFonts w:eastAsiaTheme="minorEastAsia" w:cs="TH SarabunIT๙"/>
           <w:noProof/>
           <w:kern w:val="2"/>
           <w:szCs w:val="32"/>
           <w14:ligatures w14:val="standardContextual"/>
         </w:rPr>
       </w:pPr>
-      <w:hyperlink w:anchor="_Toc244044741" w:history="1">
+      <w:hyperlink w:anchor="_Toc244045426" w:history="1">
         <w:r>
           <w:rPr>
             <w:rStyle w:val="Hyperlink"/>
-            <w:rFonts w:cs="TH Sarabun New"/>
+            <w:rFonts w:cs="TH SarabunIT๙"/>
             <w:noProof/>
             <w:szCs w:val="32"/>
           </w:rPr>
@@ -1388,7 +1388,7 @@
         <w:r>
           <w:rPr>
             <w:rStyle w:val="Hyperlink"/>
-            <w:rFonts w:cs="TH Sarabun New"/>
+            <w:rFonts w:cs="TH SarabunIT๙"/>
             <w:noProof/>
             <w:szCs w:val="32"/>
             <w:cs/>
@@ -1397,7 +1397,7 @@
         </w:r>
         <w:r>
           <w:rPr>
-            <w:rFonts w:cs="TH Sarabun New"/>
+            <w:rFonts w:cs="TH SarabunIT๙"/>
             <w:noProof/>
             <w:webHidden/>
             <w:szCs w:val="32"/>
@@ -1406,7 +1406,7 @@
         </w:r>
         <w:r>
           <w:rPr>
-            <w:rFonts w:cs="TH Sarabun New"/>
+            <w:rFonts w:cs="TH SarabunIT๙"/>
             <w:noProof/>
             <w:webHidden/>
             <w:szCs w:val="32"/>
@@ -1415,16 +1415,16 @@
         </w:r>
         <w:r>
           <w:rPr>
-            <w:rFonts w:cs="TH Sarabun New"/>
+            <w:rFonts w:cs="TH SarabunIT๙"/>
             <w:noProof/>
             <w:webHidden/>
             <w:szCs w:val="32"/>
           </w:rPr>
-          <w:instrText xml:space="preserve"> PAGEREF _Toc244044741 \h </w:instrText>
+          <w:instrText xml:space="preserve"> PAGEREF _Toc244045426 \h </w:instrText>
         </w:r>
         <w:r>
           <w:rPr>
-            <w:rFonts w:cs="TH Sarabun New"/>
+            <w:rFonts w:cs="TH SarabunIT๙"/>
             <w:noProof/>
             <w:webHidden/>
             <w:szCs w:val="32"/>
@@ -1432,7 +1432,7 @@
         </w:r>
         <w:r>
           <w:rPr>
-            <w:rFonts w:cs="TH Sarabun New"/>
+            <w:rFonts w:cs="TH SarabunIT๙"/>
             <w:noProof/>
             <w:webHidden/>
             <w:szCs w:val="32"/>
@@ -1441,16 +1441,16 @@
         </w:r>
         <w:r>
           <w:rPr>
-            <w:rFonts w:cs="TH Sarabun New"/>
+            <w:rFonts w:cs="TH SarabunIT๙"/>
             <w:noProof/>
             <w:webHidden/>
             <w:szCs w:val="32"/>
           </w:rPr>
-          <w:t>9</w:t>
+          <w:t>8</w:t>
         </w:r>
         <w:r>
           <w:rPr>
-            <w:rFonts w:cs="TH Sarabun New"/>
+            <w:rFonts w:cs="TH SarabunIT๙"/>
             <w:noProof/>
             <w:webHidden/>
             <w:szCs w:val="32"/>
@@ -1466,18 +1466,18 @@
           <w:tab w:val="right" w:leader="dot" w:pos="9016"/>
         </w:tabs>
         <w:rPr>
-          <w:rFonts w:eastAsiaTheme="minorEastAsia" w:cs="TH Sarabun New"/>
+          <w:rFonts w:eastAsiaTheme="minorEastAsia" w:cs="TH SarabunIT๙"/>
           <w:noProof/>
           <w:kern w:val="2"/>
           <w:szCs w:val="32"/>
           <w14:ligatures w14:val="standardContextual"/>
         </w:rPr>
       </w:pPr>
-      <w:hyperlink w:anchor="_Toc244044742" w:history="1">
+      <w:hyperlink w:anchor="_Toc244045427" w:history="1">
         <w:r>
           <w:rPr>
             <w:rStyle w:val="Hyperlink"/>
-            <w:rFonts w:cs="TH Sarabun New"/>
+            <w:rFonts w:cs="TH SarabunIT๙"/>
             <w:noProof/>
             <w:szCs w:val="32"/>
           </w:rPr>
@@ -1486,7 +1486,7 @@
         <w:r>
           <w:rPr>
             <w:rStyle w:val="Hyperlink"/>
-            <w:rFonts w:cs="TH Sarabun New"/>
+            <w:rFonts w:cs="TH SarabunIT๙"/>
             <w:noProof/>
             <w:szCs w:val="32"/>
             <w:cs/>
@@ -1495,7 +1495,7 @@
         </w:r>
         <w:r>
           <w:rPr>
-            <w:rFonts w:cs="TH Sarabun New"/>
+            <w:rFonts w:cs="TH SarabunIT๙"/>
             <w:noProof/>
             <w:webHidden/>
             <w:szCs w:val="32"/>
@@ -1504,7 +1504,7 @@
         </w:r>
         <w:r>
           <w:rPr>
-            <w:rFonts w:cs="TH Sarabun New"/>
+            <w:rFonts w:cs="TH SarabunIT๙"/>
             <w:noProof/>
             <w:webHidden/>
             <w:szCs w:val="32"/>
@@ -1513,16 +1513,16 @@
         </w:r>
         <w:r>
           <w:rPr>
-            <w:rFonts w:cs="TH Sarabun New"/>
+            <w:rFonts w:cs="TH SarabunIT๙"/>
             <w:noProof/>
             <w:webHidden/>
             <w:szCs w:val="32"/>
           </w:rPr>
-          <w:instrText xml:space="preserve"> PAGEREF _Toc244044742 \h </w:instrText>
+          <w:instrText xml:space="preserve"> PAGEREF _Toc244045427 \h </w:instrText>
         </w:r>
         <w:r>
           <w:rPr>
-            <w:rFonts w:cs="TH Sarabun New"/>
+            <w:rFonts w:cs="TH SarabunIT๙"/>
             <w:noProof/>
             <w:webHidden/>
             <w:szCs w:val="32"/>
@@ -1530,7 +1530,7 @@
         </w:r>
         <w:r>
           <w:rPr>
-            <w:rFonts w:cs="TH Sarabun New"/>
+            <w:rFonts w:cs="TH SarabunIT๙"/>
             <w:noProof/>
             <w:webHidden/>
             <w:szCs w:val="32"/>
@@ -1539,16 +1539,16 @@
         </w:r>
         <w:r>
           <w:rPr>
-            <w:rFonts w:cs="TH Sarabun New"/>
+            <w:rFonts w:cs="TH SarabunIT๙"/>
             <w:noProof/>
             <w:webHidden/>
             <w:szCs w:val="32"/>
           </w:rPr>
-          <w:t>9</w:t>
+          <w:t>8</w:t>
         </w:r>
         <w:r>
           <w:rPr>
-            <w:rFonts w:cs="TH Sarabun New"/>
+            <w:rFonts w:cs="TH SarabunIT๙"/>
             <w:noProof/>
             <w:webHidden/>
             <w:szCs w:val="32"/>
@@ -1564,18 +1564,18 @@
           <w:tab w:val="right" w:leader="dot" w:pos="9016"/>
         </w:tabs>
         <w:rPr>
-          <w:rFonts w:eastAsiaTheme="minorEastAsia" w:cs="TH Sarabun New"/>
+          <w:rFonts w:eastAsiaTheme="minorEastAsia" w:cs="TH SarabunIT๙"/>
           <w:noProof/>
           <w:kern w:val="2"/>
           <w:szCs w:val="32"/>
           <w14:ligatures w14:val="standardContextual"/>
         </w:rPr>
       </w:pPr>
-      <w:hyperlink w:anchor="_Toc244044743" w:history="1">
+      <w:hyperlink w:anchor="_Toc244045428" w:history="1">
         <w:r>
           <w:rPr>
             <w:rStyle w:val="Hyperlink"/>
-            <w:rFonts w:cs="TH Sarabun New"/>
+            <w:rFonts w:cs="TH SarabunIT๙"/>
             <w:noProof/>
             <w:szCs w:val="32"/>
           </w:rPr>
@@ -1584,7 +1584,7 @@
         <w:r>
           <w:rPr>
             <w:rStyle w:val="Hyperlink"/>
-            <w:rFonts w:cs="TH Sarabun New"/>
+            <w:rFonts w:cs="TH SarabunIT๙"/>
             <w:noProof/>
             <w:szCs w:val="32"/>
             <w:cs/>
@@ -1593,7 +1593,7 @@
         </w:r>
         <w:r>
           <w:rPr>
-            <w:rFonts w:cs="TH Sarabun New"/>
+            <w:rFonts w:cs="TH SarabunIT๙"/>
             <w:noProof/>
             <w:webHidden/>
             <w:szCs w:val="32"/>
@@ -1602,7 +1602,7 @@
         </w:r>
         <w:r>
           <w:rPr>
-            <w:rFonts w:cs="TH Sarabun New"/>
+            <w:rFonts w:cs="TH SarabunIT๙"/>
             <w:noProof/>
             <w:webHidden/>
             <w:szCs w:val="32"/>
@@ -1611,16 +1611,16 @@
         </w:r>
         <w:r>
           <w:rPr>
-            <w:rFonts w:cs="TH Sarabun New"/>
+            <w:rFonts w:cs="TH SarabunIT๙"/>
             <w:noProof/>
             <w:webHidden/>
             <w:szCs w:val="32"/>
           </w:rPr>
-          <w:instrText xml:space="preserve"> PAGEREF _Toc244044743 \h </w:instrText>
+          <w:instrText xml:space="preserve"> PAGEREF _Toc244045428 \h </w:instrText>
         </w:r>
         <w:r>
           <w:rPr>
-            <w:rFonts w:cs="TH Sarabun New"/>
+            <w:rFonts w:cs="TH SarabunIT๙"/>
             <w:noProof/>
             <w:webHidden/>
             <w:szCs w:val="32"/>
@@ -1628,7 +1628,7 @@
         </w:r>
         <w:r>
           <w:rPr>
-            <w:rFonts w:cs="TH Sarabun New"/>
+            <w:rFonts w:cs="TH SarabunIT๙"/>
             <w:noProof/>
             <w:webHidden/>
             <w:szCs w:val="32"/>
@@ -1637,16 +1637,16 @@
         </w:r>
         <w:r>
           <w:rPr>
-            <w:rFonts w:cs="TH Sarabun New"/>
+            <w:rFonts w:cs="TH SarabunIT๙"/>
             <w:noProof/>
             <w:webHidden/>
             <w:szCs w:val="32"/>
           </w:rPr>
-          <w:t>11</w:t>
+          <w:t>10</w:t>
         </w:r>
         <w:r>
           <w:rPr>
-            <w:rFonts w:cs="TH Sarabun New"/>
+            <w:rFonts w:cs="TH SarabunIT๙"/>
             <w:noProof/>
             <w:webHidden/>
             <w:szCs w:val="32"/>
@@ -1662,18 +1662,18 @@
           <w:tab w:val="right" w:leader="dot" w:pos="9016"/>
         </w:tabs>
         <w:rPr>
-          <w:rFonts w:eastAsiaTheme="minorEastAsia" w:cs="TH Sarabun New"/>
+          <w:rFonts w:eastAsiaTheme="minorEastAsia" w:cs="TH SarabunIT๙"/>
           <w:noProof/>
           <w:kern w:val="2"/>
           <w:szCs w:val="32"/>
           <w14:ligatures w14:val="standardContextual"/>
         </w:rPr>
       </w:pPr>
-      <w:hyperlink w:anchor="_Toc244044744" w:history="1">
+      <w:hyperlink w:anchor="_Toc244045429" w:history="1">
         <w:r>
           <w:rPr>
             <w:rStyle w:val="Hyperlink"/>
-            <w:rFonts w:cs="TH Sarabun New"/>
+            <w:rFonts w:cs="TH SarabunIT๙"/>
             <w:noProof/>
             <w:szCs w:val="32"/>
             <w:cs/>
@@ -1683,7 +1683,7 @@
         <w:r>
           <w:rPr>
             <w:rStyle w:val="Hyperlink"/>
-            <w:rFonts w:cs="TH Sarabun New"/>
+            <w:rFonts w:cs="TH SarabunIT๙"/>
             <w:noProof/>
             <w:szCs w:val="32"/>
           </w:rPr>
@@ -1691,7 +1691,7 @@
         </w:r>
         <w:r>
           <w:rPr>
-            <w:rFonts w:cs="TH Sarabun New"/>
+            <w:rFonts w:cs="TH SarabunIT๙"/>
             <w:noProof/>
             <w:webHidden/>
             <w:szCs w:val="32"/>
@@ -1700,7 +1700,7 @@
         </w:r>
         <w:r>
           <w:rPr>
-            <w:rFonts w:cs="TH Sarabun New"/>
+            <w:rFonts w:cs="TH SarabunIT๙"/>
             <w:noProof/>
             <w:webHidden/>
             <w:szCs w:val="32"/>
@@ -1709,16 +1709,16 @@
         </w:r>
         <w:r>
           <w:rPr>
-            <w:rFonts w:cs="TH Sarabun New"/>
+            <w:rFonts w:cs="TH SarabunIT๙"/>
             <w:noProof/>
             <w:webHidden/>
             <w:szCs w:val="32"/>
           </w:rPr>
-          <w:instrText xml:space="preserve"> PAGEREF _Toc244044744 \h </w:instrText>
+          <w:instrText xml:space="preserve"> PAGEREF _Toc244045429 \h </w:instrText>
         </w:r>
         <w:r>
           <w:rPr>
-            <w:rFonts w:cs="TH Sarabun New"/>
+            <w:rFonts w:cs="TH SarabunIT๙"/>
             <w:noProof/>
             <w:webHidden/>
             <w:szCs w:val="32"/>
@@ -1726,7 +1726,7 @@
         </w:r>
         <w:r>
           <w:rPr>
-            <w:rFonts w:cs="TH Sarabun New"/>
+            <w:rFonts w:cs="TH SarabunIT๙"/>
             <w:noProof/>
             <w:webHidden/>
             <w:szCs w:val="32"/>
@@ -1735,16 +1735,16 @@
         </w:r>
         <w:r>
           <w:rPr>
-            <w:rFonts w:cs="TH Sarabun New"/>
+            <w:rFonts w:cs="TH SarabunIT๙"/>
             <w:noProof/>
             <w:webHidden/>
             <w:szCs w:val="32"/>
           </w:rPr>
-          <w:t>15</w:t>
+          <w:t>13</w:t>
         </w:r>
         <w:r>
           <w:rPr>
-            <w:rFonts w:cs="TH Sarabun New"/>
+            <w:rFonts w:cs="TH SarabunIT๙"/>
             <w:noProof/>
             <w:webHidden/>
             <w:szCs w:val="32"/>
@@ -1760,18 +1760,18 @@
           <w:tab w:val="right" w:leader="dot" w:pos="9016"/>
         </w:tabs>
         <w:rPr>
-          <w:rFonts w:eastAsiaTheme="minorEastAsia" w:cs="TH Sarabun New"/>
+          <w:rFonts w:eastAsiaTheme="minorEastAsia" w:cs="TH SarabunIT๙"/>
           <w:noProof/>
           <w:kern w:val="2"/>
           <w:szCs w:val="32"/>
           <w14:ligatures w14:val="standardContextual"/>
         </w:rPr>
       </w:pPr>
-      <w:hyperlink w:anchor="_Toc244044745" w:history="1">
+      <w:hyperlink w:anchor="_Toc244045430" w:history="1">
         <w:r>
           <w:rPr>
             <w:rStyle w:val="Hyperlink"/>
-            <w:rFonts w:cs="TH Sarabun New"/>
+            <w:rFonts w:cs="TH SarabunIT๙"/>
             <w:noProof/>
             <w:szCs w:val="32"/>
             <w:cs/>
@@ -1780,7 +1780,7 @@
         </w:r>
         <w:r>
           <w:rPr>
-            <w:rFonts w:cs="TH Sarabun New"/>
+            <w:rFonts w:cs="TH SarabunIT๙"/>
             <w:noProof/>
             <w:webHidden/>
             <w:szCs w:val="32"/>
@@ -1789,7 +1789,7 @@
         </w:r>
         <w:r>
           <w:rPr>
-            <w:rFonts w:cs="TH Sarabun New"/>
+            <w:rFonts w:cs="TH SarabunIT๙"/>
             <w:noProof/>
             <w:webHidden/>
             <w:szCs w:val="32"/>
@@ -1798,16 +1798,16 @@
         </w:r>
         <w:r>
           <w:rPr>
-            <w:rFonts w:cs="TH Sarabun New"/>
+            <w:rFonts w:cs="TH SarabunIT๙"/>
             <w:noProof/>
             <w:webHidden/>
             <w:szCs w:val="32"/>
           </w:rPr>
-          <w:instrText xml:space="preserve"> PAGEREF _Toc244044745 \h </w:instrText>
+          <w:instrText xml:space="preserve"> PAGEREF _Toc244045430 \h </w:instrText>
         </w:r>
         <w:r>
           <w:rPr>
-            <w:rFonts w:cs="TH Sarabun New"/>
+            <w:rFonts w:cs="TH SarabunIT๙"/>
             <w:noProof/>
             <w:webHidden/>
             <w:szCs w:val="32"/>
@@ -1815,7 +1815,7 @@
         </w:r>
         <w:r>
           <w:rPr>
-            <w:rFonts w:cs="TH Sarabun New"/>
+            <w:rFonts w:cs="TH SarabunIT๙"/>
             <w:noProof/>
             <w:webHidden/>
             <w:szCs w:val="32"/>
@@ -1824,16 +1824,16 @@
         </w:r>
         <w:r>
           <w:rPr>
-            <w:rFonts w:cs="TH Sarabun New"/>
+            <w:rFonts w:cs="TH SarabunIT๙"/>
             <w:noProof/>
             <w:webHidden/>
             <w:szCs w:val="32"/>
           </w:rPr>
-          <w:t>15</w:t>
+          <w:t>13</w:t>
         </w:r>
         <w:r>
           <w:rPr>
-            <w:rFonts w:cs="TH Sarabun New"/>
+            <w:rFonts w:cs="TH SarabunIT๙"/>
             <w:noProof/>
             <w:webHidden/>
             <w:szCs w:val="32"/>
@@ -1849,18 +1849,18 @@
           <w:tab w:val="right" w:leader="dot" w:pos="9016"/>
         </w:tabs>
         <w:rPr>
-          <w:rFonts w:eastAsiaTheme="minorEastAsia" w:cs="TH Sarabun New"/>
+          <w:rFonts w:eastAsiaTheme="minorEastAsia" w:cs="TH SarabunIT๙"/>
           <w:noProof/>
           <w:kern w:val="2"/>
           <w:szCs w:val="32"/>
           <w14:ligatures w14:val="standardContextual"/>
         </w:rPr>
       </w:pPr>
-      <w:hyperlink w:anchor="_Toc244044746" w:history="1">
+      <w:hyperlink w:anchor="_Toc244045431" w:history="1">
         <w:r>
           <w:rPr>
             <w:rStyle w:val="Hyperlink"/>
-            <w:rFonts w:cs="TH Sarabun New"/>
+            <w:rFonts w:cs="TH SarabunIT๙"/>
             <w:noProof/>
             <w:szCs w:val="32"/>
             <w:cs/>
@@ -1870,7 +1870,7 @@
         <w:r>
           <w:rPr>
             <w:rStyle w:val="Hyperlink"/>
-            <w:rFonts w:cs="TH Sarabun New"/>
+            <w:rFonts w:cs="TH SarabunIT๙"/>
             <w:noProof/>
             <w:szCs w:val="32"/>
           </w:rPr>
@@ -1879,7 +1879,7 @@
         <w:r>
           <w:rPr>
             <w:rStyle w:val="Hyperlink"/>
-            <w:rFonts w:cs="TH Sarabun New"/>
+            <w:rFonts w:cs="TH SarabunIT๙"/>
             <w:noProof/>
             <w:szCs w:val="32"/>
             <w:cs/>
@@ -1888,7 +1888,7 @@
         </w:r>
         <w:r>
           <w:rPr>
-            <w:rFonts w:cs="TH Sarabun New"/>
+            <w:rFonts w:cs="TH SarabunIT๙"/>
             <w:noProof/>
             <w:webHidden/>
             <w:szCs w:val="32"/>
@@ -1897,7 +1897,7 @@
         </w:r>
         <w:r>
           <w:rPr>
-            <w:rFonts w:cs="TH Sarabun New"/>
+            <w:rFonts w:cs="TH SarabunIT๙"/>
             <w:noProof/>
             <w:webHidden/>
             <w:szCs w:val="32"/>
@@ -1906,16 +1906,16 @@
         </w:r>
         <w:r>
           <w:rPr>
-            <w:rFonts w:cs="TH Sarabun New"/>
+            <w:rFonts w:cs="TH SarabunIT๙"/>
             <w:noProof/>
             <w:webHidden/>
             <w:szCs w:val="32"/>
           </w:rPr>
-          <w:instrText xml:space="preserve"> PAGEREF _Toc244044746 \h </w:instrText>
+          <w:instrText xml:space="preserve"> PAGEREF _Toc244045431 \h </w:instrText>
         </w:r>
         <w:r>
           <w:rPr>
-            <w:rFonts w:cs="TH Sarabun New"/>
+            <w:rFonts w:cs="TH SarabunIT๙"/>
             <w:noProof/>
             <w:webHidden/>
             <w:szCs w:val="32"/>
@@ -1923,7 +1923,7 @@
         </w:r>
         <w:r>
           <w:rPr>
-            <w:rFonts w:cs="TH Sarabun New"/>
+            <w:rFonts w:cs="TH SarabunIT๙"/>
             <w:noProof/>
             <w:webHidden/>
             <w:szCs w:val="32"/>
@@ -1932,16 +1932,16 @@
         </w:r>
         <w:r>
           <w:rPr>
-            <w:rFonts w:cs="TH Sarabun New"/>
+            <w:rFonts w:cs="TH SarabunIT๙"/>
             <w:noProof/>
             <w:webHidden/>
             <w:szCs w:val="32"/>
           </w:rPr>
-          <w:t>16</w:t>
+          <w:t>14</w:t>
         </w:r>
         <w:r>
           <w:rPr>
-            <w:rFonts w:cs="TH Sarabun New"/>
+            <w:rFonts w:cs="TH SarabunIT๙"/>
             <w:noProof/>
             <w:webHidden/>
             <w:szCs w:val="32"/>
@@ -1957,18 +1957,18 @@
           <w:tab w:val="right" w:leader="dot" w:pos="9016"/>
         </w:tabs>
         <w:rPr>
-          <w:rFonts w:eastAsiaTheme="minorEastAsia" w:cs="TH Sarabun New"/>
+          <w:rFonts w:eastAsiaTheme="minorEastAsia" w:cs="TH SarabunIT๙"/>
           <w:noProof/>
           <w:kern w:val="2"/>
           <w:szCs w:val="32"/>
           <w14:ligatures w14:val="standardContextual"/>
         </w:rPr>
       </w:pPr>
-      <w:hyperlink w:anchor="_Toc244044747" w:history="1">
+      <w:hyperlink w:anchor="_Toc244045432" w:history="1">
         <w:r>
           <w:rPr>
             <w:rStyle w:val="Hyperlink"/>
-            <w:rFonts w:cs="TH Sarabun New"/>
+            <w:rFonts w:cs="TH SarabunIT๙"/>
             <w:noProof/>
             <w:szCs w:val="32"/>
             <w:cs/>
@@ -1977,7 +1977,7 @@
         </w:r>
         <w:r>
           <w:rPr>
-            <w:rFonts w:cs="TH Sarabun New"/>
+            <w:rFonts w:cs="TH SarabunIT๙"/>
             <w:noProof/>
             <w:webHidden/>
             <w:szCs w:val="32"/>
@@ -1986,7 +1986,7 @@
         </w:r>
         <w:r>
           <w:rPr>
-            <w:rFonts w:cs="TH Sarabun New"/>
+            <w:rFonts w:cs="TH SarabunIT๙"/>
             <w:noProof/>
             <w:webHidden/>
             <w:szCs w:val="32"/>
@@ -1995,16 +1995,16 @@
         </w:r>
         <w:r>
           <w:rPr>
-            <w:rFonts w:cs="TH Sarabun New"/>
+            <w:rFonts w:cs="TH SarabunIT๙"/>
             <w:noProof/>
             <w:webHidden/>
             <w:szCs w:val="32"/>
           </w:rPr>
-          <w:instrText xml:space="preserve"> PAGEREF _Toc244044747 \h </w:instrText>
+          <w:instrText xml:space="preserve"> PAGEREF _Toc244045432 \h </w:instrText>
         </w:r>
         <w:r>
           <w:rPr>
-            <w:rFonts w:cs="TH Sarabun New"/>
+            <w:rFonts w:cs="TH SarabunIT๙"/>
             <w:noProof/>
             <w:webHidden/>
             <w:szCs w:val="32"/>
@@ -2012,7 +2012,7 @@
         </w:r>
         <w:r>
           <w:rPr>
-            <w:rFonts w:cs="TH Sarabun New"/>
+            <w:rFonts w:cs="TH SarabunIT๙"/>
             <w:noProof/>
             <w:webHidden/>
             <w:szCs w:val="32"/>
@@ -2021,16 +2021,16 @@
         </w:r>
         <w:r>
           <w:rPr>
-            <w:rFonts w:cs="TH Sarabun New"/>
+            <w:rFonts w:cs="TH SarabunIT๙"/>
             <w:noProof/>
             <w:webHidden/>
             <w:szCs w:val="32"/>
           </w:rPr>
-          <w:t>16</w:t>
+          <w:t>14</w:t>
         </w:r>
         <w:r>
           <w:rPr>
-            <w:rFonts w:cs="TH Sarabun New"/>
+            <w:rFonts w:cs="TH SarabunIT๙"/>
             <w:noProof/>
             <w:webHidden/>
             <w:szCs w:val="32"/>
@@ -2046,18 +2046,18 @@
           <w:tab w:val="right" w:leader="dot" w:pos="9016"/>
         </w:tabs>
         <w:rPr>
-          <w:rFonts w:eastAsiaTheme="minorEastAsia" w:cs="TH Sarabun New"/>
+          <w:rFonts w:eastAsiaTheme="minorEastAsia" w:cs="TH SarabunIT๙"/>
           <w:noProof/>
           <w:kern w:val="2"/>
           <w:szCs w:val="32"/>
           <w14:ligatures w14:val="standardContextual"/>
         </w:rPr>
       </w:pPr>
-      <w:hyperlink w:anchor="_Toc244044748" w:history="1">
+      <w:hyperlink w:anchor="_Toc244045433" w:history="1">
         <w:r>
           <w:rPr>
             <w:rStyle w:val="Hyperlink"/>
-            <w:rFonts w:cs="TH Sarabun New"/>
+            <w:rFonts w:cs="TH SarabunIT๙"/>
             <w:noProof/>
             <w:szCs w:val="32"/>
             <w:cs/>
@@ -2066,7 +2066,7 @@
         </w:r>
         <w:r>
           <w:rPr>
-            <w:rFonts w:cs="TH Sarabun New"/>
+            <w:rFonts w:cs="TH SarabunIT๙"/>
             <w:noProof/>
             <w:webHidden/>
             <w:szCs w:val="32"/>
@@ -2075,7 +2075,7 @@
         </w:r>
         <w:r>
           <w:rPr>
-            <w:rFonts w:cs="TH Sarabun New"/>
+            <w:rFonts w:cs="TH SarabunIT๙"/>
             <w:noProof/>
             <w:webHidden/>
             <w:szCs w:val="32"/>
@@ -2084,16 +2084,16 @@
         </w:r>
         <w:r>
           <w:rPr>
-            <w:rFonts w:cs="TH Sarabun New"/>
+            <w:rFonts w:cs="TH SarabunIT๙"/>
             <w:noProof/>
             <w:webHidden/>
             <w:szCs w:val="32"/>
           </w:rPr>
-          <w:instrText xml:space="preserve"> PAGEREF _Toc244044748 \h </w:instrText>
+          <w:instrText xml:space="preserve"> PAGEREF _Toc244045433 \h </w:instrText>
         </w:r>
         <w:r>
           <w:rPr>
-            <w:rFonts w:cs="TH Sarabun New"/>
+            <w:rFonts w:cs="TH SarabunIT๙"/>
             <w:noProof/>
             <w:webHidden/>
             <w:szCs w:val="32"/>
@@ -2101,7 +2101,7 @@
         </w:r>
         <w:r>
           <w:rPr>
-            <w:rFonts w:cs="TH Sarabun New"/>
+            <w:rFonts w:cs="TH SarabunIT๙"/>
             <w:noProof/>
             <w:webHidden/>
             <w:szCs w:val="32"/>
@@ -2110,16 +2110,16 @@
         </w:r>
         <w:r>
           <w:rPr>
-            <w:rFonts w:cs="TH Sarabun New"/>
+            <w:rFonts w:cs="TH SarabunIT๙"/>
             <w:noProof/>
             <w:webHidden/>
             <w:szCs w:val="32"/>
           </w:rPr>
-          <w:t>17</w:t>
+          <w:t>15</w:t>
         </w:r>
         <w:r>
           <w:rPr>
-            <w:rFonts w:cs="TH Sarabun New"/>
+            <w:rFonts w:cs="TH SarabunIT๙"/>
             <w:noProof/>
             <w:webHidden/>
             <w:szCs w:val="32"/>
@@ -2135,18 +2135,18 @@
           <w:tab w:val="right" w:leader="dot" w:pos="9016"/>
         </w:tabs>
         <w:rPr>
-          <w:rFonts w:eastAsiaTheme="minorEastAsia" w:cs="TH Sarabun New"/>
+          <w:rFonts w:eastAsiaTheme="minorEastAsia" w:cs="TH SarabunIT๙"/>
           <w:noProof/>
           <w:kern w:val="2"/>
           <w:szCs w:val="32"/>
           <w14:ligatures w14:val="standardContextual"/>
         </w:rPr>
       </w:pPr>
-      <w:hyperlink w:anchor="_Toc244044749" w:history="1">
+      <w:hyperlink w:anchor="_Toc244045434" w:history="1">
         <w:r>
           <w:rPr>
             <w:rStyle w:val="Hyperlink"/>
-            <w:rFonts w:cs="TH Sarabun New"/>
+            <w:rFonts w:cs="TH SarabunIT๙"/>
             <w:noProof/>
             <w:szCs w:val="32"/>
             <w:cs/>
@@ -2155,7 +2155,7 @@
         </w:r>
         <w:r>
           <w:rPr>
-            <w:rFonts w:cs="TH Sarabun New"/>
+            <w:rFonts w:cs="TH SarabunIT๙"/>
             <w:noProof/>
             <w:webHidden/>
             <w:szCs w:val="32"/>
@@ -2164,7 +2164,7 @@
         </w:r>
         <w:r>
           <w:rPr>
-            <w:rFonts w:cs="TH Sarabun New"/>
+            <w:rFonts w:cs="TH SarabunIT๙"/>
             <w:noProof/>
             <w:webHidden/>
             <w:szCs w:val="32"/>
@@ -2173,16 +2173,16 @@
         </w:r>
         <w:r>
           <w:rPr>
-            <w:rFonts w:cs="TH Sarabun New"/>
+            <w:rFonts w:cs="TH SarabunIT๙"/>
             <w:noProof/>
             <w:webHidden/>
             <w:szCs w:val="32"/>
           </w:rPr>
-          <w:instrText xml:space="preserve"> PAGEREF _Toc244044749 \h </w:instrText>
+          <w:instrText xml:space="preserve"> PAGEREF _Toc244045434 \h </w:instrText>
         </w:r>
         <w:r>
           <w:rPr>
-            <w:rFonts w:cs="TH Sarabun New"/>
+            <w:rFonts w:cs="TH SarabunIT๙"/>
             <w:noProof/>
             <w:webHidden/>
             <w:szCs w:val="32"/>
@@ -2190,7 +2190,7 @@
         </w:r>
         <w:r>
           <w:rPr>
-            <w:rFonts w:cs="TH Sarabun New"/>
+            <w:rFonts w:cs="TH SarabunIT๙"/>
             <w:noProof/>
             <w:webHidden/>
             <w:szCs w:val="32"/>
@@ -2199,16 +2199,16 @@
         </w:r>
         <w:r>
           <w:rPr>
-            <w:rFonts w:cs="TH Sarabun New"/>
+            <w:rFonts w:cs="TH SarabunIT๙"/>
             <w:noProof/>
             <w:webHidden/>
             <w:szCs w:val="32"/>
           </w:rPr>
-          <w:t>17</w:t>
+          <w:t>15</w:t>
         </w:r>
         <w:r>
           <w:rPr>
-            <w:rFonts w:cs="TH Sarabun New"/>
+            <w:rFonts w:cs="TH SarabunIT๙"/>
             <w:noProof/>
             <w:webHidden/>
             <w:szCs w:val="32"/>
@@ -2224,18 +2224,18 @@
           <w:tab w:val="right" w:leader="dot" w:pos="9016"/>
         </w:tabs>
         <w:rPr>
-          <w:rFonts w:eastAsiaTheme="minorEastAsia" w:cs="TH Sarabun New"/>
+          <w:rFonts w:eastAsiaTheme="minorEastAsia" w:cs="TH SarabunIT๙"/>
           <w:noProof/>
           <w:kern w:val="2"/>
           <w:szCs w:val="32"/>
           <w14:ligatures w14:val="standardContextual"/>
         </w:rPr>
       </w:pPr>
-      <w:hyperlink w:anchor="_Toc244044750" w:history="1">
+      <w:hyperlink w:anchor="_Toc244045435" w:history="1">
         <w:r>
           <w:rPr>
             <w:rStyle w:val="Hyperlink"/>
-            <w:rFonts w:cs="TH Sarabun New"/>
+            <w:rFonts w:cs="TH SarabunIT๙"/>
             <w:noProof/>
             <w:szCs w:val="32"/>
             <w:cs/>
@@ -2244,7 +2244,7 @@
         </w:r>
         <w:r>
           <w:rPr>
-            <w:rFonts w:cs="TH Sarabun New"/>
+            <w:rFonts w:cs="TH SarabunIT๙"/>
             <w:noProof/>
             <w:webHidden/>
             <w:szCs w:val="32"/>
@@ -2253,7 +2253,7 @@
         </w:r>
         <w:r>
           <w:rPr>
-            <w:rFonts w:cs="TH Sarabun New"/>
+            <w:rFonts w:cs="TH SarabunIT๙"/>
             <w:noProof/>
             <w:webHidden/>
             <w:szCs w:val="32"/>
@@ -2262,16 +2262,16 @@
         </w:r>
         <w:r>
           <w:rPr>
-            <w:rFonts w:cs="TH Sarabun New"/>
+            <w:rFonts w:cs="TH SarabunIT๙"/>
             <w:noProof/>
             <w:webHidden/>
             <w:szCs w:val="32"/>
           </w:rPr>
-          <w:instrText xml:space="preserve"> PAGEREF _Toc244044750 \h </w:instrText>
+          <w:instrText xml:space="preserve"> PAGEREF _Toc244045435 \h </w:instrText>
         </w:r>
         <w:r>
           <w:rPr>
-            <w:rFonts w:cs="TH Sarabun New"/>
+            <w:rFonts w:cs="TH SarabunIT๙"/>
             <w:noProof/>
             <w:webHidden/>
             <w:szCs w:val="32"/>
@@ -2279,7 +2279,7 @@
         </w:r>
         <w:r>
           <w:rPr>
-            <w:rFonts w:cs="TH Sarabun New"/>
+            <w:rFonts w:cs="TH SarabunIT๙"/>
             <w:noProof/>
             <w:webHidden/>
             <w:szCs w:val="32"/>
@@ -2288,16 +2288,16 @@
         </w:r>
         <w:r>
           <w:rPr>
-            <w:rFonts w:cs="TH Sarabun New"/>
+            <w:rFonts w:cs="TH SarabunIT๙"/>
             <w:noProof/>
             <w:webHidden/>
             <w:szCs w:val="32"/>
           </w:rPr>
-          <w:t>17</w:t>
+          <w:t>15</w:t>
         </w:r>
         <w:r>
           <w:rPr>
-            <w:rFonts w:cs="TH Sarabun New"/>
+            <w:rFonts w:cs="TH SarabunIT๙"/>
             <w:noProof/>
             <w:webHidden/>
             <w:szCs w:val="32"/>
@@ -2313,18 +2313,18 @@
           <w:tab w:val="right" w:leader="dot" w:pos="9016"/>
         </w:tabs>
         <w:rPr>
-          <w:rFonts w:eastAsiaTheme="minorEastAsia" w:cs="TH Sarabun New"/>
+          <w:rFonts w:eastAsiaTheme="minorEastAsia" w:cs="TH SarabunIT๙"/>
           <w:noProof/>
           <w:kern w:val="2"/>
           <w:szCs w:val="32"/>
           <w14:ligatures w14:val="standardContextual"/>
         </w:rPr>
       </w:pPr>
-      <w:hyperlink w:anchor="_Toc244044751" w:history="1">
+      <w:hyperlink w:anchor="_Toc244045436" w:history="1">
         <w:r>
           <w:rPr>
             <w:rStyle w:val="Hyperlink"/>
-            <w:rFonts w:cs="TH Sarabun New"/>
+            <w:rFonts w:cs="TH SarabunIT๙"/>
             <w:noProof/>
             <w:szCs w:val="32"/>
             <w:cs/>
@@ -2334,7 +2334,7 @@
         <w:r>
           <w:rPr>
             <w:rStyle w:val="Hyperlink"/>
-            <w:rFonts w:cs="TH Sarabun New"/>
+            <w:rFonts w:cs="TH SarabunIT๙"/>
             <w:noProof/>
             <w:szCs w:val="32"/>
           </w:rPr>
@@ -2343,7 +2343,7 @@
         <w:r>
           <w:rPr>
             <w:rStyle w:val="Hyperlink"/>
-            <w:rFonts w:cs="TH Sarabun New"/>
+            <w:rFonts w:cs="TH SarabunIT๙"/>
             <w:noProof/>
             <w:szCs w:val="32"/>
             <w:cs/>
@@ -2352,7 +2352,7 @@
         </w:r>
         <w:r>
           <w:rPr>
-            <w:rFonts w:cs="TH Sarabun New"/>
+            <w:rFonts w:cs="TH SarabunIT๙"/>
             <w:noProof/>
             <w:webHidden/>
             <w:szCs w:val="32"/>
@@ -2361,7 +2361,7 @@
         </w:r>
         <w:r>
           <w:rPr>
-            <w:rFonts w:cs="TH Sarabun New"/>
+            <w:rFonts w:cs="TH SarabunIT๙"/>
             <w:noProof/>
             <w:webHidden/>
             <w:szCs w:val="32"/>
@@ -2370,16 +2370,16 @@
         </w:r>
         <w:r>
           <w:rPr>
-            <w:rFonts w:cs="TH Sarabun New"/>
+            <w:rFonts w:cs="TH SarabunIT๙"/>
             <w:noProof/>
             <w:webHidden/>
             <w:szCs w:val="32"/>
           </w:rPr>
-          <w:instrText xml:space="preserve"> PAGEREF _Toc244044751 \h </w:instrText>
+          <w:instrText xml:space="preserve"> PAGEREF _Toc244045436 \h </w:instrText>
         </w:r>
         <w:r>
           <w:rPr>
-            <w:rFonts w:cs="TH Sarabun New"/>
+            <w:rFonts w:cs="TH SarabunIT๙"/>
             <w:noProof/>
             <w:webHidden/>
             <w:szCs w:val="32"/>
@@ -2387,7 +2387,7 @@
         </w:r>
         <w:r>
           <w:rPr>
-            <w:rFonts w:cs="TH Sarabun New"/>
+            <w:rFonts w:cs="TH SarabunIT๙"/>
             <w:noProof/>
             <w:webHidden/>
             <w:szCs w:val="32"/>
@@ -2396,16 +2396,16 @@
         </w:r>
         <w:r>
           <w:rPr>
-            <w:rFonts w:cs="TH Sarabun New"/>
+            <w:rFonts w:cs="TH SarabunIT๙"/>
             <w:noProof/>
             <w:webHidden/>
             <w:szCs w:val="32"/>
           </w:rPr>
-          <w:t>18</w:t>
+          <w:t>16</w:t>
         </w:r>
         <w:r>
           <w:rPr>
-            <w:rFonts w:cs="TH Sarabun New"/>
+            <w:rFonts w:cs="TH SarabunIT๙"/>
             <w:noProof/>
             <w:webHidden/>
             <w:szCs w:val="32"/>
@@ -2421,18 +2421,18 @@
           <w:tab w:val="right" w:leader="dot" w:pos="9016"/>
         </w:tabs>
         <w:rPr>
-          <w:rFonts w:eastAsiaTheme="minorEastAsia" w:cs="TH Sarabun New"/>
+          <w:rFonts w:eastAsiaTheme="minorEastAsia" w:cs="TH SarabunIT๙"/>
           <w:noProof/>
           <w:kern w:val="2"/>
           <w:szCs w:val="32"/>
           <w14:ligatures w14:val="standardContextual"/>
         </w:rPr>
       </w:pPr>
-      <w:hyperlink w:anchor="_Toc244044752" w:history="1">
+      <w:hyperlink w:anchor="_Toc244045437" w:history="1">
         <w:r>
           <w:rPr>
             <w:rStyle w:val="Hyperlink"/>
-            <w:rFonts w:cs="TH Sarabun New"/>
+            <w:rFonts w:cs="TH SarabunIT๙"/>
             <w:noProof/>
             <w:szCs w:val="32"/>
             <w:cs/>
@@ -2441,7 +2441,7 @@
         </w:r>
         <w:r>
           <w:rPr>
-            <w:rFonts w:cs="TH Sarabun New"/>
+            <w:rFonts w:cs="TH SarabunIT๙"/>
             <w:noProof/>
             <w:webHidden/>
             <w:szCs w:val="32"/>
@@ -2450,7 +2450,7 @@
         </w:r>
         <w:r>
           <w:rPr>
-            <w:rFonts w:cs="TH Sarabun New"/>
+            <w:rFonts w:cs="TH SarabunIT๙"/>
             <w:noProof/>
             <w:webHidden/>
             <w:szCs w:val="32"/>
@@ -2459,16 +2459,16 @@
         </w:r>
         <w:r>
           <w:rPr>
-            <w:rFonts w:cs="TH Sarabun New"/>
+            <w:rFonts w:cs="TH SarabunIT๙"/>
             <w:noProof/>
             <w:webHidden/>
             <w:szCs w:val="32"/>
           </w:rPr>
-          <w:instrText xml:space="preserve"> PAGEREF _Toc244044752 \h </w:instrText>
+          <w:instrText xml:space="preserve"> PAGEREF _Toc244045437 \h </w:instrText>
         </w:r>
         <w:r>
           <w:rPr>
-            <w:rFonts w:cs="TH Sarabun New"/>
+            <w:rFonts w:cs="TH SarabunIT๙"/>
             <w:noProof/>
             <w:webHidden/>
             <w:szCs w:val="32"/>
@@ -2476,7 +2476,7 @@
         </w:r>
         <w:r>
           <w:rPr>
-            <w:rFonts w:cs="TH Sarabun New"/>
+            <w:rFonts w:cs="TH SarabunIT๙"/>
             <w:noProof/>
             <w:webHidden/>
             <w:szCs w:val="32"/>
@@ -2485,16 +2485,16 @@
         </w:r>
         <w:r>
           <w:rPr>
-            <w:rFonts w:cs="TH Sarabun New"/>
+            <w:rFonts w:cs="TH SarabunIT๙"/>
             <w:noProof/>
             <w:webHidden/>
             <w:szCs w:val="32"/>
           </w:rPr>
-          <w:t>18</w:t>
+          <w:t>16</w:t>
         </w:r>
         <w:r>
           <w:rPr>
-            <w:rFonts w:cs="TH Sarabun New"/>
+            <w:rFonts w:cs="TH SarabunIT๙"/>
             <w:noProof/>
             <w:webHidden/>
             <w:szCs w:val="32"/>
@@ -2510,18 +2510,18 @@
           <w:tab w:val="right" w:leader="dot" w:pos="9016"/>
         </w:tabs>
         <w:rPr>
-          <w:rFonts w:eastAsiaTheme="minorEastAsia" w:cs="TH Sarabun New"/>
+          <w:rFonts w:eastAsiaTheme="minorEastAsia" w:cs="TH SarabunIT๙"/>
           <w:noProof/>
           <w:kern w:val="2"/>
           <w:szCs w:val="32"/>
           <w14:ligatures w14:val="standardContextual"/>
         </w:rPr>
       </w:pPr>
-      <w:hyperlink w:anchor="_Toc244044753" w:history="1">
+      <w:hyperlink w:anchor="_Toc244045438" w:history="1">
         <w:r>
           <w:rPr>
             <w:rStyle w:val="Hyperlink"/>
-            <w:rFonts w:cs="TH Sarabun New"/>
+            <w:rFonts w:cs="TH SarabunIT๙"/>
             <w:noProof/>
             <w:szCs w:val="32"/>
             <w:cs/>
@@ -2531,7 +2531,7 @@
         <w:r>
           <w:rPr>
             <w:rStyle w:val="Hyperlink"/>
-            <w:rFonts w:cs="TH Sarabun New"/>
+            <w:rFonts w:cs="TH SarabunIT๙"/>
             <w:noProof/>
             <w:szCs w:val="32"/>
           </w:rPr>
@@ -2539,7 +2539,7 @@
         </w:r>
         <w:r>
           <w:rPr>
-            <w:rFonts w:cs="TH Sarabun New"/>
+            <w:rFonts w:cs="TH SarabunIT๙"/>
             <w:noProof/>
             <w:webHidden/>
             <w:szCs w:val="32"/>
@@ -2548,7 +2548,7 @@
         </w:r>
         <w:r>
           <w:rPr>
-            <w:rFonts w:cs="TH Sarabun New"/>
+            <w:rFonts w:cs="TH SarabunIT๙"/>
             <w:noProof/>
             <w:webHidden/>
             <w:szCs w:val="32"/>
@@ -2557,16 +2557,16 @@
         </w:r>
         <w:r>
           <w:rPr>
-            <w:rFonts w:cs="TH Sarabun New"/>
+            <w:rFonts w:cs="TH SarabunIT๙"/>
             <w:noProof/>
             <w:webHidden/>
             <w:szCs w:val="32"/>
           </w:rPr>
-          <w:instrText xml:space="preserve"> PAGEREF _Toc244044753 \h </w:instrText>
+          <w:instrText xml:space="preserve"> PAGEREF _Toc244045438 \h </w:instrText>
         </w:r>
         <w:r>
           <w:rPr>
-            <w:rFonts w:cs="TH Sarabun New"/>
+            <w:rFonts w:cs="TH SarabunIT๙"/>
             <w:noProof/>
             <w:webHidden/>
             <w:szCs w:val="32"/>
@@ -2574,7 +2574,7 @@
         </w:r>
         <w:r>
           <w:rPr>
-            <w:rFonts w:cs="TH Sarabun New"/>
+            <w:rFonts w:cs="TH SarabunIT๙"/>
             <w:noProof/>
             <w:webHidden/>
             <w:szCs w:val="32"/>
@@ -2583,16 +2583,16 @@
         </w:r>
         <w:r>
           <w:rPr>
-            <w:rFonts w:cs="TH Sarabun New"/>
+            <w:rFonts w:cs="TH SarabunIT๙"/>
             <w:noProof/>
             <w:webHidden/>
             <w:szCs w:val="32"/>
           </w:rPr>
-          <w:t>19</w:t>
+          <w:t>17</w:t>
         </w:r>
         <w:r>
           <w:rPr>
-            <w:rFonts w:cs="TH Sarabun New"/>
+            <w:rFonts w:cs="TH SarabunIT๙"/>
             <w:noProof/>
             <w:webHidden/>
             <w:szCs w:val="32"/>
@@ -2608,18 +2608,18 @@
           <w:tab w:val="right" w:leader="dot" w:pos="9016"/>
         </w:tabs>
         <w:rPr>
-          <w:rFonts w:eastAsiaTheme="minorEastAsia" w:cs="TH Sarabun New"/>
+          <w:rFonts w:eastAsiaTheme="minorEastAsia" w:cs="TH SarabunIT๙"/>
           <w:noProof/>
           <w:kern w:val="2"/>
           <w:szCs w:val="32"/>
           <w14:ligatures w14:val="standardContextual"/>
         </w:rPr>
       </w:pPr>
-      <w:hyperlink w:anchor="_Toc244044754" w:history="1">
+      <w:hyperlink w:anchor="_Toc244045439" w:history="1">
         <w:r>
           <w:rPr>
             <w:rStyle w:val="Hyperlink"/>
-            <w:rFonts w:cs="TH Sarabun New"/>
+            <w:rFonts w:cs="TH SarabunIT๙"/>
             <w:noProof/>
             <w:szCs w:val="32"/>
             <w:cs/>
@@ -2628,7 +2628,7 @@
         </w:r>
         <w:r>
           <w:rPr>
-            <w:rFonts w:cs="TH Sarabun New"/>
+            <w:rFonts w:cs="TH SarabunIT๙"/>
             <w:noProof/>
             <w:webHidden/>
             <w:szCs w:val="32"/>
@@ -2637,7 +2637,7 @@
         </w:r>
         <w:r>
           <w:rPr>
-            <w:rFonts w:cs="TH Sarabun New"/>
+            <w:rFonts w:cs="TH SarabunIT๙"/>
             <w:noProof/>
             <w:webHidden/>
             <w:szCs w:val="32"/>
@@ -2646,16 +2646,16 @@
         </w:r>
         <w:r>
           <w:rPr>
-            <w:rFonts w:cs="TH Sarabun New"/>
+            <w:rFonts w:cs="TH SarabunIT๙"/>
             <w:noProof/>
             <w:webHidden/>
             <w:szCs w:val="32"/>
           </w:rPr>
-          <w:instrText xml:space="preserve"> PAGEREF _Toc244044754 \h </w:instrText>
+          <w:instrText xml:space="preserve"> PAGEREF _Toc244045439 \h </w:instrText>
         </w:r>
         <w:r>
           <w:rPr>
-            <w:rFonts w:cs="TH Sarabun New"/>
+            <w:rFonts w:cs="TH SarabunIT๙"/>
             <w:noProof/>
             <w:webHidden/>
             <w:szCs w:val="32"/>
@@ -2663,7 +2663,7 @@
         </w:r>
         <w:r>
           <w:rPr>
-            <w:rFonts w:cs="TH Sarabun New"/>
+            <w:rFonts w:cs="TH SarabunIT๙"/>
             <w:noProof/>
             <w:webHidden/>
             <w:szCs w:val="32"/>
@@ -2672,16 +2672,16 @@
         </w:r>
         <w:r>
           <w:rPr>
-            <w:rFonts w:cs="TH Sarabun New"/>
+            <w:rFonts w:cs="TH SarabunIT๙"/>
             <w:noProof/>
             <w:webHidden/>
             <w:szCs w:val="32"/>
           </w:rPr>
-          <w:t>20</w:t>
+          <w:t>17</w:t>
         </w:r>
         <w:r>
           <w:rPr>
-            <w:rFonts w:cs="TH Sarabun New"/>
+            <w:rFonts w:cs="TH SarabunIT๙"/>
             <w:noProof/>
             <w:webHidden/>
             <w:szCs w:val="32"/>
@@ -2697,18 +2697,18 @@
           <w:tab w:val="right" w:leader="dot" w:pos="9016"/>
         </w:tabs>
         <w:rPr>
-          <w:rFonts w:eastAsiaTheme="minorEastAsia" w:cs="TH Sarabun New"/>
+          <w:rFonts w:eastAsiaTheme="minorEastAsia" w:cs="TH SarabunIT๙"/>
           <w:noProof/>
           <w:kern w:val="2"/>
           <w:szCs w:val="32"/>
           <w14:ligatures w14:val="standardContextual"/>
         </w:rPr>
       </w:pPr>
-      <w:hyperlink w:anchor="_Toc244044755" w:history="1">
+      <w:hyperlink w:anchor="_Toc244045440" w:history="1">
         <w:r>
           <w:rPr>
             <w:rStyle w:val="Hyperlink"/>
-            <w:rFonts w:cs="TH Sarabun New"/>
+            <w:rFonts w:cs="TH SarabunIT๙"/>
             <w:noProof/>
             <w:szCs w:val="32"/>
             <w:cs/>
@@ -2717,7 +2717,7 @@
         </w:r>
         <w:r>
           <w:rPr>
-            <w:rFonts w:cs="TH Sarabun New"/>
+            <w:rFonts w:cs="TH SarabunIT๙"/>
             <w:noProof/>
             <w:webHidden/>
             <w:szCs w:val="32"/>
@@ -2726,7 +2726,7 @@
         </w:r>
         <w:r>
           <w:rPr>
-            <w:rFonts w:cs="TH Sarabun New"/>
+            <w:rFonts w:cs="TH SarabunIT๙"/>
             <w:noProof/>
             <w:webHidden/>
             <w:szCs w:val="32"/>
@@ -2735,16 +2735,16 @@
         </w:r>
         <w:r>
           <w:rPr>
-            <w:rFonts w:cs="TH Sarabun New"/>
+            <w:rFonts w:cs="TH SarabunIT๙"/>
             <w:noProof/>
             <w:webHidden/>
             <w:szCs w:val="32"/>
           </w:rPr>
-          <w:instrText xml:space="preserve"> PAGEREF _Toc244044755 \h </w:instrText>
+          <w:instrText xml:space="preserve"> PAGEREF _Toc244045440 \h </w:instrText>
         </w:r>
         <w:r>
           <w:rPr>
-            <w:rFonts w:cs="TH Sarabun New"/>
+            <w:rFonts w:cs="TH SarabunIT๙"/>
             <w:noProof/>
             <w:webHidden/>
             <w:szCs w:val="32"/>
@@ -2752,7 +2752,7 @@
         </w:r>
         <w:r>
           <w:rPr>
-            <w:rFonts w:cs="TH Sarabun New"/>
+            <w:rFonts w:cs="TH SarabunIT๙"/>
             <w:noProof/>
             <w:webHidden/>
             <w:szCs w:val="32"/>
@@ -2761,16 +2761,16 @@
         </w:r>
         <w:r>
           <w:rPr>
-            <w:rFonts w:cs="TH Sarabun New"/>
+            <w:rFonts w:cs="TH SarabunIT๙"/>
             <w:noProof/>
             <w:webHidden/>
             <w:szCs w:val="32"/>
           </w:rPr>
-          <w:t>20</w:t>
+          <w:t>17</w:t>
         </w:r>
         <w:r>
           <w:rPr>
-            <w:rFonts w:cs="TH Sarabun New"/>
+            <w:rFonts w:cs="TH SarabunIT๙"/>
             <w:noProof/>
             <w:webHidden/>
             <w:szCs w:val="32"/>
@@ -2786,18 +2786,18 @@
           <w:tab w:val="right" w:leader="dot" w:pos="9016"/>
         </w:tabs>
         <w:rPr>
-          <w:rFonts w:eastAsiaTheme="minorEastAsia" w:cs="TH Sarabun New"/>
+          <w:rFonts w:eastAsiaTheme="minorEastAsia" w:cs="TH SarabunIT๙"/>
           <w:noProof/>
           <w:kern w:val="2"/>
           <w:szCs w:val="32"/>
           <w14:ligatures w14:val="standardContextual"/>
         </w:rPr>
       </w:pPr>
-      <w:hyperlink w:anchor="_Toc244044756" w:history="1">
+      <w:hyperlink w:anchor="_Toc244045441" w:history="1">
         <w:r>
           <w:rPr>
             <w:rStyle w:val="Hyperlink"/>
-            <w:rFonts w:cs="TH Sarabun New"/>
+            <w:rFonts w:cs="TH SarabunIT๙"/>
             <w:noProof/>
             <w:szCs w:val="32"/>
             <w:cs/>
@@ -2806,7 +2806,7 @@
         </w:r>
         <w:r>
           <w:rPr>
-            <w:rFonts w:cs="TH Sarabun New"/>
+            <w:rFonts w:cs="TH SarabunIT๙"/>
             <w:noProof/>
             <w:webHidden/>
             <w:szCs w:val="32"/>
@@ -2815,7 +2815,7 @@
         </w:r>
         <w:r>
           <w:rPr>
-            <w:rFonts w:cs="TH Sarabun New"/>
+            <w:rFonts w:cs="TH SarabunIT๙"/>
             <w:noProof/>
             <w:webHidden/>
             <w:szCs w:val="32"/>
@@ -2824,16 +2824,16 @@
         </w:r>
         <w:r>
           <w:rPr>
-            <w:rFonts w:cs="TH Sarabun New"/>
+            <w:rFonts w:cs="TH SarabunIT๙"/>
             <w:noProof/>
             <w:webHidden/>
             <w:szCs w:val="32"/>
           </w:rPr>
-          <w:instrText xml:space="preserve"> PAGEREF _Toc244044756 \h </w:instrText>
+          <w:instrText xml:space="preserve"> PAGEREF _Toc244045441 \h </w:instrText>
         </w:r>
         <w:r>
           <w:rPr>
-            <w:rFonts w:cs="TH Sarabun New"/>
+            <w:rFonts w:cs="TH SarabunIT๙"/>
             <w:noProof/>
             <w:webHidden/>
             <w:szCs w:val="32"/>
@@ -2841,7 +2841,7 @@
         </w:r>
         <w:r>
           <w:rPr>
-            <w:rFonts w:cs="TH Sarabun New"/>
+            <w:rFonts w:cs="TH SarabunIT๙"/>
             <w:noProof/>
             <w:webHidden/>
             <w:szCs w:val="32"/>
@@ -2850,16 +2850,16 @@
         </w:r>
         <w:r>
           <w:rPr>
-            <w:rFonts w:cs="TH Sarabun New"/>
+            <w:rFonts w:cs="TH SarabunIT๙"/>
             <w:noProof/>
             <w:webHidden/>
             <w:szCs w:val="32"/>
           </w:rPr>
-          <w:t>20</w:t>
+          <w:t>17</w:t>
         </w:r>
         <w:r>
           <w:rPr>
-            <w:rFonts w:cs="TH Sarabun New"/>
+            <w:rFonts w:cs="TH SarabunIT๙"/>
             <w:noProof/>
             <w:webHidden/>
             <w:szCs w:val="32"/>
@@ -2875,18 +2875,18 @@
           <w:tab w:val="right" w:leader="dot" w:pos="9016"/>
         </w:tabs>
         <w:rPr>
-          <w:rFonts w:eastAsiaTheme="minorEastAsia" w:cs="TH Sarabun New"/>
+          <w:rFonts w:eastAsiaTheme="minorEastAsia" w:cs="TH SarabunIT๙"/>
           <w:noProof/>
           <w:kern w:val="2"/>
           <w:szCs w:val="32"/>
           <w14:ligatures w14:val="standardContextual"/>
         </w:rPr>
       </w:pPr>
-      <w:hyperlink w:anchor="_Toc244044757" w:history="1">
+      <w:hyperlink w:anchor="_Toc244045442" w:history="1">
         <w:r>
           <w:rPr>
             <w:rStyle w:val="Hyperlink"/>
-            <w:rFonts w:cs="TH Sarabun New"/>
+            <w:rFonts w:cs="TH SarabunIT๙"/>
             <w:noProof/>
             <w:szCs w:val="32"/>
             <w:cs/>
@@ -2895,7 +2895,7 @@
         </w:r>
         <w:r>
           <w:rPr>
-            <w:rFonts w:cs="TH Sarabun New"/>
+            <w:rFonts w:cs="TH SarabunIT๙"/>
             <w:noProof/>
             <w:webHidden/>
             <w:szCs w:val="32"/>
@@ -2904,7 +2904,7 @@
         </w:r>
         <w:r>
           <w:rPr>
-            <w:rFonts w:cs="TH Sarabun New"/>
+            <w:rFonts w:cs="TH SarabunIT๙"/>
             <w:noProof/>
             <w:webHidden/>
             <w:szCs w:val="32"/>
@@ -2913,16 +2913,16 @@
         </w:r>
         <w:r>
           <w:rPr>
-            <w:rFonts w:cs="TH Sarabun New"/>
+            <w:rFonts w:cs="TH SarabunIT๙"/>
             <w:noProof/>
             <w:webHidden/>
             <w:szCs w:val="32"/>
           </w:rPr>
-          <w:instrText xml:space="preserve"> PAGEREF _Toc244044757 \h </w:instrText>
+          <w:instrText xml:space="preserve"> PAGEREF _Toc244045442 \h </w:instrText>
         </w:r>
         <w:r>
           <w:rPr>
-            <w:rFonts w:cs="TH Sarabun New"/>
+            <w:rFonts w:cs="TH SarabunIT๙"/>
             <w:noProof/>
             <w:webHidden/>
             <w:szCs w:val="32"/>
@@ -2930,7 +2930,7 @@
         </w:r>
         <w:r>
           <w:rPr>
-            <w:rFonts w:cs="TH Sarabun New"/>
+            <w:rFonts w:cs="TH SarabunIT๙"/>
             <w:noProof/>
             <w:webHidden/>
             <w:szCs w:val="32"/>
@@ -2939,16 +2939,16 @@
         </w:r>
         <w:r>
           <w:rPr>
-            <w:rFonts w:cs="TH Sarabun New"/>
+            <w:rFonts w:cs="TH SarabunIT๙"/>
             <w:noProof/>
             <w:webHidden/>
             <w:szCs w:val="32"/>
           </w:rPr>
-          <w:t>20</w:t>
+          <w:t>18</w:t>
         </w:r>
         <w:r>
           <w:rPr>
-            <w:rFonts w:cs="TH Sarabun New"/>
+            <w:rFonts w:cs="TH SarabunIT๙"/>
             <w:noProof/>
             <w:webHidden/>
             <w:szCs w:val="32"/>
@@ -2964,18 +2964,18 @@
           <w:tab w:val="right" w:leader="dot" w:pos="9016"/>
         </w:tabs>
         <w:rPr>
-          <w:rFonts w:eastAsiaTheme="minorEastAsia" w:cs="TH Sarabun New"/>
+          <w:rFonts w:eastAsiaTheme="minorEastAsia" w:cs="TH SarabunIT๙"/>
           <w:noProof/>
           <w:kern w:val="2"/>
           <w:szCs w:val="32"/>
           <w14:ligatures w14:val="standardContextual"/>
         </w:rPr>
       </w:pPr>
-      <w:hyperlink w:anchor="_Toc244044758" w:history="1">
+      <w:hyperlink w:anchor="_Toc244045443" w:history="1">
         <w:r>
           <w:rPr>
             <w:rStyle w:val="Hyperlink"/>
-            <w:rFonts w:cs="TH Sarabun New"/>
+            <w:rFonts w:cs="TH SarabunIT๙"/>
             <w:noProof/>
             <w:szCs w:val="32"/>
             <w:cs/>
@@ -2984,7 +2984,7 @@
         </w:r>
         <w:r>
           <w:rPr>
-            <w:rFonts w:cs="TH Sarabun New"/>
+            <w:rFonts w:cs="TH SarabunIT๙"/>
             <w:noProof/>
             <w:webHidden/>
             <w:szCs w:val="32"/>
@@ -2993,7 +2993,7 @@
         </w:r>
         <w:r>
           <w:rPr>
-            <w:rFonts w:cs="TH Sarabun New"/>
+            <w:rFonts w:cs="TH SarabunIT๙"/>
             <w:noProof/>
             <w:webHidden/>
             <w:szCs w:val="32"/>
@@ -3002,16 +3002,16 @@
         </w:r>
         <w:r>
           <w:rPr>
-            <w:rFonts w:cs="TH Sarabun New"/>
+            <w:rFonts w:cs="TH SarabunIT๙"/>
             <w:noProof/>
             <w:webHidden/>
             <w:szCs w:val="32"/>
           </w:rPr>
-          <w:instrText xml:space="preserve"> PAGEREF _Toc244044758 \h </w:instrText>
+          <w:instrText xml:space="preserve"> PAGEREF _Toc244045443 \h </w:instrText>
         </w:r>
         <w:r>
           <w:rPr>
-            <w:rFonts w:cs="TH Sarabun New"/>
+            <w:rFonts w:cs="TH SarabunIT๙"/>
             <w:noProof/>
             <w:webHidden/>
             <w:szCs w:val="32"/>
@@ -3019,7 +3019,7 @@
         </w:r>
         <w:r>
           <w:rPr>
-            <w:rFonts w:cs="TH Sarabun New"/>
+            <w:rFonts w:cs="TH SarabunIT๙"/>
             <w:noProof/>
             <w:webHidden/>
             <w:szCs w:val="32"/>
@@ -3028,16 +3028,16 @@
         </w:r>
         <w:r>
           <w:rPr>
-            <w:rFonts w:cs="TH Sarabun New"/>
+            <w:rFonts w:cs="TH SarabunIT๙"/>
             <w:noProof/>
             <w:webHidden/>
             <w:szCs w:val="32"/>
           </w:rPr>
-          <w:t>21</w:t>
+          <w:t>18</w:t>
         </w:r>
         <w:r>
           <w:rPr>
-            <w:rFonts w:cs="TH Sarabun New"/>
+            <w:rFonts w:cs="TH SarabunIT๙"/>
             <w:noProof/>
             <w:webHidden/>
             <w:szCs w:val="32"/>
@@ -3053,18 +3053,18 @@
           <w:tab w:val="right" w:leader="dot" w:pos="9016"/>
         </w:tabs>
         <w:rPr>
-          <w:rFonts w:eastAsiaTheme="minorEastAsia" w:cs="TH Sarabun New"/>
+          <w:rFonts w:eastAsiaTheme="minorEastAsia" w:cs="TH SarabunIT๙"/>
           <w:noProof/>
           <w:kern w:val="2"/>
           <w:szCs w:val="32"/>
           <w14:ligatures w14:val="standardContextual"/>
         </w:rPr>
       </w:pPr>
-      <w:hyperlink w:anchor="_Toc244044759" w:history="1">
+      <w:hyperlink w:anchor="_Toc244045444" w:history="1">
         <w:r>
           <w:rPr>
             <w:rStyle w:val="Hyperlink"/>
-            <w:rFonts w:cs="TH Sarabun New"/>
+            <w:rFonts w:cs="TH SarabunIT๙"/>
             <w:noProof/>
             <w:szCs w:val="32"/>
             <w:cs/>
@@ -3073,7 +3073,7 @@
         </w:r>
         <w:r>
           <w:rPr>
-            <w:rFonts w:cs="TH Sarabun New"/>
+            <w:rFonts w:cs="TH SarabunIT๙"/>
             <w:noProof/>
             <w:webHidden/>
             <w:szCs w:val="32"/>
@@ -3082,7 +3082,7 @@
         </w:r>
         <w:r>
           <w:rPr>
-            <w:rFonts w:cs="TH Sarabun New"/>
+            <w:rFonts w:cs="TH SarabunIT๙"/>
             <w:noProof/>
             <w:webHidden/>
             <w:szCs w:val="32"/>
@@ -3091,16 +3091,16 @@
         </w:r>
         <w:r>
           <w:rPr>
-            <w:rFonts w:cs="TH Sarabun New"/>
+            <w:rFonts w:cs="TH SarabunIT๙"/>
             <w:noProof/>
             <w:webHidden/>
             <w:szCs w:val="32"/>
           </w:rPr>
-          <w:instrText xml:space="preserve"> PAGEREF _Toc244044759 \h </w:instrText>
+          <w:instrText xml:space="preserve"> PAGEREF _Toc244045444 \h </w:instrText>
         </w:r>
         <w:r>
           <w:rPr>
-            <w:rFonts w:cs="TH Sarabun New"/>
+            <w:rFonts w:cs="TH SarabunIT๙"/>
             <w:noProof/>
             <w:webHidden/>
             <w:szCs w:val="32"/>
@@ -3108,7 +3108,7 @@
         </w:r>
         <w:r>
           <w:rPr>
-            <w:rFonts w:cs="TH Sarabun New"/>
+            <w:rFonts w:cs="TH SarabunIT๙"/>
             <w:noProof/>
             <w:webHidden/>
             <w:szCs w:val="32"/>
@@ -3117,16 +3117,16 @@
         </w:r>
         <w:r>
           <w:rPr>
-            <w:rFonts w:cs="TH Sarabun New"/>
+            <w:rFonts w:cs="TH SarabunIT๙"/>
             <w:noProof/>
             <w:webHidden/>
             <w:szCs w:val="32"/>
           </w:rPr>
-          <w:t>22</w:t>
+          <w:t>19</w:t>
         </w:r>
         <w:r>
           <w:rPr>
-            <w:rFonts w:cs="TH Sarabun New"/>
+            <w:rFonts w:cs="TH SarabunIT๙"/>
             <w:noProof/>
             <w:webHidden/>
             <w:szCs w:val="32"/>
@@ -3142,18 +3142,18 @@
           <w:tab w:val="right" w:leader="dot" w:pos="9016"/>
         </w:tabs>
         <w:rPr>
-          <w:rFonts w:eastAsiaTheme="minorEastAsia" w:cs="TH Sarabun New"/>
+          <w:rFonts w:eastAsiaTheme="minorEastAsia" w:cs="TH SarabunIT๙"/>
           <w:noProof/>
           <w:kern w:val="2"/>
           <w:szCs w:val="32"/>
           <w14:ligatures w14:val="standardContextual"/>
         </w:rPr>
       </w:pPr>
-      <w:hyperlink w:anchor="_Toc244044760" w:history="1">
+      <w:hyperlink w:anchor="_Toc244045445" w:history="1">
         <w:r>
           <w:rPr>
             <w:rStyle w:val="Hyperlink"/>
-            <w:rFonts w:cs="TH Sarabun New"/>
+            <w:rFonts w:cs="TH SarabunIT๙"/>
             <w:noProof/>
             <w:szCs w:val="32"/>
             <w:cs/>
@@ -3162,7 +3162,7 @@
         </w:r>
         <w:r>
           <w:rPr>
-            <w:rFonts w:cs="TH Sarabun New"/>
+            <w:rFonts w:cs="TH SarabunIT๙"/>
             <w:noProof/>
             <w:webHidden/>
             <w:szCs w:val="32"/>
@@ -3171,7 +3171,7 @@
         </w:r>
         <w:r>
           <w:rPr>
-            <w:rFonts w:cs="TH Sarabun New"/>
+            <w:rFonts w:cs="TH SarabunIT๙"/>
             <w:noProof/>
             <w:webHidden/>
             <w:szCs w:val="32"/>
@@ -3180,16 +3180,16 @@
         </w:r>
         <w:r>
           <w:rPr>
-            <w:rFonts w:cs="TH Sarabun New"/>
+            <w:rFonts w:cs="TH SarabunIT๙"/>
             <w:noProof/>
             <w:webHidden/>
             <w:szCs w:val="32"/>
           </w:rPr>
-          <w:instrText xml:space="preserve"> PAGEREF _Toc244044760 \h </w:instrText>
+          <w:instrText xml:space="preserve"> PAGEREF _Toc244045445 \h </w:instrText>
         </w:r>
         <w:r>
           <w:rPr>
-            <w:rFonts w:cs="TH Sarabun New"/>
+            <w:rFonts w:cs="TH SarabunIT๙"/>
             <w:noProof/>
             <w:webHidden/>
             <w:szCs w:val="32"/>
@@ -3197,7 +3197,7 @@
         </w:r>
         <w:r>
           <w:rPr>
-            <w:rFonts w:cs="TH Sarabun New"/>
+            <w:rFonts w:cs="TH SarabunIT๙"/>
             <w:noProof/>
             <w:webHidden/>
             <w:szCs w:val="32"/>
@@ -3206,16 +3206,16 @@
         </w:r>
         <w:r>
           <w:rPr>
-            <w:rFonts w:cs="TH Sarabun New"/>
+            <w:rFonts w:cs="TH SarabunIT๙"/>
             <w:noProof/>
             <w:webHidden/>
             <w:szCs w:val="32"/>
           </w:rPr>
-          <w:t>22</w:t>
+          <w:t>19</w:t>
         </w:r>
         <w:r>
           <w:rPr>
-            <w:rFonts w:cs="TH Sarabun New"/>
+            <w:rFonts w:cs="TH SarabunIT๙"/>
             <w:noProof/>
             <w:webHidden/>
             <w:szCs w:val="32"/>
@@ -3231,18 +3231,18 @@
           <w:tab w:val="right" w:leader="dot" w:pos="9016"/>
         </w:tabs>
         <w:rPr>
-          <w:rFonts w:eastAsiaTheme="minorEastAsia" w:cs="TH Sarabun New"/>
+          <w:rFonts w:eastAsiaTheme="minorEastAsia" w:cs="TH SarabunIT๙"/>
           <w:noProof/>
           <w:kern w:val="2"/>
           <w:szCs w:val="32"/>
           <w14:ligatures w14:val="standardContextual"/>
         </w:rPr>
       </w:pPr>
-      <w:hyperlink w:anchor="_Toc244044761" w:history="1">
+      <w:hyperlink w:anchor="_Toc244045446" w:history="1">
         <w:r>
           <w:rPr>
             <w:rStyle w:val="Hyperlink"/>
-            <w:rFonts w:cs="TH Sarabun New"/>
+            <w:rFonts w:cs="TH SarabunIT๙"/>
             <w:noProof/>
             <w:szCs w:val="32"/>
             <w:cs/>
@@ -3251,7 +3251,7 @@
         </w:r>
         <w:r>
           <w:rPr>
-            <w:rFonts w:cs="TH Sarabun New"/>
+            <w:rFonts w:cs="TH SarabunIT๙"/>
             <w:noProof/>
             <w:webHidden/>
             <w:szCs w:val="32"/>
@@ -3260,7 +3260,7 @@
         </w:r>
         <w:r>
           <w:rPr>
-            <w:rFonts w:cs="TH Sarabun New"/>
+            <w:rFonts w:cs="TH SarabunIT๙"/>
             <w:noProof/>
             <w:webHidden/>
             <w:szCs w:val="32"/>
@@ -3269,16 +3269,16 @@
         </w:r>
         <w:r>
           <w:rPr>
-            <w:rFonts w:cs="TH Sarabun New"/>
+            <w:rFonts w:cs="TH SarabunIT๙"/>
             <w:noProof/>
             <w:webHidden/>
             <w:szCs w:val="32"/>
           </w:rPr>
-          <w:instrText xml:space="preserve"> PAGEREF _Toc244044761 \h </w:instrText>
+          <w:instrText xml:space="preserve"> PAGEREF _Toc244045446 \h </w:instrText>
         </w:r>
         <w:r>
           <w:rPr>
-            <w:rFonts w:cs="TH Sarabun New"/>
+            <w:rFonts w:cs="TH SarabunIT๙"/>
             <w:noProof/>
             <w:webHidden/>
             <w:szCs w:val="32"/>
@@ -3286,7 +3286,7 @@
         </w:r>
         <w:r>
           <w:rPr>
-            <w:rFonts w:cs="TH Sarabun New"/>
+            <w:rFonts w:cs="TH SarabunIT๙"/>
             <w:noProof/>
             <w:webHidden/>
             <w:szCs w:val="32"/>
@@ -3295,16 +3295,16 @@
         </w:r>
         <w:r>
           <w:rPr>
-            <w:rFonts w:cs="TH Sarabun New"/>
+            <w:rFonts w:cs="TH SarabunIT๙"/>
             <w:noProof/>
             <w:webHidden/>
             <w:szCs w:val="32"/>
           </w:rPr>
-          <w:t>22</w:t>
+          <w:t>19</w:t>
         </w:r>
         <w:r>
           <w:rPr>
-            <w:rFonts w:cs="TH Sarabun New"/>
+            <w:rFonts w:cs="TH SarabunIT๙"/>
             <w:noProof/>
             <w:webHidden/>
             <w:szCs w:val="32"/>
@@ -3320,18 +3320,18 @@
           <w:tab w:val="right" w:leader="dot" w:pos="9016"/>
         </w:tabs>
         <w:rPr>
-          <w:rFonts w:eastAsiaTheme="minorEastAsia" w:cs="TH Sarabun New"/>
+          <w:rFonts w:eastAsiaTheme="minorEastAsia" w:cs="TH SarabunIT๙"/>
           <w:noProof/>
           <w:kern w:val="2"/>
           <w:szCs w:val="32"/>
           <w14:ligatures w14:val="standardContextual"/>
         </w:rPr>
       </w:pPr>
-      <w:hyperlink w:anchor="_Toc244044762" w:history="1">
+      <w:hyperlink w:anchor="_Toc244045447" w:history="1">
         <w:r>
           <w:rPr>
             <w:rStyle w:val="Hyperlink"/>
-            <w:rFonts w:cs="TH Sarabun New"/>
+            <w:rFonts w:cs="TH SarabunIT๙"/>
             <w:noProof/>
             <w:szCs w:val="32"/>
             <w:cs/>
@@ -3340,7 +3340,7 @@
         </w:r>
         <w:r>
           <w:rPr>
-            <w:rFonts w:cs="TH Sarabun New"/>
+            <w:rFonts w:cs="TH SarabunIT๙"/>
             <w:noProof/>
             <w:webHidden/>
             <w:szCs w:val="32"/>
@@ -3349,7 +3349,7 @@
         </w:r>
         <w:r>
           <w:rPr>
-            <w:rFonts w:cs="TH Sarabun New"/>
+            <w:rFonts w:cs="TH SarabunIT๙"/>
             <w:noProof/>
             <w:webHidden/>
             <w:szCs w:val="32"/>
@@ -3358,16 +3358,16 @@
         </w:r>
         <w:r>
           <w:rPr>
-            <w:rFonts w:cs="TH Sarabun New"/>
+            <w:rFonts w:cs="TH SarabunIT๙"/>
             <w:noProof/>
             <w:webHidden/>
             <w:szCs w:val="32"/>
           </w:rPr>
-          <w:instrText xml:space="preserve"> PAGEREF _Toc244044762 \h </w:instrText>
+          <w:instrText xml:space="preserve"> PAGEREF _Toc244045447 \h </w:instrText>
         </w:r>
         <w:r>
           <w:rPr>
-            <w:rFonts w:cs="TH Sarabun New"/>
+            <w:rFonts w:cs="TH SarabunIT๙"/>
             <w:noProof/>
             <w:webHidden/>
             <w:szCs w:val="32"/>
@@ -3375,7 +3375,7 @@
         </w:r>
         <w:r>
           <w:rPr>
-            <w:rFonts w:cs="TH Sarabun New"/>
+            <w:rFonts w:cs="TH SarabunIT๙"/>
             <w:noProof/>
             <w:webHidden/>
             <w:szCs w:val="32"/>
@@ -3384,16 +3384,16 @@
         </w:r>
         <w:r>
           <w:rPr>
-            <w:rFonts w:cs="TH Sarabun New"/>
+            <w:rFonts w:cs="TH SarabunIT๙"/>
             <w:noProof/>
             <w:webHidden/>
             <w:szCs w:val="32"/>
           </w:rPr>
-          <w:t>22</w:t>
+          <w:t>19</w:t>
         </w:r>
         <w:r>
           <w:rPr>
-            <w:rFonts w:cs="TH Sarabun New"/>
+            <w:rFonts w:cs="TH SarabunIT๙"/>
             <w:noProof/>
             <w:webHidden/>
             <w:szCs w:val="32"/>
@@ -3409,18 +3409,18 @@
           <w:tab w:val="right" w:leader="dot" w:pos="9016"/>
         </w:tabs>
         <w:rPr>
-          <w:rFonts w:eastAsiaTheme="minorEastAsia" w:cs="TH Sarabun New"/>
+          <w:rFonts w:eastAsiaTheme="minorEastAsia" w:cs="TH SarabunIT๙"/>
           <w:noProof/>
           <w:kern w:val="2"/>
           <w:szCs w:val="32"/>
           <w14:ligatures w14:val="standardContextual"/>
         </w:rPr>
       </w:pPr>
-      <w:hyperlink w:anchor="_Toc244044763" w:history="1">
+      <w:hyperlink w:anchor="_Toc244045448" w:history="1">
         <w:r>
           <w:rPr>
             <w:rStyle w:val="Hyperlink"/>
-            <w:rFonts w:cs="TH Sarabun New"/>
+            <w:rFonts w:cs="TH SarabunIT๙"/>
             <w:noProof/>
             <w:szCs w:val="32"/>
             <w:cs/>
@@ -3429,7 +3429,7 @@
         </w:r>
         <w:r>
           <w:rPr>
-            <w:rFonts w:cs="TH Sarabun New"/>
+            <w:rFonts w:cs="TH SarabunIT๙"/>
             <w:noProof/>
             <w:webHidden/>
             <w:szCs w:val="32"/>
@@ -3438,7 +3438,7 @@
         </w:r>
         <w:r>
           <w:rPr>
-            <w:rFonts w:cs="TH Sarabun New"/>
+            <w:rFonts w:cs="TH SarabunIT๙"/>
             <w:noProof/>
             <w:webHidden/>
             <w:szCs w:val="32"/>
@@ -3447,16 +3447,16 @@
         </w:r>
         <w:r>
           <w:rPr>
-            <w:rFonts w:cs="TH Sarabun New"/>
+            <w:rFonts w:cs="TH SarabunIT๙"/>
             <w:noProof/>
             <w:webHidden/>
             <w:szCs w:val="32"/>
           </w:rPr>
-          <w:instrText xml:space="preserve"> PAGEREF _Toc244044763 \h </w:instrText>
+          <w:instrText xml:space="preserve"> PAGEREF _Toc244045448 \h </w:instrText>
         </w:r>
         <w:r>
           <w:rPr>
-            <w:rFonts w:cs="TH Sarabun New"/>
+            <w:rFonts w:cs="TH SarabunIT๙"/>
             <w:noProof/>
             <w:webHidden/>
             <w:szCs w:val="32"/>
@@ -3464,7 +3464,7 @@
         </w:r>
         <w:r>
           <w:rPr>
-            <w:rFonts w:cs="TH Sarabun New"/>
+            <w:rFonts w:cs="TH SarabunIT๙"/>
             <w:noProof/>
             <w:webHidden/>
             <w:szCs w:val="32"/>
@@ -3473,16 +3473,16 @@
         </w:r>
         <w:r>
           <w:rPr>
-            <w:rFonts w:cs="TH Sarabun New"/>
+            <w:rFonts w:cs="TH SarabunIT๙"/>
             <w:noProof/>
             <w:webHidden/>
             <w:szCs w:val="32"/>
           </w:rPr>
-          <w:t>22</w:t>
+          <w:t>19</w:t>
         </w:r>
         <w:r>
           <w:rPr>
-            <w:rFonts w:cs="TH Sarabun New"/>
+            <w:rFonts w:cs="TH SarabunIT๙"/>
             <w:noProof/>
             <w:webHidden/>
             <w:szCs w:val="32"/>
@@ -3498,18 +3498,18 @@
           <w:tab w:val="right" w:leader="dot" w:pos="9016"/>
         </w:tabs>
         <w:rPr>
-          <w:rFonts w:eastAsiaTheme="minorEastAsia" w:cs="TH Sarabun New"/>
+          <w:rFonts w:eastAsiaTheme="minorEastAsia" w:cs="TH SarabunIT๙"/>
           <w:noProof/>
           <w:kern w:val="2"/>
           <w:szCs w:val="32"/>
           <w14:ligatures w14:val="standardContextual"/>
         </w:rPr>
       </w:pPr>
-      <w:hyperlink w:anchor="_Toc244044764" w:history="1">
+      <w:hyperlink w:anchor="_Toc244045449" w:history="1">
         <w:r>
           <w:rPr>
             <w:rStyle w:val="Hyperlink"/>
-            <w:rFonts w:cs="TH Sarabun New"/>
+            <w:rFonts w:cs="TH SarabunIT๙"/>
             <w:noProof/>
             <w:szCs w:val="32"/>
             <w:cs/>
@@ -3518,7 +3518,7 @@
         </w:r>
         <w:r>
           <w:rPr>
-            <w:rFonts w:cs="TH Sarabun New"/>
+            <w:rFonts w:cs="TH SarabunIT๙"/>
             <w:noProof/>
             <w:webHidden/>
             <w:szCs w:val="32"/>
@@ -3527,7 +3527,7 @@
         </w:r>
         <w:r>
           <w:rPr>
-            <w:rFonts w:cs="TH Sarabun New"/>
+            <w:rFonts w:cs="TH SarabunIT๙"/>
             <w:noProof/>
             <w:webHidden/>
             <w:szCs w:val="32"/>
@@ -3536,16 +3536,16 @@
         </w:r>
         <w:r>
           <w:rPr>
-            <w:rFonts w:cs="TH Sarabun New"/>
+            <w:rFonts w:cs="TH SarabunIT๙"/>
             <w:noProof/>
             <w:webHidden/>
             <w:szCs w:val="32"/>
           </w:rPr>
-          <w:instrText xml:space="preserve"> PAGEREF _Toc244044764 \h </w:instrText>
+          <w:instrText xml:space="preserve"> PAGEREF _Toc244045449 \h </w:instrText>
         </w:r>
         <w:r>
           <w:rPr>
-            <w:rFonts w:cs="TH Sarabun New"/>
+            <w:rFonts w:cs="TH SarabunIT๙"/>
             <w:noProof/>
             <w:webHidden/>
             <w:szCs w:val="32"/>
@@ -3553,7 +3553,7 @@
         </w:r>
         <w:r>
           <w:rPr>
-            <w:rFonts w:cs="TH Sarabun New"/>
+            <w:rFonts w:cs="TH SarabunIT๙"/>
             <w:noProof/>
             <w:webHidden/>
             <w:szCs w:val="32"/>
@@ -3562,16 +3562,16 @@
         </w:r>
         <w:r>
           <w:rPr>
-            <w:rFonts w:cs="TH Sarabun New"/>
+            <w:rFonts w:cs="TH SarabunIT๙"/>
             <w:noProof/>
             <w:webHidden/>
             <w:szCs w:val="32"/>
           </w:rPr>
-          <w:t>22</w:t>
+          <w:t>20</w:t>
         </w:r>
         <w:r>
           <w:rPr>
-            <w:rFonts w:cs="TH Sarabun New"/>
+            <w:rFonts w:cs="TH SarabunIT๙"/>
             <w:noProof/>
             <w:webHidden/>
             <w:szCs w:val="32"/>
@@ -3587,18 +3587,18 @@
           <w:tab w:val="right" w:leader="dot" w:pos="9016"/>
         </w:tabs>
         <w:rPr>
-          <w:rFonts w:eastAsiaTheme="minorEastAsia" w:cs="TH Sarabun New"/>
+          <w:rFonts w:eastAsiaTheme="minorEastAsia" w:cs="TH SarabunIT๙"/>
           <w:noProof/>
           <w:kern w:val="2"/>
           <w:szCs w:val="32"/>
           <w14:ligatures w14:val="standardContextual"/>
         </w:rPr>
       </w:pPr>
-      <w:hyperlink w:anchor="_Toc244044765" w:history="1">
+      <w:hyperlink w:anchor="_Toc244045450" w:history="1">
         <w:r>
           <w:rPr>
             <w:rStyle w:val="Hyperlink"/>
-            <w:rFonts w:cs="TH Sarabun New"/>
+            <w:rFonts w:cs="TH SarabunIT๙"/>
             <w:noProof/>
             <w:szCs w:val="32"/>
             <w:cs/>
@@ -3607,7 +3607,7 @@
         </w:r>
         <w:r>
           <w:rPr>
-            <w:rFonts w:cs="TH Sarabun New"/>
+            <w:rFonts w:cs="TH SarabunIT๙"/>
             <w:noProof/>
             <w:webHidden/>
             <w:szCs w:val="32"/>
@@ -3616,7 +3616,7 @@
         </w:r>
         <w:r>
           <w:rPr>
-            <w:rFonts w:cs="TH Sarabun New"/>
+            <w:rFonts w:cs="TH SarabunIT๙"/>
             <w:noProof/>
             <w:webHidden/>
             <w:szCs w:val="32"/>
@@ -3625,16 +3625,16 @@
         </w:r>
         <w:r>
           <w:rPr>
-            <w:rFonts w:cs="TH Sarabun New"/>
+            <w:rFonts w:cs="TH SarabunIT๙"/>
             <w:noProof/>
             <w:webHidden/>
             <w:szCs w:val="32"/>
           </w:rPr>
-          <w:instrText xml:space="preserve"> PAGEREF _Toc244044765 \h </w:instrText>
+          <w:instrText xml:space="preserve"> PAGEREF _Toc244045450 \h </w:instrText>
         </w:r>
         <w:r>
           <w:rPr>
-            <w:rFonts w:cs="TH Sarabun New"/>
+            <w:rFonts w:cs="TH SarabunIT๙"/>
             <w:noProof/>
             <w:webHidden/>
             <w:szCs w:val="32"/>
@@ -3642,7 +3642,7 @@
         </w:r>
         <w:r>
           <w:rPr>
-            <w:rFonts w:cs="TH Sarabun New"/>
+            <w:rFonts w:cs="TH SarabunIT๙"/>
             <w:noProof/>
             <w:webHidden/>
             <w:szCs w:val="32"/>
@@ -3651,16 +3651,16 @@
         </w:r>
         <w:r>
           <w:rPr>
-            <w:rFonts w:cs="TH Sarabun New"/>
+            <w:rFonts w:cs="TH SarabunIT๙"/>
             <w:noProof/>
             <w:webHidden/>
             <w:szCs w:val="32"/>
           </w:rPr>
-          <w:t>23</w:t>
+          <w:t>21</w:t>
         </w:r>
         <w:r>
           <w:rPr>
-            <w:rFonts w:cs="TH Sarabun New"/>
+            <w:rFonts w:cs="TH SarabunIT๙"/>
             <w:noProof/>
             <w:webHidden/>
             <w:szCs w:val="32"/>
@@ -3683,7 +3683,7 @@
       <w:pPr>
         <w:pStyle w:val="Heading1"/>
       </w:pPr>
-      <w:bookmarkStart w:id="0" w:name="_Toc244044730"/>
+      <w:bookmarkStart w:id="0" w:name="_Toc244045415"/>
       <w:r>
         <w:rPr>
           <w:cs/>
@@ -3696,7 +3696,7 @@
       <w:pPr>
         <w:pStyle w:val="Heading2"/>
       </w:pPr>
-      <w:bookmarkStart w:id="1" w:name="_Toc244044731"/>
+      <w:bookmarkStart w:id="1" w:name="_Toc244045416"/>
       <w:r>
         <w:rPr>
           <w:cs/>
@@ -3783,7 +3783,7 @@
       <w:pPr>
         <w:pStyle w:val="Heading2"/>
       </w:pPr>
-      <w:bookmarkStart w:id="2" w:name="_Toc244044732"/>
+      <w:bookmarkStart w:id="2" w:name="_Toc244045417"/>
       <w:r>
         <w:rPr>
           <w:cs/>
@@ -4463,7 +4463,7 @@
       <w:pPr>
         <w:pStyle w:val="Heading2"/>
       </w:pPr>
-      <w:bookmarkStart w:id="3" w:name="_Toc244044733"/>
+      <w:bookmarkStart w:id="3" w:name="_Toc244045418"/>
       <w:r>
         <w:rPr>
           <w:cs/>
@@ -4514,7 +4514,7 @@
       <w:pPr>
         <w:pStyle w:val="Heading2"/>
       </w:pPr>
-      <w:bookmarkStart w:id="4" w:name="_Toc244044734"/>
+      <w:bookmarkStart w:id="4" w:name="_Toc244045419"/>
       <w:r>
         <w:rPr>
           <w:cs/>
@@ -4939,7 +4939,7 @@
       <w:pPr>
         <w:pStyle w:val="Heading1"/>
       </w:pPr>
-      <w:bookmarkStart w:id="5" w:name="_Toc244044735"/>
+      <w:bookmarkStart w:id="5" w:name="_Toc244045420"/>
       <w:r>
         <w:rPr>
           <w:cs/>
@@ -4974,7 +4974,7 @@
       <w:pPr>
         <w:pStyle w:val="Heading2"/>
       </w:pPr>
-      <w:bookmarkStart w:id="6" w:name="_Toc244044736"/>
+      <w:bookmarkStart w:id="6" w:name="_Toc244045421"/>
       <w:r>
         <w:rPr>
           <w:cs/>
@@ -5917,7 +5917,7 @@
       <w:pPr>
         <w:pStyle w:val="Heading2"/>
       </w:pPr>
-      <w:bookmarkStart w:id="7" w:name="_Toc244044737"/>
+      <w:bookmarkStart w:id="7" w:name="_Toc244045422"/>
       <w:r>
         <w:rPr>
           <w:cs/>
@@ -7123,7 +7123,7 @@
       <w:pPr>
         <w:pStyle w:val="Heading2"/>
       </w:pPr>
-      <w:bookmarkStart w:id="8" w:name="_Toc244044738"/>
+      <w:bookmarkStart w:id="8" w:name="_Toc244045423"/>
       <w:r>
         <w:rPr>
           <w:cs/>
@@ -7400,7 +7400,7 @@
       <w:pPr>
         <w:pStyle w:val="Heading1"/>
       </w:pPr>
-      <w:bookmarkStart w:id="9" w:name="_Toc244044739"/>
+      <w:bookmarkStart w:id="9" w:name="_Toc244045424"/>
       <w:r>
         <w:rPr>
           <w:cs/>
@@ -7416,7 +7416,7 @@
       <w:pPr>
         <w:pStyle w:val="Heading2"/>
       </w:pPr>
-      <w:bookmarkStart w:id="10" w:name="_Toc244044740"/>
+      <w:bookmarkStart w:id="10" w:name="_Toc244045425"/>
       <w:r>
         <w:rPr>
           <w:cs/>
@@ -7919,7 +7919,7 @@
           <w:noProof/>
         </w:rPr>
         <w:drawing>
-          <wp:inline distT="0" distB="0" distL="0" distR="0" wp14:anchorId="2CAC1B6B" wp14:editId="61A49888">
+          <wp:inline distT="0" distB="0" distL="0" distR="0" wp14:anchorId="6786BEE2" wp14:editId="3755DF36">
             <wp:extent cx="5760000" cy="3168000"/>
             <wp:effectExtent l="0" t="0" r="0" b="0"/>
             <wp:docPr id="1" name="Picture 1"/>
@@ -8005,7 +8005,7 @@
       <w:pPr>
         <w:pStyle w:val="Heading2"/>
       </w:pPr>
-      <w:bookmarkStart w:id="11" w:name="_Toc244044741"/>
+      <w:bookmarkStart w:id="11" w:name="_Toc244045426"/>
       <w:r>
         <w:t xml:space="preserve">3.2 Level 0: </w:t>
       </w:r>
@@ -8028,7 +8028,7 @@
           <w:noProof/>
         </w:rPr>
         <w:drawing>
-          <wp:inline distT="0" distB="0" distL="0" distR="0" wp14:anchorId="027C903F" wp14:editId="7FB67782">
+          <wp:inline distT="0" distB="0" distL="0" distR="0" wp14:anchorId="7460DECD" wp14:editId="4350438D">
             <wp:extent cx="5760000" cy="2962286"/>
             <wp:effectExtent l="0" t="0" r="0" b="0"/>
             <wp:docPr id="2" name="Picture 2"/>
@@ -8327,7 +8327,7 @@
       <w:pPr>
         <w:pStyle w:val="Heading2"/>
       </w:pPr>
-      <w:bookmarkStart w:id="12" w:name="_Toc244044742"/>
+      <w:bookmarkStart w:id="12" w:name="_Toc244045427"/>
       <w:r>
         <w:t xml:space="preserve">3.3 Level 1: </w:t>
       </w:r>
@@ -8404,7 +8404,7 @@
           <w:noProof/>
         </w:rPr>
         <w:drawing>
-          <wp:inline distT="0" distB="0" distL="0" distR="0" wp14:anchorId="1613A008" wp14:editId="09EF0962">
+          <wp:inline distT="0" distB="0" distL="0" distR="0" wp14:anchorId="793C5368" wp14:editId="1A58BF29">
             <wp:extent cx="5760000" cy="3240000"/>
             <wp:effectExtent l="0" t="0" r="0" b="0"/>
             <wp:docPr id="3" name="Picture 3"/>
@@ -8536,7 +8536,7 @@
           <w:noProof/>
         </w:rPr>
         <w:drawing>
-          <wp:inline distT="0" distB="0" distL="0" distR="0" wp14:anchorId="3247AA1A" wp14:editId="02557573">
+          <wp:inline distT="0" distB="0" distL="0" distR="0" wp14:anchorId="59AA3D78" wp14:editId="7304F98F">
             <wp:extent cx="5760000" cy="2150400"/>
             <wp:effectExtent l="0" t="0" r="0" b="0"/>
             <wp:docPr id="4" name="Picture 4"/>
@@ -9476,7 +9476,7 @@
       <w:pPr>
         <w:pStyle w:val="Heading2"/>
       </w:pPr>
-      <w:bookmarkStart w:id="13" w:name="_Toc244044743"/>
+      <w:bookmarkStart w:id="13" w:name="_Toc244045428"/>
       <w:r>
         <w:t xml:space="preserve">3.4 Level 2–3: </w:t>
       </w:r>
@@ -12182,7 +12182,7 @@
       <w:pPr>
         <w:pStyle w:val="Heading2"/>
       </w:pPr>
-      <w:bookmarkStart w:id="14" w:name="_Toc244044744"/>
+      <w:bookmarkStart w:id="14" w:name="_Toc244045429"/>
       <w:r>
         <w:rPr>
           <w:cs/>
@@ -12205,7 +12205,7 @@
           <w:noProof/>
         </w:rPr>
         <w:drawing>
-          <wp:inline distT="0" distB="0" distL="0" distR="0" wp14:anchorId="238773A0" wp14:editId="1E6B9978">
+          <wp:inline distT="0" distB="0" distL="0" distR="0" wp14:anchorId="20E6E268" wp14:editId="54886235">
             <wp:extent cx="5760000" cy="3600000"/>
             <wp:effectExtent l="0" t="0" r="0" b="0"/>
             <wp:docPr id="5" name="Picture 5"/>
@@ -12284,7 +12284,7 @@
       <w:pPr>
         <w:pStyle w:val="Heading2"/>
       </w:pPr>
-      <w:bookmarkStart w:id="15" w:name="_Toc244044745"/>
+      <w:bookmarkStart w:id="15" w:name="_Toc244045430"/>
       <w:r>
         <w:rPr>
           <w:cs/>
@@ -13427,7 +13427,7 @@
       <w:pPr>
         <w:pStyle w:val="Heading2"/>
       </w:pPr>
-      <w:bookmarkStart w:id="16" w:name="_Toc244044746"/>
+      <w:bookmarkStart w:id="16" w:name="_Toc244045431"/>
       <w:r>
         <w:rPr>
           <w:cs/>
@@ -13667,7 +13667,7 @@
       <w:pPr>
         <w:pStyle w:val="Heading2"/>
       </w:pPr>
-      <w:bookmarkStart w:id="17" w:name="_Toc244044747"/>
+      <w:bookmarkStart w:id="17" w:name="_Toc244045432"/>
       <w:r>
         <w:rPr>
           <w:cs/>
@@ -14553,7 +14553,7 @@
       <w:pPr>
         <w:pStyle w:val="Heading1"/>
       </w:pPr>
-      <w:bookmarkStart w:id="18" w:name="_Toc244044748"/>
+      <w:bookmarkStart w:id="18" w:name="_Toc244045433"/>
       <w:r>
         <w:rPr>
           <w:cs/>
@@ -14566,7 +14566,7 @@
       <w:pPr>
         <w:pStyle w:val="Heading2"/>
       </w:pPr>
-      <w:bookmarkStart w:id="19" w:name="_Toc244044749"/>
+      <w:bookmarkStart w:id="19" w:name="_Toc244045434"/>
       <w:r>
         <w:rPr>
           <w:cs/>
@@ -14980,7 +14980,7 @@
       <w:pPr>
         <w:pStyle w:val="Heading2"/>
       </w:pPr>
-      <w:bookmarkStart w:id="20" w:name="_Toc244044750"/>
+      <w:bookmarkStart w:id="20" w:name="_Toc244045435"/>
       <w:r>
         <w:rPr>
           <w:cs/>
@@ -15249,7 +15249,7 @@
       <w:pPr>
         <w:pStyle w:val="Heading2"/>
       </w:pPr>
-      <w:bookmarkStart w:id="21" w:name="_Toc244044751"/>
+      <w:bookmarkStart w:id="21" w:name="_Toc244045436"/>
       <w:r>
         <w:rPr>
           <w:cs/>
@@ -15605,7 +15605,7 @@
       <w:pPr>
         <w:pStyle w:val="Heading2"/>
       </w:pPr>
-      <w:bookmarkStart w:id="22" w:name="_Toc244044752"/>
+      <w:bookmarkStart w:id="22" w:name="_Toc244045437"/>
       <w:r>
         <w:rPr>
           <w:cs/>
@@ -16498,7 +16498,7 @@
       <w:pPr>
         <w:pStyle w:val="Heading2"/>
       </w:pPr>
-      <w:bookmarkStart w:id="23" w:name="_Toc244044753"/>
+      <w:bookmarkStart w:id="23" w:name="_Toc244045438"/>
       <w:r>
         <w:rPr>
           <w:cs/>
@@ -17253,7 +17253,7 @@
       <w:pPr>
         <w:pStyle w:val="Heading1"/>
       </w:pPr>
-      <w:bookmarkStart w:id="24" w:name="_Toc244044754"/>
+      <w:bookmarkStart w:id="24" w:name="_Toc244045439"/>
       <w:r>
         <w:rPr>
           <w:cs/>
@@ -17266,7 +17266,7 @@
       <w:pPr>
         <w:pStyle w:val="Heading2"/>
       </w:pPr>
-      <w:bookmarkStart w:id="25" w:name="_Toc244044755"/>
+      <w:bookmarkStart w:id="25" w:name="_Toc244045440"/>
       <w:r>
         <w:rPr>
           <w:cs/>
@@ -17447,7 +17447,7 @@
       <w:pPr>
         <w:pStyle w:val="Heading2"/>
       </w:pPr>
-      <w:bookmarkStart w:id="26" w:name="_Toc244044756"/>
+      <w:bookmarkStart w:id="26" w:name="_Toc244045441"/>
       <w:r>
         <w:rPr>
           <w:cs/>
@@ -17893,7 +17893,7 @@
       <w:pPr>
         <w:pStyle w:val="Heading2"/>
       </w:pPr>
-      <w:bookmarkStart w:id="27" w:name="_Toc244044757"/>
+      <w:bookmarkStart w:id="27" w:name="_Toc244045442"/>
       <w:r>
         <w:rPr>
           <w:cs/>
@@ -18500,7 +18500,7 @@
       <w:pPr>
         <w:pStyle w:val="Heading2"/>
       </w:pPr>
-      <w:bookmarkStart w:id="28" w:name="_Toc244044758"/>
+      <w:bookmarkStart w:id="28" w:name="_Toc244045443"/>
       <w:r>
         <w:rPr>
           <w:cs/>
@@ -19990,7 +19990,7 @@
       <w:pPr>
         <w:pStyle w:val="Heading2"/>
       </w:pPr>
-      <w:bookmarkStart w:id="29" w:name="_Toc244044759"/>
+      <w:bookmarkStart w:id="29" w:name="_Toc244045444"/>
       <w:r>
         <w:rPr>
           <w:cs/>
@@ -20112,7 +20112,7 @@
       <w:pPr>
         <w:pStyle w:val="Heading1"/>
       </w:pPr>
-      <w:bookmarkStart w:id="30" w:name="_Toc244044760"/>
+      <w:bookmarkStart w:id="30" w:name="_Toc244045445"/>
       <w:r>
         <w:rPr>
           <w:cs/>
@@ -20125,7 +20125,7 @@
       <w:pPr>
         <w:pStyle w:val="Heading2"/>
       </w:pPr>
-      <w:bookmarkStart w:id="31" w:name="_Toc244044761"/>
+      <w:bookmarkStart w:id="31" w:name="_Toc244045446"/>
       <w:r>
         <w:rPr>
           <w:cs/>
@@ -20274,7 +20274,7 @@
       <w:pPr>
         <w:pStyle w:val="Heading2"/>
       </w:pPr>
-      <w:bookmarkStart w:id="32" w:name="_Toc244044762"/>
+      <w:bookmarkStart w:id="32" w:name="_Toc244045447"/>
       <w:r>
         <w:rPr>
           <w:cs/>
@@ -20390,7 +20390,7 @@
       <w:pPr>
         <w:pStyle w:val="Heading2"/>
       </w:pPr>
-      <w:bookmarkStart w:id="33" w:name="_Toc244044763"/>
+      <w:bookmarkStart w:id="33" w:name="_Toc244045448"/>
       <w:r>
         <w:rPr>
           <w:cs/>
@@ -20505,7 +20505,7 @@
       <w:pPr>
         <w:pStyle w:val="Heading1"/>
       </w:pPr>
-      <w:bookmarkStart w:id="34" w:name="_Toc244044764"/>
+      <w:bookmarkStart w:id="34" w:name="_Toc244045449"/>
       <w:r>
         <w:rPr>
           <w:cs/>
@@ -22446,7 +22446,7 @@
       <w:pPr>
         <w:pStyle w:val="Heading1"/>
       </w:pPr>
-      <w:bookmarkStart w:id="35" w:name="_Toc244044765"/>
+      <w:bookmarkStart w:id="35" w:name="_Toc244045450"/>
       <w:r>
         <w:rPr>
           <w:cs/>
@@ -23964,31 +23964,31 @@
       </w:rPr>
     </w:lvl>
   </w:abstractNum>
-  <w:num w:numId="1" w16cid:durableId="1655985785">
+  <w:num w:numId="1" w16cid:durableId="631441515">
     <w:abstractNumId w:val="8"/>
   </w:num>
-  <w:num w:numId="2" w16cid:durableId="136656074">
+  <w:num w:numId="2" w16cid:durableId="58139557">
     <w:abstractNumId w:val="6"/>
   </w:num>
-  <w:num w:numId="3" w16cid:durableId="184750959">
+  <w:num w:numId="3" w16cid:durableId="1183860705">
     <w:abstractNumId w:val="5"/>
   </w:num>
-  <w:num w:numId="4" w16cid:durableId="1433932784">
+  <w:num w:numId="4" w16cid:durableId="1636791628">
     <w:abstractNumId w:val="4"/>
   </w:num>
-  <w:num w:numId="5" w16cid:durableId="660041084">
+  <w:num w:numId="5" w16cid:durableId="1145314999">
     <w:abstractNumId w:val="7"/>
   </w:num>
-  <w:num w:numId="6" w16cid:durableId="1000736244">
+  <w:num w:numId="6" w16cid:durableId="1567304748">
     <w:abstractNumId w:val="3"/>
   </w:num>
-  <w:num w:numId="7" w16cid:durableId="53546603">
+  <w:num w:numId="7" w16cid:durableId="1993025766">
     <w:abstractNumId w:val="2"/>
   </w:num>
-  <w:num w:numId="8" w16cid:durableId="1348942122">
+  <w:num w:numId="8" w16cid:durableId="201406043">
     <w:abstractNumId w:val="1"/>
   </w:num>
-  <w:num w:numId="9" w16cid:durableId="415908656">
+  <w:num w:numId="9" w16cid:durableId="105000744">
     <w:abstractNumId w:val="0"/>
   </w:num>
 </w:numbering>
@@ -24388,7 +24388,7 @@
       <w:spacing w:after="0" w:line="240" w:lineRule="auto"/>
     </w:pPr>
     <w:rPr>
-      <w:rFonts w:ascii="TH Sarabun New" w:eastAsia="TH Sarabun New" w:hAnsi="TH Sarabun New" w:cs="TH Sarabun New"/>
+      <w:rFonts w:ascii="TH SarabunIT๙" w:eastAsia="TH SarabunIT๙" w:hAnsi="TH SarabunIT๙" w:cs="TH SarabunIT๙"/>
       <w:sz w:val="32"/>
       <w:szCs w:val="32"/>
     </w:rPr>
@@ -35376,7 +35376,7 @@
   <w:style w:type="paragraph" w:customStyle="1" w:styleId="TOC11">
     <w:name w:val="TOC 11"/>
     <w:rPr>
-      <w:rFonts w:ascii="TH Sarabun New" w:eastAsia="TH Sarabun New" w:hAnsi="TH Sarabun New" w:cs="TH Sarabun New"/>
+      <w:rFonts w:ascii="TH SarabunIT๙" w:eastAsia="TH SarabunIT๙" w:hAnsi="TH SarabunIT๙" w:cs="TH SarabunIT๙"/>
       <w:sz w:val="32"/>
       <w:szCs w:val="32"/>
     </w:rPr>
@@ -35384,7 +35384,7 @@
   <w:style w:type="paragraph" w:customStyle="1" w:styleId="TOC21">
     <w:name w:val="TOC 21"/>
     <w:rPr>
-      <w:rFonts w:ascii="TH Sarabun New" w:eastAsia="TH Sarabun New" w:hAnsi="TH Sarabun New" w:cs="TH Sarabun New"/>
+      <w:rFonts w:ascii="TH SarabunIT๙" w:eastAsia="TH SarabunIT๙" w:hAnsi="TH SarabunIT๙" w:cs="TH SarabunIT๙"/>
       <w:sz w:val="32"/>
       <w:szCs w:val="32"/>
     </w:rPr>
@@ -35392,7 +35392,7 @@
   <w:style w:type="paragraph" w:customStyle="1" w:styleId="TOC31">
     <w:name w:val="TOC 31"/>
     <w:rPr>
-      <w:rFonts w:ascii="TH Sarabun New" w:eastAsia="TH Sarabun New" w:hAnsi="TH Sarabun New" w:cs="TH Sarabun New"/>
+      <w:rFonts w:ascii="TH SarabunIT๙" w:eastAsia="TH SarabunIT๙" w:hAnsi="TH SarabunIT๙" w:cs="TH SarabunIT๙"/>
       <w:sz w:val="32"/>
       <w:szCs w:val="32"/>
     </w:rPr>
@@ -35404,7 +35404,7 @@
     <w:autoRedefine/>
     <w:uiPriority w:val="39"/>
     <w:unhideWhenUsed/>
-    <w:rsid w:val="00F42606"/>
+    <w:rsid w:val="002D4ABF"/>
     <w:pPr>
       <w:spacing w:after="100"/>
     </w:pPr>
@@ -35420,7 +35420,7 @@
     <w:autoRedefine/>
     <w:uiPriority w:val="39"/>
     <w:unhideWhenUsed/>
-    <w:rsid w:val="00F42606"/>
+    <w:rsid w:val="002D4ABF"/>
     <w:pPr>
       <w:spacing w:after="100"/>
       <w:ind w:left="320"/>
@@ -35435,7 +35435,7 @@
     <w:basedOn w:val="DefaultParagraphFont"/>
     <w:uiPriority w:val="99"/>
     <w:unhideWhenUsed/>
-    <w:rsid w:val="00F42606"/>
+    <w:rsid w:val="002D4ABF"/>
     <w:rPr>
       <w:color w:val="0000FF" w:themeColor="hyperlink"/>
       <w:u w:val="single"/>

</xml_diff>